<commit_message>
refactor: update manuscript title and text, refine statistical methods and covariate selection, and adjust figure font scaling.
</commit_message>
<xml_diff>
--- a/manuscripts/manuscript.docx
+++ b/manuscripts/manuscript.docx
@@ -7,7 +7,7 @@
         <w:pStyle w:val="Title"/>
       </w:pPr>
       <w:r>
-        <w:t xml:space="preserve">Association of Hemispheric Laterality with Neurosurgery in ICH: A Post-Hoc Bayesian Analysis of ATACH-2 and ERICH</w:t>
+        <w:t xml:space="preserve">Association of Hemispheric Laterality with Neurosurgical Intervention in Intracerebral Hemorrhage: A Post-Hoc Bayesian Analysis of ATACH-2 and ERICH</w:t>
       </w:r>
     </w:p>
     <w:bookmarkStart w:id="9" w:name="introduction"/>
@@ -99,7 +99,7 @@
         <w:t xml:space="preserve">3,4,13</w:t>
       </w:r>
       <w:r>
-        <w:t xml:space="preserve">, it is important to understand if hemispheric lateralization affects surgical decision making, as it seems to do for ischemic stroke. We aimed to evaluate the effect of hemispheric lateralization of ICH on likelihood of receiving aggressive surgical intervention as well as it’s association with functional outcomes.</w:t>
+        <w:t xml:space="preserve">, it is important to understand whether hemispheric lateralization is associated with differences in surgical decision making, as has been observed for ischemic stroke. We aimed to evaluate the association of hemispheric lateralization of ICH with the likelihood of receiving neurosurgical intervention as well as with functional outcomes.</w:t>
       </w:r>
     </w:p>
     <w:bookmarkEnd w:id="9"/>
@@ -203,13 +203,25 @@
         <w:pStyle w:val="FirstParagraph"/>
       </w:pPr>
       <w:r>
-        <w:t xml:space="preserve">To estimate the effect of hemispheric laterality on the outcomes of interest, we fitted hierarchal Bayesian regression models adjusted for the specified covariates below. We also included the study that patient came from as a random intercept. We employed Bayesian statistical methods for this analysis due to several advantages over traditional frequentist approaches. Bayesian methods allow for the incorporation of prior knowledge or beliefs into the analysis, which can be particularly useful in observational studies where prior information about relationships between variables may exist. This is achieved through the use of prior distributions, which are combined with the observed data to produce posterior distributions representing updated beliefs about the parameters of interest. Furthermore, Bayesian methods provide a natural framework for quantifying uncertainty through credible intervals, which offer a more intuitive interpretation than frequentist confidence intervals. Finally, Bayesian modeling facilitates the estimation of posterior probabilities, allowing for direct probabilistic statements about hypotheses, such as the probability that an odds ratio is greater than 1, which is often of greater clinical relevance than a p-value.</w:t>
+        <w:t xml:space="preserve">To estimate the effect of hemispheric laterality on the outcomes of interest, we fitted hierarchal Bayesian regression models adjusted for the specified covariates below. We also included the study that patient came from as a random intercept. We employed Bayesian statistical methods for this analysis due to several advantages over traditional frequentist approaches. Bayesian methods allow for the incorporation of prior knowledge or beliefs into the analysis, which can be particularly useful in observational studies where prior information about relationships between variables may exist. This is achieved through the use of prior distributions, which are combined with the observed data to produce posterior distributions representing updated beliefs about the parameters of interest. Furthermore, Bayesian methods provide a natural framework for quantifying uncertainty through credible intervals (CrI), which offer a more intuitive interpretation than frequentist confidence intervals. Finally, Bayesian modeling facilitates the estimation of posterior probabilities, allowing for direct probabilistic statements about hypotheses, such as the probability that an effect size (e.g., odds ratio [OR] or incidence rate ratio [IRR]) is greater than 1, which is often of greater clinical relevance than a p-value.</w:t>
       </w:r>
       <w:r>
         <w:rPr>
           <w:vertAlign w:val="superscript"/>
         </w:rPr>
         <w:t xml:space="preserve">16,17</w:t>
+      </w:r>
+      <w:r>
+        <w:t xml:space="preserve"> </w:t>
+      </w:r>
+      <w:r>
+        <w:t xml:space="preserve">This report adheres to the Bayesian Analysis Reporting Guidelines.</w:t>
+      </w:r>
+      <w:r>
+        <w:rPr>
+          <w:vertAlign w:val="superscript"/>
+        </w:rPr>
+        <w:t xml:space="preserve">18</w:t>
       </w:r>
     </w:p>
     <w:p>
@@ -217,43 +229,23 @@
         <w:pStyle w:val="BodyText"/>
       </w:pPr>
       <w:r>
-        <w:t xml:space="preserve">This report follows suggestions from the Bayesian Analysis Reporting Guidelines.</w:t>
-      </w:r>
-      <w:r>
-        <w:rPr>
-          <w:vertAlign w:val="superscript"/>
-        </w:rPr>
-        <w:t xml:space="preserve">18</w:t>
-      </w:r>
-      <w:r>
-        <w:t xml:space="preserve"> </w:t>
-      </w:r>
-      <w:r>
-        <w:t xml:space="preserve">For binary endpoints, hierarchal Bayesian logistic regression models were used. For ordinal endpoints, hierarchal Bayesian ordinal logisitic regression models were used. All analyses were performed in R version 4.4.2 (R Foundation for Statistical Computing, Vienna, Austria) using the</w:t>
-      </w:r>
-      <w:r>
-        <w:t xml:space="preserve"> </w:t>
-      </w:r>
-      <w:r>
-        <w:t xml:space="preserve">‘brms’</w:t>
-      </w:r>
-      <w:r>
-        <w:t xml:space="preserve"> </w:t>
-      </w:r>
-      <w:r>
-        <w:t xml:space="preserve">and</w:t>
-      </w:r>
-      <w:r>
-        <w:t xml:space="preserve"> </w:t>
-      </w:r>
-      <w:r>
-        <w:t xml:space="preserve">‘tidybayes’</w:t>
-      </w:r>
-      <w:r>
-        <w:t xml:space="preserve"> </w:t>
-      </w:r>
-      <w:r>
-        <w:t xml:space="preserve">packages.</w:t>
+        <w:t xml:space="preserve">For binary and ordinal endpoints, we utilized hierarchical Bayesian logistic and ordinal logistic regression models, respectively. For non-binary outcomes, we employed specialized distributional models to avoid data dichotomization and accurately reflect the underlying data generating processes. Specifically, days of mechanical ventilation, a count-based outcome characterized by excess zeros, was modeled using a hierarchical Bayesian zero-inflated negative binomial regression. Exponentiated coefficients for the count component of this model are reported as incidence rate ratios (IRR). The European Quality of Life Visual Analog Scale (EQ-VAS), a bounded continuous measure, was scaled to a proportion and modeled using a hierarchical Bayesian zero-one inflated beta (ZOIB) regression. To maximize clinical interpretability, we applied G-computation to derive the average marginal expected mean difference on the original 0–100 point scale, rather than reporting proportional odds.</w:t>
+      </w:r>
+    </w:p>
+    <w:p>
+      <w:pPr>
+        <w:pStyle w:val="BodyText"/>
+      </w:pPr>
+      <w:r>
+        <w:t xml:space="preserve">Decisions on neurosurgical intervention and other aspects of acute care are highly influenced by local practice patterns and resources. To account for potential clustering of clinical decision-making by hospital, we ideally would have included a random intercept for the study site in all models. However, site-level identifiers were not available for the ERICH cohort. To assess the potential impact of omitting site-level clustering, we performed a sensitivity analysis restricted to the ATACH-2 cohort, where site identifiers were available. We fitted the primary model for neurosurgical intervention with and without a random intercept for the hospital site and compared the posterior estimates for the association with laterality.</w:t>
+      </w:r>
+    </w:p>
+    <w:p>
+      <w:pPr>
+        <w:pStyle w:val="BodyText"/>
+      </w:pPr>
+      <w:r>
+        <w:t xml:space="preserve">All analyses were performed in R version 4.4.2 (R Foundation for Statistical Computing, Vienna, Austria). ALl packages used for the analysis are listed in the Supplementary Appendix.</w:t>
       </w:r>
     </w:p>
     <w:bookmarkStart w:id="12" w:name="covariate-selection"/>
@@ -270,7 +262,7 @@
         <w:pStyle w:val="FirstParagraph"/>
       </w:pPr>
       <w:r>
-        <w:t xml:space="preserve">We constructed directed acyclic graphs (DAGs) to model our causal assumptions and to appropriately select variables to minimize confounding and selection bias.</w:t>
+        <w:t xml:space="preserve">We constructed directed acyclic graphs (DAGs) to model our causal assumptions and to guide covariate selection for each estimand.</w:t>
       </w:r>
       <w:r>
         <w:rPr>
@@ -282,7 +274,27 @@
         <w:t xml:space="preserve"> </w:t>
       </w:r>
       <w:r>
-        <w:t xml:space="preserve">Based on our specifications, we included the following covariates in our models: age, admission Glasgow coma score (GCS), ICH location (categorized as lobar, thalamic, or basal ganglia), baseline ICH volume (measured in milliliters), and presence of intraventricular hemorrhage (IVH). The DAGs used in the analyses are available in the supplementary material.</w:t>
+        <w:t xml:space="preserve">For neurosurgical intervention and other acute care outcomes, the target estimand was the direct effect of hemispheric laterality on treatment decisions. Models were adjusted for baseline confounders that independently influence both the clinical presentation associated with hemispheric laterality and the likelihood of intervention: age, admission Glasgow Coma Scale (GCS) score, ICH location (categorized as lobar, thalamic, or basal ganglia), baseline ICH volume, and presence of intraventricular hemorrhage (IVH).</w:t>
+      </w:r>
+    </w:p>
+    <w:p>
+      <w:pPr>
+        <w:pStyle w:val="BodyText"/>
+      </w:pPr>
+      <w:r>
+        <w:t xml:space="preserve">For functional outcomes (mRS and EQ-5D), the target estimand was the total effect of hemispheric laterality, encompassing all causal pathways including those mediated through neurosurgical intervention and other post-baseline care decisions. These models were adjusted for the same baseline confounders but did not condition on neurosurgical intervention, as it lies on the causal pathway from laterality to functional outcome; adjusting for a mediator would block the clinically relevant pathway and risk introducing collider stratification bias.</w:t>
+      </w:r>
+      <w:r>
+        <w:rPr>
+          <w:vertAlign w:val="superscript"/>
+        </w:rPr>
+        <w:t xml:space="preserve">20</w:t>
+      </w:r>
+      <w:r>
+        <w:t xml:space="preserve"> </w:t>
+      </w:r>
+      <w:r>
+        <w:t xml:space="preserve">The DAGs and further details of the covariate selection rationale are presented in the supplementary material.</w:t>
       </w:r>
     </w:p>
     <w:bookmarkEnd w:id="12"/>
@@ -318,7 +330,23 @@
         <w:pStyle w:val="FirstParagraph"/>
       </w:pPr>
       <w:r>
-        <w:t xml:space="preserve">We report the following metrics for the effect of hemispheric laterality on the primary and secondary outcomes: 1) median odds ratio (OR) of the posterior distribution with 95% credible interval; 2) probability of any difference (P[OR] &gt; 1); 3) probability of a substantial difference (P[OR] &gt; 1.2) as defined by the study authors; 4) percent of the posterior distribution outside of the region of practical equivalence as defined by the study authors (ROPE; 0.95 &gt; P[OR] &gt; 1.05). A description of the rationale for these thresholds is available in the supplementary material.</w:t>
+        <w:t xml:space="preserve">We report the following metrics for the effect of hemispheric laterality: 1) median posterior effect size (OR, IRR, or mean difference) with 95% CrI; 2) probability of any directional difference (e.g., P[OR] &gt; 1 or P[Mean Difference] &lt; 0); 3) probability of a substantial difference defined</w:t>
+      </w:r>
+      <w:r>
+        <w:t xml:space="preserve"> </w:t>
+      </w:r>
+      <w:r>
+        <w:rPr>
+          <w:i/>
+          <w:iCs/>
+        </w:rPr>
+        <w:t xml:space="preserve">a priori</w:t>
+      </w:r>
+      <w:r>
+        <w:t xml:space="preserve"> </w:t>
+      </w:r>
+      <w:r>
+        <w:t xml:space="preserve">(e.g., P[OR] &gt; 1.2 or P[Mean Difference] &lt; -5 points); and 4) percentage of the posterior distribution falling outside a predefined region of practical equivalence (ROPE; e.g., 0.95 &lt; OR &lt; 1.05, or ±2 points for mean differences). We defined a substantial difference as an OR &gt; 1.2, which represents a small but clinically meaningful difference in effect size commonly utilized in epidemiological research. The full rationale for these thresholds is detailed in the supplementary material.</w:t>
       </w:r>
     </w:p>
     <w:bookmarkEnd w:id="14"/>
@@ -336,7 +364,7 @@
         <w:pStyle w:val="FirstParagraph"/>
       </w:pPr>
       <w:r>
-        <w:t xml:space="preserve">For our primary analysis, we used a complete case approach. To assess the robustness of our findings, we conducted a sensitivity analysis using multiple imputation with chained equations (MICE) to address missing data for all covariates.</w:t>
+        <w:t xml:space="preserve">Baseline covariates used in model adjustment had minimal missingness. Missingness for 90-day outcomes was more substantial but was balanced across laterality groups and key covariates. Detailed missingness rates by laterality group, assessments supporting the Missing at Random (MAR) assumption, and imputation diagnostics are reported in the Supplementary Appendix.</w:t>
       </w:r>
     </w:p>
     <w:p>
@@ -344,7 +372,42 @@
         <w:pStyle w:val="BodyText"/>
       </w:pPr>
       <w:r>
-        <w:t xml:space="preserve">In addition to the missing data analysis, we analyzed our models using the four sets of prior distributions described above, which allowed us to examine the influence of prior choices on the posterior distributions. Further details on the methods and results of these sensitivity analyses are presented in the Supplementary Appendix.</w:t>
+        <w:t xml:space="preserve">Our primary analysis used multiple imputation by chained equations (MICE) to address missing outcome data, generating 20 imputed datasets with the</w:t>
+      </w:r>
+      <w:r>
+        <w:t xml:space="preserve"> </w:t>
+      </w:r>
+      <w:r>
+        <w:rPr>
+          <w:rStyle w:val="VerbatimChar"/>
+        </w:rPr>
+        <w:t xml:space="preserve">mice</w:t>
+      </w:r>
+      <w:r>
+        <w:t xml:space="preserve"> </w:t>
+      </w:r>
+      <w:r>
+        <w:t xml:space="preserve">package.</w:t>
+      </w:r>
+      <w:r>
+        <w:rPr>
+          <w:vertAlign w:val="superscript"/>
+        </w:rPr>
+        <w:t xml:space="preserve">22</w:t>
+      </w:r>
+      <w:r>
+        <w:t xml:space="preserve"> </w:t>
+      </w:r>
+      <w:r>
+        <w:t xml:space="preserve">Imputation models included all analysis covariates and outcomes to preserve inter-variable relationships under the MAR assumption. Predictive mean matching was used for continuous and ordinal variables, logistic regression for binary variables, and polytomous regression for nominal categorical variables. Each Bayesian model was fitted separately to each imputed dataset, and posterior draws were pooled across imputations to produce the reported estimates and CrI.</w:t>
+      </w:r>
+    </w:p>
+    <w:p>
+      <w:pPr>
+        <w:pStyle w:val="BodyText"/>
+      </w:pPr>
+      <w:r>
+        <w:t xml:space="preserve">In addition to the missing data analysis, we analyzed our models using the four sets of prior distributions described above, which allowed us to examine the influence of prior choices on the posterior distributions. To explore potential effect modification, we also fitted models that included formal interaction terms between hemispheric laterality and ICH location and between laterality and study source. Subgroup-specific aORs and interaction Ratio of Odds Ratios (ROR) with 95% CrI were computed from these models to evaluate whether the laterality effect differed across subgroups. Further details on the methods and results of these sensitivity and subgroup analyses are presented in the Supplementary Appendix.</w:t>
       </w:r>
     </w:p>
     <w:bookmarkEnd w:id="15"/>
@@ -423,7 +486,7 @@
         <w:pStyle w:val="FirstParagraph"/>
       </w:pPr>
       <w:r>
-        <w:t xml:space="preserve">Associations between hemispheric laterality and primary and secondary outcomes are shown in Table 2. There were 86 (5.0%) with left hemispheric ICH who underwent neurosurgical intervention as compared to 144 (8.2%) with right hemispheric ICH (aOR 1.65, 95% credible interval 1.28 - 2.14). The posterior probability that the aOR was greater than 1 was &gt; 99.9%. The posterior probability of the aOR being greater than 1.2, indicating a substantial difference, was 99.3%. A very small portion of the posterior probability was inside of the ROPE (&lt; 0.1%).</w:t>
+        <w:t xml:space="preserve">Associations between hemispheric laterality and primary and secondary outcomes are shown in Table 2. There were 86 (5.0%) with left hemispheric ICH who underwent neurosurgical intervention as compared to 144 (8.2%) with right hemispheric ICH (aOR 1.65, 95% CrI 1.28 - 2.14). The posterior probability that the aOR was greater than 1 was &gt; 99.9%. The posterior probability of the aOR being greater than 1.2, indicating a substantial difference, was 99.3%. A very small portion of the posterior probability was inside of the ROPE (&lt; 0.1%).</w:t>
       </w:r>
     </w:p>
     <w:p>
@@ -431,7 +494,7 @@
         <w:pStyle w:val="BodyText"/>
       </w:pPr>
       <w:r>
-        <w:t xml:space="preserve">The results using different pre-defined priors were consistent with the findings in the main model (Figure 1). Sensitivity analyses yielded similar results (Supplemental Appendix).</w:t>
+        <w:t xml:space="preserve">Figure 1 displays the prior sensitivity analysis for neurosurgical intervention. Panel A shows the posterior distributions of covariate-adjusted predicted probabilities of neurosurgical intervention for left and right hemispheric ICH under the neutral prior, illustrating the separation in absolute risk between groups (left hemisphere: 4.86%, 95% CrI 3.98–5.84%; right hemisphere: 8.04%, 95% CrI 6.93–9.23%). Panel B overlays the posterior distributions of the absolute probability difference (Right − Left) across all four prior specifications (neutral, left-hemisphere, right-hemisphere, and flat). All four priors yielded nearly identical posterior distributions, with P(Right &gt; Left) exceeding 99.9% under every specification. The most skeptical prior (left-hemisphere) shifted the median probability difference from 3.18 to 2.21 percentage points but did not materially alter the conclusion, demonstrating that the primary finding is robust to prior choice. In a sensitivity analysis restricted to the ATACH-2 cohort, inclusion of a random intercept for hospital site slightly attenuated the point estimate and widened the credible interval but did not materially alter the direction or strength of the association. Additional sensitivity analyses, including alternative priors, complete-case analyses, and site-level clustering results, are presented in the Supplementary Appendix.</w:t>
       </w:r>
     </w:p>
     <w:bookmarkEnd w:id="21"/>
@@ -449,7 +512,7 @@
         <w:pStyle w:val="FirstParagraph"/>
       </w:pPr>
       <w:r>
-        <w:t xml:space="preserve">A total of 236 (13.7%) with left hemispheric ICH had an external ventricular drain (EVD) placed as compared to 272 (15.5%) with right hemispheric ICH (aOR 1.22, 95% credible interval 1.04 - 1.44). The posterior probability that the aOR was greater than 1 was 99.2%. The posterior probability that the aOR was greater than 1.2 was 58.2%. About 3.3% of the posterior distribution was inside of the ROPE.</w:t>
+        <w:t xml:space="preserve">A total of 236 (13.7%) with left hemispheric ICH had an external ventricular drain (EVD) placed as compared to 272 (15.5%) with right hemispheric ICH (aOR 1.22, 95% CrI 1.04 - 1.44). The posterior probability that the aOR was greater than 1 was 99.2%. The posterior probability that the aOR was greater than 1.2 was 58.2%. About 3.3% of the posterior distribution was inside of the ROPE.</w:t>
       </w:r>
     </w:p>
     <w:p>
@@ -475,7 +538,7 @@
         <w:pStyle w:val="FirstParagraph"/>
       </w:pPr>
       <w:r>
-        <w:t xml:space="preserve">The associations between mRS at 90 days and functional outcomes are described in Table 3. The aOR for a worse mRS score at 90 days associated with right hemispheric ICH compared to left hemispheric ICH was 0.99 (95% credible interval 0.98 - 1.00). The posterior probability that the aOR was &gt; 1 was 0.7%. The posterior probability that the aOR was &gt; 1.2 was &lt; 0.1%. About &gt; 99.9% of the posterior distribution was inside of the ROPE.</w:t>
+        <w:t xml:space="preserve">The associations between mRS at 90 days and functional outcomes are described in Table 3. The aOR for a worse mRS score at 90 days associated with right hemispheric ICH compared to left hemispheric ICH was 0.99 (95% CrI 0.98 - 1.00). The posterior probability that the aOR was &gt; 1 was 0.7%. The posterior probability that the aOR was &gt; 1.2 was &lt; 0.1%. About &gt; 99.9% of the posterior distribution was inside of the ROPE.</w:t>
       </w:r>
     </w:p>
     <w:p>
@@ -483,7 +546,7 @@
         <w:pStyle w:val="BodyText"/>
       </w:pPr>
       <w:r>
-        <w:t xml:space="preserve">When examining HRQOL, the largest differences between groups was in the Moblity and Self-Care domains. The aOR for a worse EuroQOL - Moblity score associated with right hemispheric ICH compared to left hemispheric ICH was 1.03 (95% credible interval 1.01 - 1.05) with similar results for the Self-Care domain. The posterior probability that the aOR was &gt; 1 was &gt; 99.9% for both domains, with the posterior probability that the aOR was &gt; 1.2 being &lt; 0.1%.</w:t>
+        <w:t xml:space="preserve">When examining HRQoL domains, we observed similar functional outcomes between groups. The aOR for a worse EuroQOL - Mobility score associated with right hemispheric ICH compared to left hemispheric ICH was 1.03 (95% CrI 1.01 - 1.05) with similar results for the Self-Care domain. The posterior probability that the aOR was &gt; 1 was &gt; 99.9% for both domains, with the posterior probability that the aOR was &gt; 1.2 being &lt; 0.1%.</w:t>
       </w:r>
     </w:p>
     <w:p>
@@ -491,7 +554,7 @@
         <w:pStyle w:val="BodyText"/>
       </w:pPr>
       <w:r>
-        <w:t xml:space="preserve">Results from using different priors and sensitivity analyses are presented in the Supplementary Appendix and did not significantly alter the results.</w:t>
+        <w:t xml:space="preserve">Results from using different priors and sensitivity analyses are presented in the Supplementary Appendix and were consistent with the primary findings.</w:t>
       </w:r>
     </w:p>
     <w:bookmarkEnd w:id="23"/>
@@ -510,7 +573,7 @@
         <w:pStyle w:val="FirstParagraph"/>
       </w:pPr>
       <w:r>
-        <w:t xml:space="preserve">In this pooled analysis of 3477 patients with ICH, we found evidence that those with right hemispheric ICH were more likely to receive neurosurgical intervention than those with left hemispheric ICH. Specifically, patients with right hemispheric ICH had 1.65 times the odds of receiving a neurosurgical intervention and 1.22 times the odds of receiving an EVD. This was consistent when considering various ICH locations and within each individual study. Despite receiving less aggressive surgical care, patients with left hemispheric ICH had better 90-day functional outcomes, a finding robust to various definitions including the mRS and HRQoL domains.</w:t>
+        <w:t xml:space="preserve">In this pooled analysis of 3477 patients with ICH, we observed an association between right hemispheric ICH and a higher likelihood of receiving neurosurgical intervention compared to left hemispheric ICH. Specifically, patients with right hemispheric ICH had 1.65 times the adjusted odds of receiving a neurosurgical intervention and 1.22 times the adjusted odds of receiving an EVD. This finding was robust to prior specification: all four prior distributions yielded nearly identical posteriors with P(Right &gt; Left) exceeding 99.9%, and only marginal shifts in the posterior median (Figure 1). In exploratory subgroup analyses with formal interaction terms, the laterality association was directionally consistent across ICH locations and between the two source studies; however, the interaction Ratio of Odds Ratios (ROR) credible intervals were wide and included 1, precluding definitive conclusions about subgroup heterogeneity (Supplementary Appendix). Despite a lower observed rate of surgical intervention, patients with left hemispheric ICH had similar 90-day functional outcomes to those with right hemispheric ICH, a finding consistent across definitions including the mRS and HRQoL domains. Of note, our functional outcome models estimated the total association of hemispheric laterality with outcome — inclusive of downstream differences in surgical management — rather than the direct association conditional on treatment received, thereby reflecting the overall prognostic profile of laterality as encountered in clinical practice.</w:t>
       </w:r>
     </w:p>
     <w:p>
@@ -518,7 +581,7 @@
         <w:pStyle w:val="BodyText"/>
       </w:pPr>
       <w:r>
-        <w:t xml:space="preserve">This finding is particularly important in light of recent evidence suggesting that surgical interventions, such as hematoma evacuation and decompressive craniectomy, may improve outcomes in some ICH patients</w:t>
+        <w:t xml:space="preserve">This finding is noteworthy in light of recent evidence suggesting that surgical interventions, such as hematoma evacuation and decompressive craniectomy, may improve outcomes in some ICH patients</w:t>
       </w:r>
       <w:r>
         <w:rPr>
@@ -527,19 +590,7 @@
         <w:t xml:space="preserve">3,13</w:t>
       </w:r>
       <w:r>
-        <w:t xml:space="preserve">. If there is a bias against offering these interventions to patients with left hemispheric ICH, it could lead to worse outcomes for this group. This highlights the need to address potential biases in treatment decisions and ensure equitable access to life-saving and disability-improving interventions. While treatment bias based on hemispheric laterality is not well-characterized in ICH, there are several studies that have found that clinicians, patients, and families place particular importance in language deficits and thus are less optimistic about dominant-hemispheric injuries.</w:t>
-      </w:r>
-      <w:r>
-        <w:rPr>
-          <w:vertAlign w:val="superscript"/>
-        </w:rPr>
-        <w:t xml:space="preserve">22–24</w:t>
-      </w:r>
-      <w:r>
-        <w:t xml:space="preserve"> </w:t>
-      </w:r>
-      <w:r>
-        <w:t xml:space="preserve">This attitude potentially may not be warranted if patients with left hemispheric injury report equivalent or improved quality of life outcomes compared to those with right hemispheric injury.</w:t>
+        <w:t xml:space="preserve">. In both the ATACH-2 and ERICH studies, neurosurgical candidacy was not defined by strict trial protocols but was left to the discretion of the treating clinicians based on local institutional practices. Decisions regarding hematoma evacuation or decompressive craniectomy were inherently influenced by temporal trends and site-specific protocols, which varied considerably over the study periods. While we adjusted for key baseline covariates and included a study-level random effect, these institutional and temporal practice variations likely shaped the overall landscape of surgical care observed in our cohort.</w:t>
       </w:r>
     </w:p>
     <w:p>
@@ -547,37 +598,19 @@
         <w:pStyle w:val="BodyText"/>
       </w:pPr>
       <w:r>
-        <w:t xml:space="preserve">Evidence is limited regarding the association of hemispheric lateralization and functional outcomes in patients with ICH. Our findings corroborate those from a pooled analysis of the INTERACT1 and INTERACT2 trials, which showed a higher risk of mortality in patients with right hemispheric ICH.</w:t>
+        <w:t xml:space="preserve">The observed association between laterality and neurosurgical intervention may reflect several mechanisms, which our observational design cannot fully disentangle. One possibility is a treatment selection bias in which clinicians, patients, or families preferentially avoid surgical intervention for dominant-hemispheric injuries due to concerns about post-operative language deficits. Indeed, several studies have found that clinicians, patients, and families place particular importance on language function and are less optimistic about dominant-hemispheric injuries.</w:t>
       </w:r>
       <w:r>
         <w:rPr>
           <w:vertAlign w:val="superscript"/>
         </w:rPr>
-        <w:t xml:space="preserve">12</w:t>
-      </w:r>
-      <w:r>
-        <w:t xml:space="preserve"> </w:t>
-      </w:r>
-      <w:r>
-        <w:t xml:space="preserve">Most other studies examining the association of hemispheric laterality and functional outcomes have focused on patients with acute ischemic stroke with mixed results. The two largest studies were pooled analyses from prospective ischemic stroke trials and neither found a clear association between hemispheric laterality and outcomes. </w:t>
-      </w:r>
-      <w:r>
-        <w:rPr>
-          <w:vertAlign w:val="superscript"/>
-        </w:rPr>
-        <w:t xml:space="preserve">25,26</w:t>
-      </w:r>
-      <w:r>
-        <w:t xml:space="preserve"> </w:t>
-      </w:r>
-      <w:r>
-        <w:t xml:space="preserve">This may be particularly challenging to study in ischemic stroke due to how the NIHSS is used to guide treatment decisions and is also biased toward higher scores in patients with left hemispheric injury.</w:t>
-      </w:r>
-      <w:r>
-        <w:rPr>
-          <w:vertAlign w:val="superscript"/>
-        </w:rPr>
-        <w:t xml:space="preserve">27</w:t>
+        <w:t xml:space="preserve">23–25</w:t>
+      </w:r>
+      <w:r>
+        <w:t xml:space="preserve"> </w:t>
+      </w:r>
+      <w:r>
+        <w:t xml:space="preserve">Prognostic framing that emphasizes aphasia may also affect surrogate decision-making and goals-of-care discussions, which in turn may influence willingness to pursue surgical intervention.</w:t>
       </w:r>
     </w:p>
     <w:p>
@@ -585,7 +618,53 @@
         <w:pStyle w:val="BodyText"/>
       </w:pPr>
       <w:r>
-        <w:t xml:space="preserve">Our study has some limitations. The absolute number of patients undergoing surgery was relatively low, making it unclear how these findings might translate to studies with higher intervention rates. We derived our cohort from two prospective studies where practice patterns may have been affected by the Hawthorne effect. Our cohort is also limited to mostly patients living in the United States, and there is likely to be a range of different socioeconomic and cultural frameworks that factor into decisions on treatment, prognosis, and quality of life throughout the world. With the recent publication of several large RCTs demonstrating the benefit of hematoma evacuation and decompressive craniectomy in ICH</w:t>
+        <w:t xml:space="preserve">However, alternative explanations should also be considered. Residual confounding from unmeasured clinical factors — such as proximity to eloquent cortex, degree of mass effect, extent of hydrocephalus, midline shift, or more granular anatomical features beyond our lobar-versus-deep classification — may independently influence both perceived surgical candidacy and laterality-associated outcomes. Similarly, family preferences, cultural attitudes toward disability, and language-related prognostic framing could influence treatment decisions in ways that are associated with hemispheric laterality but are not captured in our dataset. Our models adjusted for key measured confounders including ICH volume, location, GCS, and IVH, but the observational and post-hoc nature of this analysis means that residual confounding cannot be excluded. Accordingly, the association we observed should not be interpreted as definitive evidence of treatment inequity, but rather as a signal warranting prospective investigation. If confirmed, this disparity could have meaningful clinical implications — patients with dominant-hemispheric ICH may report equivalent quality of life outcomes compared to those with non-dominant hemispheric injury, and prevailing assumptions about poor prognosis in this group may not be warranted. Furthermore, the observation that functional outcomes were similar between groups despite less aggressive care for left hemispheric ICH is notable. This equivalence could be partly due to the differential impact of specific neurocognitive deficits on standardized rating scales; for example, severe neglect associated with right hemispheric lesions can profoundly impair mobility and self-care domains, whereas aphasia from left hemispheric lesions may influence mRS and caregiver perceptions of disability in different ways.</w:t>
+      </w:r>
+    </w:p>
+    <w:p>
+      <w:pPr>
+        <w:pStyle w:val="BodyText"/>
+      </w:pPr>
+      <w:r>
+        <w:t xml:space="preserve">Evidence is limited regarding the association of hemispheric lateralization and functional outcomes in patients with ICH. Our findings corroborate those from a pooled analysis of the INTERACT1 and INTERACT2 trials, which showed a higher risk of mortality in patients with right hemispheric ICH.</w:t>
+      </w:r>
+      <w:r>
+        <w:rPr>
+          <w:vertAlign w:val="superscript"/>
+        </w:rPr>
+        <w:t xml:space="preserve">12</w:t>
+      </w:r>
+      <w:r>
+        <w:t xml:space="preserve"> </w:t>
+      </w:r>
+      <w:r>
+        <w:t xml:space="preserve">Most other studies examining the association of hemispheric laterality and functional outcomes have focused on patients with acute ischemic stroke with mixed results. The two largest studies were pooled analyses from prospective ischemic stroke trials and neither found a clear association between hemispheric laterality and outcomes. </w:t>
+      </w:r>
+      <w:r>
+        <w:rPr>
+          <w:vertAlign w:val="superscript"/>
+        </w:rPr>
+        <w:t xml:space="preserve">26,27</w:t>
+      </w:r>
+      <w:r>
+        <w:t xml:space="preserve"> </w:t>
+      </w:r>
+      <w:r>
+        <w:t xml:space="preserve">This may be particularly challenging to study in ischemic stroke due to how the NIHSS is used to guide treatment decisions and is also biased toward higher scores in patients with left hemispheric injury.</w:t>
+      </w:r>
+      <w:r>
+        <w:rPr>
+          <w:vertAlign w:val="superscript"/>
+        </w:rPr>
+        <w:t xml:space="preserve">28</w:t>
+      </w:r>
+    </w:p>
+    <w:p>
+      <w:pPr>
+        <w:pStyle w:val="BodyText"/>
+      </w:pPr>
+      <w:r>
+        <w:t xml:space="preserve">Our study has some limitations. As a post-hoc observational analysis, our findings demonstrate associations and cannot establish causality. We used left versus right hemispheric laterality as a proxy for hemispheric dominance; however, approximately 5–10% of the general population — and a higher proportion of left-handed individuals — have atypical (right or bilateral) language dominance, and handedness data were not available in either cohort. As a result, some degree of misclassification of dominant versus non-dominant hemispheric injury is expected, which would bias effect estimates toward the null. Residual confounding from unmeasured clinical variables — including more granular measures of hematoma anatomy, eloquent cortex involvement, mass effect, and hydrocephalus — may account for some or all of the observed differences. Our primary models included a random intercept for study (ATACH-2 versus ERICH) but could not account for site-level clustering across all centers because site identifiers were unavailable for the ERICH cohort; a sensitivity analysis restricted to ATACH-2 incorporating a site-level random intercept yielded qualitatively similar results, but residual confounding from unmeasured center-level practice variation in the full cohort cannot be excluded. The absolute number of patients undergoing surgery was relatively low, making it unclear how these findings might translate to settings with higher intervention rates. We derived our cohort from two prospective studies where practice patterns may have been affected by the Hawthorne effect. Our cohort is also limited to mostly patients living in the United States, and there is likely to be a range of different socioeconomic and cultural frameworks that factor into decisions on treatment, prognosis, and quality of life throughout the world. Additionally, we could not assess unmeasured factors such as family preferences, language-related prognostic framing by clinicians, or the specific content of goals-of-care discussions, all of which may influence treatment decisions in laterality-dependent ways. With the recent publication of several large RCTs demonstrating the benefit of hematoma evacuation and decompressive craniectomy in ICH</w:t>
       </w:r>
       <w:r>
         <w:rPr>
@@ -594,7 +673,7 @@
         <w:t xml:space="preserve">3,13</w:t>
       </w:r>
       <w:r>
-        <w:t xml:space="preserve">, it will be imperative to confirm our findings with additional cohorts. Future research should focus on prospectively surveying clinicians, patients, and families with a variety of cultural and socioeconomic backgrounds as well as in a range of practice settings to further investigate the potential spectrum of biases in treatment decisions and their impact on outcomes.</w:t>
+        <w:t xml:space="preserve">, it will be imperative to confirm our findings with additional cohorts. Future research should focus on prospectively evaluating the association between hemispheric laterality and treatment decisions, and on surveying clinicians, patients, and families with a variety of cultural and socioeconomic backgrounds to better understand the factors that drive observed differences in intervention rates.</w:t>
       </w:r>
     </w:p>
     <w:bookmarkEnd w:id="25"/>
@@ -612,7 +691,7 @@
         <w:pStyle w:val="FirstParagraph"/>
       </w:pPr>
       <w:r>
-        <w:t xml:space="preserve">We found that patients with left hemispheric ICH were less likely to receive aggressive care in the form of neurosurgical intervention and external ventricular drain placement as compared to those with right hemispheric ICH. Despite this, patients with left hemispheric ICH were more likely to have better functional outcomes at 90 days. These findings highlight the potential influence of hemispheric laterality on treatment decisions and outcomes in ICH, and suggest that further research is needed to understand and address potential biases in treatment allocation.</w:t>
+        <w:t xml:space="preserve">In this post-hoc observational analysis, left hemispheric ICH was associated with a lower likelihood of neurosurgical intervention and external ventricular drain placement compared to right hemispheric ICH. Despite this difference in aggressive care, left hemispheric ICH was not associated with worse functional outcomes at 90 days, with patients exhibiting similar mRS and HRQoL profiles. While these associations are consistent with possible laterality-related differences in treatment decisions, residual confounding from unmeasured clinical and social factors cannot be excluded. These findings highlight the need for prospective studies to clarify whether hemispheric laterality independently influences treatment allocation and to ensure equitable access to surgical intervention in ICH.</w:t>
       </w:r>
     </w:p>
     <w:p>
@@ -621,7 +700,7 @@
       </w:r>
     </w:p>
     <w:bookmarkEnd w:id="26"/>
-    <w:bookmarkStart w:id="80" w:name="references"/>
+    <w:bookmarkStart w:id="82" w:name="references"/>
     <w:p>
       <w:pPr>
         <w:pStyle w:val="Heading2"/>
@@ -630,7 +709,7 @@
         <w:t xml:space="preserve">References</w:t>
       </w:r>
     </w:p>
-    <w:bookmarkStart w:id="79" w:name="refs"/>
+    <w:bookmarkStart w:id="81" w:name="refs"/>
     <w:bookmarkStart w:id="28" w:name="ref-hemphillICHScoreSimple2001"/>
     <w:p>
       <w:pPr>
@@ -2302,7 +2381,7 @@
       </w:r>
     </w:p>
     <w:bookmarkEnd w:id="66"/>
-    <w:bookmarkStart w:id="68" w:name="X7a4c185c12dbffdfd1dae8f81a04f8589333b44"/>
+    <w:bookmarkStart w:id="68" w:name="ref-buurenMiceMultivariateImputation2011"/>
     <w:p>
       <w:pPr>
         <w:pStyle w:val="Bibliography"/>
@@ -2317,12 +2396,137 @@
         <w:t xml:space="preserve">	</w:t>
       </w:r>
       <w:r>
+        <w:t xml:space="preserve">Buuren SV, Groothuis-Oudshoorn K.</w:t>
+      </w:r>
+      <w:r>
+        <w:t xml:space="preserve"> </w:t>
+      </w:r>
+      <w:hyperlink r:id="rId67">
+        <w:r>
+          <w:rPr>
+            <w:rStyle w:val="Hyperlink"/>
+            <w:b/>
+            <w:bCs/>
+          </w:rPr>
+          <w:t xml:space="preserve">Mice</w:t>
+        </w:r>
+        <w:r>
+          <w:rPr>
+            <w:rStyle w:val="Hyperlink"/>
+          </w:rPr>
+          <w:t xml:space="preserve"> </w:t>
+        </w:r>
+        <w:r>
+          <w:rPr>
+            <w:rStyle w:val="Hyperlink"/>
+          </w:rPr>
+          <w:t xml:space="preserve">:</w:t>
+        </w:r>
+        <w:r>
+          <w:rPr>
+            <w:rStyle w:val="Hyperlink"/>
+          </w:rPr>
+          <w:t xml:space="preserve"> </w:t>
+        </w:r>
+        <w:r>
+          <w:rPr>
+            <w:rStyle w:val="Hyperlink"/>
+          </w:rPr>
+          <w:t xml:space="preserve">Multivariate Imputation</w:t>
+        </w:r>
+        <w:r>
+          <w:rPr>
+            <w:rStyle w:val="Hyperlink"/>
+          </w:rPr>
+          <w:t xml:space="preserve"> </w:t>
+        </w:r>
+        <w:r>
+          <w:rPr>
+            <w:rStyle w:val="Hyperlink"/>
+          </w:rPr>
+          <w:t xml:space="preserve">by</w:t>
+        </w:r>
+        <w:r>
+          <w:rPr>
+            <w:rStyle w:val="Hyperlink"/>
+          </w:rPr>
+          <w:t xml:space="preserve"> </w:t>
+        </w:r>
+        <w:r>
+          <w:rPr>
+            <w:rStyle w:val="Hyperlink"/>
+          </w:rPr>
+          <w:t xml:space="preserve">Chained Equations</w:t>
+        </w:r>
+        <w:r>
+          <w:rPr>
+            <w:rStyle w:val="Hyperlink"/>
+          </w:rPr>
+          <w:t xml:space="preserve"> </w:t>
+        </w:r>
+        <w:r>
+          <w:rPr>
+            <w:rStyle w:val="Hyperlink"/>
+          </w:rPr>
+          <w:t xml:space="preserve">in</w:t>
+        </w:r>
+        <w:r>
+          <w:rPr>
+            <w:rStyle w:val="Hyperlink"/>
+          </w:rPr>
+          <w:t xml:space="preserve"> </w:t>
+        </w:r>
+        <w:r>
+          <w:rPr>
+            <w:rStyle w:val="Hyperlink"/>
+            <w:i/>
+            <w:iCs/>
+          </w:rPr>
+          <w:t xml:space="preserve">R</w:t>
+        </w:r>
+      </w:hyperlink>
+      <w:r>
+        <w:t xml:space="preserve">.</w:t>
+      </w:r>
+      <w:r>
+        <w:t xml:space="preserve"> </w:t>
+      </w:r>
+      <w:r>
+        <w:rPr>
+          <w:i/>
+          <w:iCs/>
+        </w:rPr>
+        <w:t xml:space="preserve">Journal of Statistical Software</w:t>
+      </w:r>
+      <w:r>
+        <w:t xml:space="preserve">. 2011;45.</w:t>
+      </w:r>
+      <w:r>
+        <w:t xml:space="preserve"> </w:t>
+      </w:r>
+    </w:p>
+    <w:bookmarkEnd w:id="68"/>
+    <w:bookmarkStart w:id="70" w:name="X7a4c185c12dbffdfd1dae8f81a04f8589333b44"/>
+    <w:p>
+      <w:pPr>
+        <w:pStyle w:val="Bibliography"/>
+      </w:pPr>
+      <w:r>
+        <w:t xml:space="preserve">23.</w:t>
+      </w:r>
+      <w:r>
+        <w:t xml:space="preserve"> </w:t>
+      </w:r>
+      <w:r>
+        <w:t xml:space="preserve">	</w:t>
+      </w:r>
+      <w:r>
         <w:t xml:space="preserve">Neugebauer H, Creutzfeldt CJ, Hemphill JC, Heuschmann PU, Jüttler E.</w:t>
       </w:r>
       <w:r>
         <w:t xml:space="preserve"> </w:t>
       </w:r>
-      <w:hyperlink r:id="rId67">
+      <w:hyperlink r:id="rId69">
         <w:r>
           <w:rPr>
             <w:rStyle w:val="Hyperlink"/>
@@ -2440,14 +2644,14 @@
         <w:t xml:space="preserve"> </w:t>
       </w:r>
     </w:p>
-    <w:bookmarkEnd w:id="68"/>
-    <w:bookmarkStart w:id="70" w:name="X891c4e92ab559843651bf648920cce7507bc2b7"/>
+    <w:bookmarkEnd w:id="70"/>
+    <w:bookmarkStart w:id="72" w:name="X891c4e92ab559843651bf648920cce7507bc2b7"/>
     <w:p>
       <w:pPr>
         <w:pStyle w:val="Bibliography"/>
       </w:pPr>
       <w:r>
-        <w:t xml:space="preserve">23.</w:t>
+        <w:t xml:space="preserve">24.</w:t>
       </w:r>
       <w:r>
         <w:t xml:space="preserve"> </w:t>
@@ -2461,7 +2665,7 @@
       <w:r>
         <w:t xml:space="preserve"> </w:t>
       </w:r>
-      <w:hyperlink r:id="rId69">
+      <w:hyperlink r:id="rId71">
         <w:r>
           <w:rPr>
             <w:rStyle w:val="Hyperlink"/>
@@ -2573,14 +2777,14 @@
         <w:t xml:space="preserve"> </w:t>
       </w:r>
     </w:p>
-    <w:bookmarkEnd w:id="70"/>
-    <w:bookmarkStart w:id="72" w:name="X43fe660b2331ec7445277f5239a44c6686e4cba"/>
+    <w:bookmarkEnd w:id="72"/>
+    <w:bookmarkStart w:id="74" w:name="X43fe660b2331ec7445277f5239a44c6686e4cba"/>
     <w:p>
       <w:pPr>
         <w:pStyle w:val="Bibliography"/>
       </w:pPr>
       <w:r>
-        <w:t xml:space="preserve">24.</w:t>
+        <w:t xml:space="preserve">25.</w:t>
       </w:r>
       <w:r>
         <w:t xml:space="preserve"> </w:t>
@@ -2594,7 +2798,7 @@
       <w:r>
         <w:t xml:space="preserve"> </w:t>
       </w:r>
-      <w:hyperlink r:id="rId71">
+      <w:hyperlink r:id="rId73">
         <w:r>
           <w:rPr>
             <w:rStyle w:val="Hyperlink"/>
@@ -2682,14 +2886,14 @@
         <w:t xml:space="preserve"> </w:t>
       </w:r>
     </w:p>
-    <w:bookmarkEnd w:id="72"/>
-    <w:bookmarkStart w:id="74" w:name="Xedc2e0f0a31863d3317a2038cd4180ef4585a94"/>
+    <w:bookmarkEnd w:id="74"/>
+    <w:bookmarkStart w:id="76" w:name="Xedc2e0f0a31863d3317a2038cd4180ef4585a94"/>
     <w:p>
       <w:pPr>
         <w:pStyle w:val="Bibliography"/>
       </w:pPr>
       <w:r>
-        <w:t xml:space="preserve">25.</w:t>
+        <w:t xml:space="preserve">26.</w:t>
       </w:r>
       <w:r>
         <w:t xml:space="preserve"> </w:t>
@@ -2703,7 +2907,7 @@
       <w:r>
         <w:t xml:space="preserve"> </w:t>
       </w:r>
-      <w:hyperlink r:id="rId73">
+      <w:hyperlink r:id="rId75">
         <w:r>
           <w:rPr>
             <w:rStyle w:val="Hyperlink"/>
@@ -2731,14 +2935,14 @@
         <w:t xml:space="preserve"> </w:t>
       </w:r>
     </w:p>
-    <w:bookmarkEnd w:id="74"/>
-    <w:bookmarkStart w:id="76" w:name="ref-almekhlafiStrokeLateralityDid2019"/>
+    <w:bookmarkEnd w:id="76"/>
+    <w:bookmarkStart w:id="78" w:name="ref-almekhlafiStrokeLateralityDid2019"/>
     <w:p>
       <w:pPr>
         <w:pStyle w:val="Bibliography"/>
       </w:pPr>
       <w:r>
-        <w:t xml:space="preserve">26.</w:t>
+        <w:t xml:space="preserve">27.</w:t>
       </w:r>
       <w:r>
         <w:t xml:space="preserve"> </w:t>
@@ -2752,7 +2956,7 @@
       <w:r>
         <w:t xml:space="preserve"> </w:t>
       </w:r>
-      <w:hyperlink r:id="rId75">
+      <w:hyperlink r:id="rId77">
         <w:r>
           <w:rPr>
             <w:rStyle w:val="Hyperlink"/>
@@ -2864,14 +3068,14 @@
         <w:t xml:space="preserve"> </w:t>
       </w:r>
     </w:p>
-    <w:bookmarkEnd w:id="76"/>
-    <w:bookmarkStart w:id="78" w:name="X3c0ca5277cb27ba7098a1b20322a338d87eb9a8"/>
+    <w:bookmarkEnd w:id="78"/>
+    <w:bookmarkStart w:id="80" w:name="X3c0ca5277cb27ba7098a1b20322a338d87eb9a8"/>
     <w:p>
       <w:pPr>
         <w:pStyle w:val="Bibliography"/>
       </w:pPr>
       <w:r>
-        <w:t xml:space="preserve">27.</w:t>
+        <w:t xml:space="preserve">28.</w:t>
       </w:r>
       <w:r>
         <w:t xml:space="preserve"> </w:t>
@@ -2885,7 +3089,7 @@
       <w:r>
         <w:t xml:space="preserve"> </w:t>
       </w:r>
-      <w:hyperlink r:id="rId77">
+      <w:hyperlink r:id="rId79">
         <w:r>
           <w:rPr>
             <w:rStyle w:val="Hyperlink"/>
@@ -3048,15 +3252,15 @@
         <w:t xml:space="preserve"> </w:t>
       </w:r>
     </w:p>
-    <w:bookmarkEnd w:id="78"/>
-    <w:bookmarkEnd w:id="79"/>
+    <w:bookmarkEnd w:id="80"/>
+    <w:bookmarkEnd w:id="81"/>
     <w:p>
       <w:r>
         <w:br w:type="page"/>
       </w:r>
     </w:p>
-    <w:bookmarkEnd w:id="80"/>
-    <w:bookmarkStart w:id="84" w:name="tables"/>
+    <w:bookmarkEnd w:id="82"/>
+    <w:bookmarkStart w:id="86" w:name="tables"/>
     <w:p>
       <w:pPr>
         <w:pStyle w:val="Heading2"/>
@@ -3078,7 +3282,7 @@
       <w:tr>
         <w:tc>
           <w:tcPr/>
-          <w:bookmarkStart w:id="81" w:name="tbl-1"/>
+          <w:bookmarkStart w:id="83" w:name="tbl-1"/>
           <w:p>
             <w:pPr>
               <w:jc w:val="center"/>
@@ -7205,7 +7409,7 @@
               </w:tc>
             </w:tr>
           </w:tbl>
-          <w:bookmarkEnd w:id="81"/>
+          <w:bookmarkEnd w:id="83"/>
         </w:tc>
       </w:tr>
     </w:tbl>
@@ -7227,7 +7431,7 @@
       <w:tr>
         <w:tc>
           <w:tcPr/>
-          <w:bookmarkStart w:id="82" w:name="tbl-2"/>
+          <w:bookmarkStart w:id="84" w:name="tbl-2"/>
           <w:p>
             <w:pPr>
               <w:jc w:val="center"/>
@@ -8665,7 +8869,7 @@
               </w:tc>
             </w:tr>
           </w:tbl>
-          <w:bookmarkEnd w:id="82"/>
+          <w:bookmarkEnd w:id="84"/>
         </w:tc>
       </w:tr>
     </w:tbl>
@@ -8687,7 +8891,7 @@
       <w:tr>
         <w:tc>
           <w:tcPr/>
-          <w:bookmarkStart w:id="83" w:name="tbl-3"/>
+          <w:bookmarkStart w:id="85" w:name="tbl-3"/>
           <w:p>
             <w:pPr>
               <w:jc w:val="center"/>
@@ -9737,7 +9941,7 @@
               </w:tc>
             </w:tr>
           </w:tbl>
-          <w:bookmarkEnd w:id="83"/>
+          <w:bookmarkEnd w:id="85"/>
         </w:tc>
       </w:tr>
     </w:tbl>
@@ -9746,8 +9950,8 @@
         <w:br w:type="page"/>
       </w:r>
     </w:p>
-    <w:bookmarkEnd w:id="84"/>
-    <w:bookmarkStart w:id="89" w:name="figures"/>
+    <w:bookmarkEnd w:id="86"/>
+    <w:bookmarkStart w:id="95" w:name="figures"/>
     <w:p>
       <w:pPr>
         <w:pStyle w:val="Heading2"/>
@@ -9769,7 +9973,7 @@
       <w:tr>
         <w:tc>
           <w:tcPr/>
-          <w:bookmarkStart w:id="88" w:name="fig-1"/>
+          <w:bookmarkStart w:id="90" w:name="fig-1"/>
           <w:p>
             <w:pPr>
               <w:pStyle w:val="Compact"/>
@@ -9780,18 +9984,18 @@
                 <wp:inline>
                   <wp:extent cx="5943600" cy="5943600"/>
                   <wp:effectExtent b="0" l="0" r="0" t="0"/>
-                  <wp:docPr descr="" title="" id="86" name="Picture"/>
+                  <wp:docPr descr="" title="" id="88" name="Picture"/>
                   <a:graphic>
                     <a:graphicData uri="http://schemas.openxmlformats.org/drawingml/2006/picture">
                       <pic:pic>
                         <pic:nvPicPr>
-                          <pic:cNvPr descr="../figures/figure_sensitivity_neurosurgery_evac.pdf" id="87" name="Picture"/>
+                          <pic:cNvPr descr="../figures/figure_sensitivity_neurosurgery_evac.pdf" id="89" name="Picture"/>
                           <pic:cNvPicPr>
                             <a:picLocks noChangeArrowheads="1" noChangeAspect="1"/>
                           </pic:cNvPicPr>
                         </pic:nvPicPr>
                         <pic:blipFill>
-                          <a:blip r:embed="rId85"/>
+                          <a:blip r:embed="rId87"/>
                           <a:stretch>
                             <a:fillRect/>
                           </a:stretch>
@@ -9831,11 +10035,98 @@
               <w:t xml:space="preserve">Figure 1: Prior Sensitivity Analysis for Neurosurgical Intervention</w:t>
             </w:r>
           </w:p>
-          <w:bookmarkEnd w:id="88"/>
+          <w:bookmarkEnd w:id="90"/>
         </w:tc>
       </w:tr>
     </w:tbl>
-    <w:bookmarkEnd w:id="89"/>
+    <w:p>
+      <w:pPr>
+        <w:pStyle w:val="BodyText"/>
+      </w:pPr>
+      <w:r>
+        <w:t xml:space="preserve"> </w:t>
+      </w:r>
+    </w:p>
+    <w:tbl>
+      <w:tblPr>
+        <w:tblStyle w:val="Table"/>
+        <w:tblW w:type="pct" w:w="5000"/>
+        <w:tblLayout w:type="fixed"/>
+        <w:tblLook w:firstRow="0" w:lastRow="0" w:firstColumn="0" w:lastColumn="0" w:noHBand="0" w:noVBand="0" w:val="0000"/>
+      </w:tblPr>
+      <w:tblGrid>
+        <w:gridCol w:w="7920"/>
+      </w:tblGrid>
+      <w:tr>
+        <w:tc>
+          <w:tcPr/>
+          <w:bookmarkStart w:id="94" w:name="fig-2"/>
+          <w:p>
+            <w:pPr>
+              <w:pStyle w:val="Compact"/>
+              <w:jc w:val="center"/>
+            </w:pPr>
+            <w:r>
+              <w:drawing>
+                <wp:inline>
+                  <wp:extent cx="5943600" cy="3820885"/>
+                  <wp:effectExtent b="0" l="0" r="0" t="0"/>
+                  <wp:docPr descr="" title="" id="92" name="Picture"/>
+                  <a:graphic>
+                    <a:graphicData uri="http://schemas.openxmlformats.org/drawingml/2006/picture">
+                      <pic:pic>
+                        <pic:nvPicPr>
+                          <pic:cNvPr descr="../figures/mrs/figure_mrs_main_neutral_adjusted.pdf" id="93" name="Picture"/>
+                          <pic:cNvPicPr>
+                            <a:picLocks noChangeArrowheads="1" noChangeAspect="1"/>
+                          </pic:cNvPicPr>
+                        </pic:nvPicPr>
+                        <pic:blipFill>
+                          <a:blip r:embed="rId91"/>
+                          <a:stretch>
+                            <a:fillRect/>
+                          </a:stretch>
+                        </pic:blipFill>
+                        <pic:spPr bwMode="auto">
+                          <a:xfrm>
+                            <a:off x="0" y="0"/>
+                            <a:ext cx="5943600" cy="3820885"/>
+                          </a:xfrm>
+                          <a:prstGeom prst="rect">
+                            <a:avLst/>
+                          </a:prstGeom>
+                          <a:noFill/>
+                          <a:ln w="9525">
+                            <a:noFill/>
+                            <a:headEnd/>
+                            <a:tailEnd/>
+                          </a:ln>
+                        </pic:spPr>
+                      </pic:pic>
+                    </a:graphicData>
+                  </a:graphic>
+                </wp:inline>
+              </w:drawing>
+            </w:r>
+          </w:p>
+          <w:p>
+            <w:pPr>
+              <w:jc w:val="center"/>
+            </w:pPr>
+            <w:pPr>
+              <w:jc w:val="left"/>
+              <w:spacing w:before="200"/>
+              <w:pStyle w:val="ImageCaption"/>
+            </w:pPr>
+            <w:r>
+              <w:t xml:space="preserve">Figure 2: modified Rankin Score at 90 days Stratified by ICH Laterality</w:t>
+            </w:r>
+          </w:p>
+          <w:bookmarkEnd w:id="94"/>
+        </w:tc>
+      </w:tr>
+    </w:tbl>
+    <w:bookmarkEnd w:id="95"/>
     <w:sectPr>
       <w:footnotePr>
         <w:numFmt w:val="decimal"/>

</xml_diff>

<commit_message>
chore: update R dependencies and project version in renv.lock and revise manuscript documentation
</commit_message>
<xml_diff>
--- a/manuscripts/manuscript.docx
+++ b/manuscripts/manuscript.docx
@@ -8072,79 +8072,79 @@
                       <w:rFonts w:ascii="Calibri" w:hAnsi="Calibri"/>
                       <w:sz w:val="20"/>
                     </w:rPr>
-                    <w:t xml:space="default">1.7 (0.99 - 2.81)</w:t>
-                  </w:r>
-                </w:p>
-              </w:tc>
-              <w:tc>
-                <w:tcPr>
-                  <w:tcBorders>
-                    <w:top w:val="single" w:space="0" w:color="D3D3D3"/>
-                    <w:bottom w:val="single" w:space="0" w:color="D3D3D3"/>
-                    <w:start w:val="single" w:space="0" w:color="D3D3D3"/>
-                    <w:end w:val="single" w:space="0" w:color="D3D3D3"/>
-                  </w:tcBorders>
-                </w:tcPr>
-                <w:p>
-                  <w:pPr>
-                    <w:spacing w:before="0" w:after="60"/>
-                    <w:keepNext/>
-                    <w:jc w:val="start"/>
-                  </w:pPr>
-                  <w:r>
-                    <w:rPr>
-                      <w:rFonts w:ascii="Calibri" w:hAnsi="Calibri"/>
-                      <w:sz w:val="20"/>
-                    </w:rPr>
-                    <w:t xml:space="default">97.2%</w:t>
-                  </w:r>
-                </w:p>
-              </w:tc>
-              <w:tc>
-                <w:tcPr>
-                  <w:tcBorders>
-                    <w:top w:val="single" w:space="0" w:color="D3D3D3"/>
-                    <w:bottom w:val="single" w:space="0" w:color="D3D3D3"/>
-                    <w:start w:val="single" w:space="0" w:color="D3D3D3"/>
-                    <w:end w:val="single" w:space="0" w:color="D3D3D3"/>
-                  </w:tcBorders>
-                </w:tcPr>
-                <w:p>
-                  <w:pPr>
-                    <w:spacing w:before="0" w:after="60"/>
-                    <w:keepNext/>
-                    <w:jc w:val="start"/>
-                  </w:pPr>
-                  <w:r>
-                    <w:rPr>
-                      <w:rFonts w:ascii="Calibri" w:hAnsi="Calibri"/>
-                      <w:sz w:val="20"/>
-                    </w:rPr>
-                    <w:t xml:space="default">90.2%</w:t>
-                  </w:r>
-                </w:p>
-              </w:tc>
-              <w:tc>
-                <w:tcPr>
-                  <w:tcBorders>
-                    <w:top w:val="single" w:space="0" w:color="D3D3D3"/>
-                    <w:bottom w:val="single" w:space="0" w:color="D3D3D3"/>
-                    <w:start w:val="single" w:space="0" w:color="D3D3D3"/>
-                    <w:end w:val="single" w:space="0" w:color="D3D3D3"/>
-                  </w:tcBorders>
-                </w:tcPr>
-                <w:p>
-                  <w:pPr>
-                    <w:spacing w:before="0" w:after="60"/>
-                    <w:keepNext/>
-                    <w:jc w:val="start"/>
-                  </w:pPr>
-                  <w:r>
-                    <w:rPr>
-                      <w:rFonts w:ascii="Calibri" w:hAnsi="Calibri"/>
-                      <w:sz w:val="20"/>
-                    </w:rPr>
-                    <w:t xml:space="default">2.1%</w:t>
+                    <w:t xml:space="default">0.99 (0.89 - 1.09)</w:t>
+                  </w:r>
+                </w:p>
+              </w:tc>
+              <w:tc>
+                <w:tcPr>
+                  <w:tcBorders>
+                    <w:top w:val="single" w:space="0" w:color="D3D3D3"/>
+                    <w:bottom w:val="single" w:space="0" w:color="D3D3D3"/>
+                    <w:start w:val="single" w:space="0" w:color="D3D3D3"/>
+                    <w:end w:val="single" w:space="0" w:color="D3D3D3"/>
+                  </w:tcBorders>
+                </w:tcPr>
+                <w:p>
+                  <w:pPr>
+                    <w:spacing w:before="0" w:after="60"/>
+                    <w:keepNext/>
+                    <w:jc w:val="start"/>
+                  </w:pPr>
+                  <w:r>
+                    <w:rPr>
+                      <w:rFonts w:ascii="Calibri" w:hAnsi="Calibri"/>
+                      <w:sz w:val="20"/>
+                    </w:rPr>
+                    <w:t xml:space="default">39%</w:t>
+                  </w:r>
+                </w:p>
+              </w:tc>
+              <w:tc>
+                <w:tcPr>
+                  <w:tcBorders>
+                    <w:top w:val="single" w:space="0" w:color="D3D3D3"/>
+                    <w:bottom w:val="single" w:space="0" w:color="D3D3D3"/>
+                    <w:start w:val="single" w:space="0" w:color="D3D3D3"/>
+                    <w:end w:val="single" w:space="0" w:color="D3D3D3"/>
+                  </w:tcBorders>
+                </w:tcPr>
+                <w:p>
+                  <w:pPr>
+                    <w:spacing w:before="0" w:after="60"/>
+                    <w:keepNext/>
+                    <w:jc w:val="start"/>
+                  </w:pPr>
+                  <w:r>
+                    <w:rPr>
+                      <w:rFonts w:ascii="Calibri" w:hAnsi="Calibri"/>
+                      <w:sz w:val="20"/>
+                    </w:rPr>
+                    <w:t xml:space="default">&lt; 0.1%</w:t>
+                  </w:r>
+                </w:p>
+              </w:tc>
+              <w:tc>
+                <w:tcPr>
+                  <w:tcBorders>
+                    <w:top w:val="single" w:space="0" w:color="D3D3D3"/>
+                    <w:bottom w:val="single" w:space="0" w:color="D3D3D3"/>
+                    <w:start w:val="single" w:space="0" w:color="D3D3D3"/>
+                    <w:end w:val="single" w:space="0" w:color="D3D3D3"/>
+                  </w:tcBorders>
+                </w:tcPr>
+                <w:p>
+                  <w:pPr>
+                    <w:spacing w:before="0" w:after="60"/>
+                    <w:keepNext/>
+                    <w:jc w:val="start"/>
+                  </w:pPr>
+                  <w:r>
+                    <w:rPr>
+                      <w:rFonts w:ascii="Calibri" w:hAnsi="Calibri"/>
+                      <w:sz w:val="20"/>
+                    </w:rPr>
+                    <w:t xml:space="default">65.6%</w:t>
                   </w:r>
                 </w:p>
               </w:tc>
@@ -8963,7 +8963,7 @@
                       <w:rFonts w:ascii="Calibri" w:hAnsi="Calibri"/>
                       <w:sz w:val="20"/>
                     </w:rPr>
-                    <w:t xml:space="default">aOR (95% CI)</w:t>
+                    <w:t xml:space="default">aOR / Mean Diff (95% CI)</w:t>
                   </w:r>
                 </w:p>
               </w:tc>

</xml_diff>

<commit_message>
refactor: streamline statistical reporting and update results section in manuscript.qmd
</commit_message>
<xml_diff>
--- a/manuscripts/manuscript.docx
+++ b/manuscripts/manuscript.docx
@@ -478,7 +478,7 @@
         <w:pStyle w:val="Heading3"/>
       </w:pPr>
       <w:r>
-        <w:t xml:space="preserve">Hemispheric laterality and neurosurgical intervention</w:t>
+        <w:t xml:space="preserve">Hemispheric Laterality and Neurosurgical Intervention</w:t>
       </w:r>
     </w:p>
     <w:p>
@@ -486,7 +486,7 @@
         <w:pStyle w:val="FirstParagraph"/>
       </w:pPr>
       <w:r>
-        <w:t xml:space="preserve">Associations between hemispheric laterality and primary and secondary outcomes are shown in Table 2. There were 86 (5.0%) with left hemispheric ICH who underwent neurosurgical intervention as compared to 144 (8.2%) with right hemispheric ICH (aOR 1.65, 95% CrI 1.28 - 2.14). The posterior probability that the aOR was greater than 1 was &gt; 99.9%. The posterior probability of the aOR being greater than 1.2, indicating a substantial difference, was 99.3%. A very small portion of the posterior probability was inside of the ROPE (&lt; 0.1%).</w:t>
+        <w:t xml:space="preserve">Associations between hemispheric laterality and primary and secondary outcomes are shown in Table 2. 86 (5.0%) patients with left hemispheric ICH underwent neurosurgical intervention, compared to 144 (8.2%) with right hemispheric ICH (aOR 1.65, 95% CrI 1.28–2.14). The posterior probability that the aOR exceeded 1 was &gt; 99.9%, and the posterior probability of a substantial difference (aOR &gt; 1.2) was 99.3%. Fewer than &lt; 0.1% of the posterior distribution fell within the ROPE.</w:t>
       </w:r>
     </w:p>
     <w:p>
@@ -494,7 +494,15 @@
         <w:pStyle w:val="BodyText"/>
       </w:pPr>
       <w:r>
-        <w:t xml:space="preserve">Figure 1 displays the prior sensitivity analysis for neurosurgical intervention. Panel A shows the posterior distributions of covariate-adjusted predicted probabilities of neurosurgical intervention for left and right hemispheric ICH under the neutral prior, illustrating the separation in absolute risk between groups (left hemisphere: 4.86%, 95% CrI 3.98–5.84%; right hemisphere: 8.04%, 95% CrI 6.93–9.23%). Panel B overlays the posterior distributions of the absolute probability difference (Right − Left) across all four prior specifications (neutral, left-hemisphere, right-hemisphere, and flat). All four priors yielded nearly identical posterior distributions, with P(Right &gt; Left) exceeding 99.9% under every specification. The most skeptical prior (left-hemisphere) shifted the median probability difference from 3.18 to 2.21 percentage points but did not materially alter the conclusion, demonstrating that the primary finding is robust to prior choice. In a sensitivity analysis restricted to the ATACH-2 cohort, inclusion of a random intercept for hospital site slightly attenuated the point estimate and widened the credible interval but did not materially alter the direction or strength of the association. Additional sensitivity analyses, including alternative priors, complete-case analyses, and site-level clustering results, are presented in the Supplementary Appendix.</w:t>
+        <w:t xml:space="preserve">Figure 1 displays the covariate-adjusted marginal predicted probabilities of neurosurgical intervention and the prior sensitivity analysis. Panel A shows the posterior distributions of covariate-adjusted absolute predicted probabilities of neurosurgical intervention for left and right hemispheric ICH under the neutral prior (left hemisphere: 4.86%, 95% CrI 3.98–5.84%; right hemisphere: 8.04%, 95% CrI 6.93–9.23%). Panel B shows the posterior distributions of the absolute probability difference (Right − Left) across all four prior specifications. Under the neutral prior, the median probability difference was 3.18 percentage points (95% CrI 1.75–4.62), with P(Right &gt; Left) exceeding 99.9%. Corresponding estimates were 2.21 percentage points (95% CrI 0.97–3.45) under the left-hemisphere prior, 2.84 percentage points (95% CrI 1.60–4.09) under the right-hemisphere prior, and 3.38 percentage points (95% CrI 1.90–4.89) under the flat prior, with P(Right &gt; Left) exceeding 99.9% under all specifications.</w:t>
+      </w:r>
+    </w:p>
+    <w:p>
+      <w:pPr>
+        <w:pStyle w:val="BodyText"/>
+      </w:pPr>
+      <w:r>
+        <w:t xml:space="preserve">In a sensitivity analysis restricted to the ATACH-2 cohort, inclusion of a random intercept for hospital site modestly attenuated the point estimate and shifted the credible interval toward the null but did not materially alter the direction or strength of the association. Details are available in the Supplementary Appendix.</w:t>
       </w:r>
     </w:p>
     <w:bookmarkEnd w:id="21"/>
@@ -504,7 +512,7 @@
         <w:pStyle w:val="Heading3"/>
       </w:pPr>
       <w:r>
-        <w:t xml:space="preserve">Hemispheric laterality and secondary outcomes</w:t>
+        <w:t xml:space="preserve">Hemispheric Laterality and Secondary Outcomes</w:t>
       </w:r>
     </w:p>
     <w:p>
@@ -512,7 +520,13 @@
         <w:pStyle w:val="FirstParagraph"/>
       </w:pPr>
       <w:r>
-        <w:t xml:space="preserve">A total of 236 (13.7%) with left hemispheric ICH had an external ventricular drain (EVD) placed as compared to 272 (15.5%) with right hemispheric ICH (aOR 1.22, 95% CrI 1.04 - 1.44). The posterior probability that the aOR was greater than 1 was 99.2%. The posterior probability that the aOR was greater than 1.2 was 58.2%. About 3.3% of the posterior distribution was inside of the ROPE.</w:t>
+        <w:t xml:space="preserve">A total of 236 (13.7%) with left hemispheric ICH had an EVD placed as compared to 272 (15.5%) with right hemispheric ICH (aOR 1.22, 95% CrI 1.04–1.44). The posterior probability that the aOR exceeded</w:t>
+      </w:r>
+      <w:r>
+        <w:t xml:space="preserve"> </w:t>
+      </w:r>
+      <w:r>
+        <w:t xml:space="preserve">1 was 99.2%, and the posterior probability of a substantial difference (aOR &gt; 1.2) was 58.2%. 3.3% of the posterior distribution fell within the ROPE.</w:t>
       </w:r>
     </w:p>
     <w:p>
@@ -520,7 +534,15 @@
         <w:pStyle w:val="BodyText"/>
       </w:pPr>
       <w:r>
-        <w:t xml:space="preserve">Other secondary outcomes showed smaller and less certain associations with hemispheric laterality.</w:t>
+        <w:t xml:space="preserve">Median days on mechanical ventilation were 6 (3 – 12) and 6 (3 – 9) for left and right hemispheric ICH, respectively (IRR 0.99, 95% CrI 0.89–1.09). The posterior probability that the IRR exceeded 1 was 39%, and 65.6% of the posterior distribution fell within the ROPE.</w:t>
+      </w:r>
+    </w:p>
+    <w:p>
+      <w:pPr>
+        <w:pStyle w:val="BodyText"/>
+      </w:pPr>
+      <w:r>
+        <w:t xml:space="preserve">Rates of tracheostomy were similar between groups (19 (1.1%) left vs. 19 (1.1%) right; aOR 1.13 (0.66 - 1.91)), with a posterior probability that the aOR exceeded 1 of 67.2% and 13.1% of the posterior distribution within the ROPE. Rates of WLST (152 (8.8%) left vs. 143 (8.1%) right; aOR 0.95 (0.76 - 1.17)), early WLST (45 (2.6%) left vs. 39 (2.2%) right; aOR 0.93 (0.63 - 1.35)), and DNR orders (195 (11.3%) left vs. 202 (11.5%) right; aOR 1.01 (0.85 - 1.21)) were also similar across hemispheres, with P(aOR &gt; 1) of 30.2%, 34.5%, and 55.2%, respectively.</w:t>
       </w:r>
     </w:p>
     <w:bookmarkEnd w:id="22"/>
@@ -530,7 +552,7 @@
         <w:pStyle w:val="Heading3"/>
       </w:pPr>
       <w:r>
-        <w:t xml:space="preserve">Hemispheric laterality and functional outcomes</w:t>
+        <w:t xml:space="preserve">Hemispheric Laterality and Functional Outcomes</w:t>
       </w:r>
     </w:p>
     <w:p>
@@ -538,7 +560,7 @@
         <w:pStyle w:val="FirstParagraph"/>
       </w:pPr>
       <w:r>
-        <w:t xml:space="preserve">The associations between mRS at 90 days and functional outcomes are described in Table 3. The aOR for a worse mRS score at 90 days associated with right hemispheric ICH compared to left hemispheric ICH was 0.99 (95% CrI 0.98 - 1.00). The posterior probability that the aOR was &gt; 1 was 0.7%. The posterior probability that the aOR was &gt; 1.2 was &lt; 0.1%. About &gt; 99.9% of the posterior distribution was inside of the ROPE.</w:t>
+        <w:t xml:space="preserve">Associations between hemispheric laterality and functional outcomes are shown in Table 3. The aOR for a worse mRS score at 90 days for right hemispheric ICH compared to left hemispheric ICH was 0.99 (95% CrI 0.98–1.00), with a posterior probability that the aOR exceeded 1 of 0.7% and &gt; 99.9% of the posterior distribution within the ROPE. Figure 3 displays the covariate-adjusted absolute marginal predicted cumulative distributions of mRS at 90 days for left and right hemispheric ICH under the neutral prior.</w:t>
       </w:r>
     </w:p>
     <w:p>
@@ -546,15 +568,7 @@
         <w:pStyle w:val="BodyText"/>
       </w:pPr>
       <w:r>
-        <w:t xml:space="preserve">When examining HRQoL domains, we observed similar functional outcomes between groups. The aOR for a worse EuroQOL - Mobility score associated with right hemispheric ICH compared to left hemispheric ICH was 1.03 (95% CrI 1.01 - 1.05) with similar results for the Self-Care domain. The posterior probability that the aOR was &gt; 1 was &gt; 99.9% for both domains, with the posterior probability that the aOR was &gt; 1.2 being &lt; 0.1%.</w:t>
-      </w:r>
-    </w:p>
-    <w:p>
-      <w:pPr>
-        <w:pStyle w:val="BodyText"/>
-      </w:pPr>
-      <w:r>
-        <w:t xml:space="preserve">Results from using different priors and sensitivity analyses are presented in the Supplementary Appendix and were consistent with the primary findings.</w:t>
+        <w:t xml:space="preserve">For Mobility and Self-Care, the posterior probability that the aOR exceeded 1 was &gt; 99.9% for both domains (aOR 1.03, 95% CrI 1.01–1.05 for Mobility; aOR 1.03 (1.02 - 1.05) for Self-Care), with a posterior probability of a substantial difference (aOR &gt; 1.2) of &lt; 0.1% for both, and 98.3% and 96.4% of the posterior distributions within the ROPE, respectively. For Pain/Discomfort, the aOR was 1.06 (1.01 - 1.11) with P(aOR &gt; 1) of 99.1% and 38.3% of the posterior distribution within the ROPE. For Anxiety/Depression, the aOR was 1.04 (0.99 - 1.09) with P(aOR &gt; 1) of 95.3% and 64% of the posterior distribution within the ROPE. For Usual Activities, the aOR was 0.99 (0.99 - 1.00) with P(aOR &gt; 1) of 3.1% and &gt; 99.9% of the posterior distribution within the ROPE. For the Euro VAS, the estimated mean difference was -1.7 points (95% CrI -3.6–0.2), with a posterior probability of 96.1% that right hemispheric ICH was associated with a lower score, 62.3% of the posterior distribution within the ROPE, and a posterior probability of a substantial difference (mean difference &lt; −5 points) of &lt; 0.1%. Results from sensitivity analyses using alternative priors are presented in the Supplementary Appendix and are consistent with these results.</w:t>
       </w:r>
     </w:p>
     <w:bookmarkEnd w:id="23"/>

</xml_diff>

<commit_message>
refactor: rename flat prior to diffuse and add bibliographic metadata for manuscript preparation
</commit_message>
<xml_diff>
--- a/manuscripts/manuscript.docx
+++ b/manuscripts/manuscript.docx
@@ -36,7 +36,7 @@
         <w:t xml:space="preserve"> </w:t>
       </w:r>
       <w:r>
-        <w:t xml:space="preserve">While management of ischemic stroke has advanced considerably over the last decade, the acute management of ICH remains limited to blood pressure control, coagulopathy reversal, and more perhaps surgical evacuation of hemorrhage.</w:t>
+        <w:t xml:space="preserve">While management of ischemic stroke has advanced considerably over the last decade, the acute management of ICH remains limited to blood pressure control, coagulopathy reversal, and perhaps surgical evacuation of hemorrhage.</w:t>
       </w:r>
       <w:r>
         <w:rPr>
@@ -203,25 +203,7 @@
         <w:pStyle w:val="FirstParagraph"/>
       </w:pPr>
       <w:r>
-        <w:t xml:space="preserve">To estimate the effect of hemispheric laterality on the outcomes of interest, we fitted hierarchal Bayesian regression models adjusted for the specified covariates below. We also included the study that patient came from as a random intercept. We employed Bayesian statistical methods for this analysis due to several advantages over traditional frequentist approaches. Bayesian methods allow for the incorporation of prior knowledge or beliefs into the analysis, which can be particularly useful in observational studies where prior information about relationships between variables may exist. This is achieved through the use of prior distributions, which are combined with the observed data to produce posterior distributions representing updated beliefs about the parameters of interest. Furthermore, Bayesian methods provide a natural framework for quantifying uncertainty through credible intervals (CrI), which offer a more intuitive interpretation than frequentist confidence intervals. Finally, Bayesian modeling facilitates the estimation of posterior probabilities, allowing for direct probabilistic statements about hypotheses, such as the probability that an effect size (e.g., odds ratio [OR] or incidence rate ratio [IRR]) is greater than 1, which is often of greater clinical relevance than a p-value.</w:t>
-      </w:r>
-      <w:r>
-        <w:rPr>
-          <w:vertAlign w:val="superscript"/>
-        </w:rPr>
-        <w:t xml:space="preserve">16,17</w:t>
-      </w:r>
-      <w:r>
-        <w:t xml:space="preserve"> </w:t>
-      </w:r>
-      <w:r>
-        <w:t xml:space="preserve">This report adheres to the Bayesian Analysis Reporting Guidelines.</w:t>
-      </w:r>
-      <w:r>
-        <w:rPr>
-          <w:vertAlign w:val="superscript"/>
-        </w:rPr>
-        <w:t xml:space="preserve">18</w:t>
+        <w:t xml:space="preserve">Associations between hemispheric laterality and clinical outcomes were evaluated using hierarchical Bayesian regression models, adjusting for the covariates listed below with a random intercept applied to the enrolling study cohort.</w:t>
       </w:r>
     </w:p>
     <w:p>
@@ -229,7 +211,25 @@
         <w:pStyle w:val="BodyText"/>
       </w:pPr>
       <w:r>
-        <w:t xml:space="preserve">For binary and ordinal endpoints, we utilized hierarchical Bayesian logistic and ordinal logistic regression models, respectively. For non-binary outcomes, we employed specialized distributional models to avoid data dichotomization and accurately reflect the underlying data generating processes. Specifically, days of mechanical ventilation, a count-based outcome characterized by excess zeros, was modeled using a hierarchical Bayesian zero-inflated negative binomial regression. Exponentiated coefficients for the count component of this model are reported as incidence rate ratios (IRR). The European Quality of Life Visual Analog Scale (EQ-VAS), a bounded continuous measure, was scaled to a proportion and modeled using a hierarchical Bayesian zero-one inflated beta (ZOIB) regression. To maximize clinical interpretability, we applied G-computation to derive the average marginal expected mean difference on the original 0–100 point scale, rather than reporting proportional odds.</w:t>
+        <w:t xml:space="preserve">We employed Bayesian statistical methods for this analysis due to several advantages over traditional frequentist approaches. Bayesian methods allow for the incorporation of prior knowledge or beliefs into the analysis, which can be particularly useful in observational studies where prior information about relationships between variables may exist. This is achieved through the use of prior distributions, which are combined with the observed data to produce posterior distributions representing updated beliefs about the parameters of interest. Furthermore, Bayesian methods provide a natural framework for quantifying uncertainty through credible intervals (CrI), which offer a more intuitive interpretation than frequentist confidence intervals. Finally, Bayesian modeling facilitates the estimation of posterior probabilities, allowing for direct probabilistic statements about hypotheses, such as the probability that an effect size (e.g., odds ratio [OR] or incidence rate ratio [IRR]) is greater than 1, which is often of greater clinical relevance than a p-value.</w:t>
+      </w:r>
+      <w:r>
+        <w:rPr>
+          <w:vertAlign w:val="superscript"/>
+        </w:rPr>
+        <w:t xml:space="preserve">16,17</w:t>
+      </w:r>
+      <w:r>
+        <w:t xml:space="preserve"> </w:t>
+      </w:r>
+      <w:r>
+        <w:t xml:space="preserve">This report adheres to the Bayesian Analysis Reporting Guidelines.</w:t>
+      </w:r>
+      <w:r>
+        <w:rPr>
+          <w:vertAlign w:val="superscript"/>
+        </w:rPr>
+        <w:t xml:space="preserve">18</w:t>
       </w:r>
     </w:p>
     <w:p>
@@ -237,7 +237,7 @@
         <w:pStyle w:val="BodyText"/>
       </w:pPr>
       <w:r>
-        <w:t xml:space="preserve">Decisions on neurosurgical intervention and other aspects of acute care are highly influenced by local practice patterns and resources. To account for potential clustering of clinical decision-making by hospital, we ideally would have included a random intercept for the study site in all models. However, site-level identifiers were not available for the ERICH cohort. To assess the potential impact of omitting site-level clustering, we performed a sensitivity analysis restricted to the ATACH-2 cohort, where site identifiers were available. We fitted the primary model for neurosurgical intervention with and without a random intercept for the hospital site and compared the posterior estimates for the association with laterality.</w:t>
+        <w:t xml:space="preserve">Binary, ordinal, and count-based outcomes were modeled using hierarchical Bayesian logistic, ordinal logistic, and zero-inflated negative binomial regressions, respectively. The European Quality of Life Visual Analog Scale (EQ-VAS) was scaled to a proportion and analyzed via hierarchical Bayesian zero-one inflated beta (ZOIB) regression. Because our adjusted models included an interaction term between hemispheric laterality and ICH location, the raw main-effect coefficients for laterality are conditional on the reference location. To calculate the overall average effect of laterality across the entire cohort, we applied marginal standardization (G-computation) to all models. This allowed us to estimate average marginal effects while averaging over the empirical distribution of all covariates and the random intercept.</w:t>
       </w:r>
     </w:p>
     <w:p>
@@ -245,7 +245,15 @@
         <w:pStyle w:val="BodyText"/>
       </w:pPr>
       <w:r>
-        <w:t xml:space="preserve">All analyses were performed in R version 4.4.2 (R Foundation for Statistical Computing, Vienna, Austria). ALl packages used for the analysis are listed in the Supplementary Appendix.</w:t>
+        <w:t xml:space="preserve">To account for potential clustering of clinical decision-making by hospital, we ideally would have included a random intercept for the study site in all models. However, site-level identifiers were not available for the ERICH cohort. To assess the potential impact of omitting site-level clustering, we performed a sensitivity analysis restricted to the ATACH-2 cohort, where site identifiers were available. We fitted the primary model for neurosurgical intervention with and without a random intercept for hospital site and compared the posterior estimates for the association with laterality.</w:t>
+      </w:r>
+    </w:p>
+    <w:p>
+      <w:pPr>
+        <w:pStyle w:val="BodyText"/>
+      </w:pPr>
+      <w:r>
+        <w:t xml:space="preserve">All analyses were performed in R version 4.4.2 (R Foundation for Statistical Computing, Vienna, Austria). All packages used for the analysis are listed in the Supplementary Appendix.</w:t>
       </w:r>
     </w:p>
     <w:bookmarkStart w:id="12" w:name="covariate-selection"/>
@@ -274,7 +282,7 @@
         <w:t xml:space="preserve"> </w:t>
       </w:r>
       <w:r>
-        <w:t xml:space="preserve">For neurosurgical intervention and other acute care outcomes, the target estimand was the direct effect of hemispheric laterality on treatment decisions. Models were adjusted for baseline confounders that independently influence both the clinical presentation associated with hemispheric laterality and the likelihood of intervention: age, admission Glasgow Coma Scale (GCS) score, ICH location (categorized as lobar, thalamic, or basal ganglia), baseline ICH volume, and presence of intraventricular hemorrhage (IVH).</w:t>
+        <w:t xml:space="preserve">For neurosurgical intervention and other acute care outcomes, the target estimand was the total effect of hemispheric laterality on treatment decisions. Models were adjusted for baseline confounders that independently influence both the clinical presentation associated with hemispheric laterality and the likelihood of intervention: age, admission Glasgow Coma Scale (GCS) score, ICH location (categorized as lobar, thalamic, or basal ganglia), baseline ICH volume, and presence of intraventricular hemorrhage (IVH).</w:t>
       </w:r>
     </w:p>
     <w:p>
@@ -294,7 +302,7 @@
         <w:t xml:space="preserve"> </w:t>
       </w:r>
       <w:r>
-        <w:t xml:space="preserve">The DAGs and further details of the covariate selection rationale are presented in the supplementary material.</w:t>
+        <w:t xml:space="preserve">The DAGs and further details of the covariate selection rationale are presented in the Supplementary Appendix.</w:t>
       </w:r>
     </w:p>
     <w:bookmarkEnd w:id="12"/>
@@ -312,7 +320,7 @@
         <w:pStyle w:val="FirstParagraph"/>
       </w:pPr>
       <w:r>
-        <w:t xml:space="preserve">We applied four sets of prior distributions for all models to assess the robustness of our findings. The first set was a neutral prior, centered on a log-odds ratio of 0, which corresponds to an odds ratio of 1 and assumes no difference in the outcome of interest between left and right hemispheric patients. The second and third sets were left hemisphere and right hemisphere priors, respectively, which were weakly informative priors that assumed a higher probability of the outcome occurring in the specified hemisphere. The final set was a flat prior, which assumes that all possible values for the model parameters are equally likely. This non-informative prior allows the data to dominate the posterior distribution and most closely approximates the assumptions of a frequentist analysis. More details on the rationale of prior specification and the specific parameters used for each prior distribution are included in the supplementary appendix.</w:t>
+        <w:t xml:space="preserve">We applied four sets of prior distributions for all models to assess the robustness of our findings. Because our models utilized different link functions based on the outcome distribution (e.g., logit for binary/ordinal outcomes, log for count outcomes), the priors correspond to log-odds ratios (OR), log-incidence rate ratios (IRR), or log-mean differences depending on the respective model. The first set was a neutral prior, centered on a log-odds ratio of 0, which corresponds to an odds ratio of 1 and assumes no difference in the outcome of interest between left and right hemispheric patients. The second and third sets were left hemisphere and right hemisphere priors, respectively, which were weakly informative priors that assumed a higher probability of the outcome occurring in the specified hemisphere. The final set was a diffuse prior, which assumes that all possible values for the model parameters are equally likely. This non-informative prior allows the data to dominate the posterior distribution and most closely approximates the assumptions of a frequentist analysis. More details on the rationale of prior specification and the specific parameters used for each prior distribution are included in the Supplementary Appendix.</w:t>
       </w:r>
     </w:p>
     <w:bookmarkEnd w:id="13"/>
@@ -330,23 +338,15 @@
         <w:pStyle w:val="FirstParagraph"/>
       </w:pPr>
       <w:r>
-        <w:t xml:space="preserve">We report the following metrics for the effect of hemispheric laterality: 1) median posterior effect size (OR, IRR, or mean difference) with 95% CrI; 2) probability of any directional difference (e.g., P[OR] &gt; 1 or P[Mean Difference] &lt; 0); 3) probability of a substantial difference defined</w:t>
-      </w:r>
-      <w:r>
-        <w:t xml:space="preserve"> </w:t>
-      </w:r>
-      <w:r>
-        <w:rPr>
-          <w:i/>
-          <w:iCs/>
-        </w:rPr>
-        <w:t xml:space="preserve">a priori</w:t>
-      </w:r>
-      <w:r>
-        <w:t xml:space="preserve"> </w:t>
-      </w:r>
-      <w:r>
-        <w:t xml:space="preserve">(e.g., P[OR] &gt; 1.2 or P[Mean Difference] &lt; -5 points); and 4) percentage of the posterior distribution falling outside a predefined region of practical equivalence (ROPE; e.g., 0.95 &lt; OR &lt; 1.05, or ±2 points for mean differences). We defined a substantial difference as an OR &gt; 1.2, which represents a small but clinically meaningful difference in effect size commonly utilized in epidemiological research. The full rationale for these thresholds is detailed in the supplementary material.</w:t>
+        <w:t xml:space="preserve">For the effect of hemispheric laterality, we report the following metrics derived from the marginalized posterior distributions: 1) the median posterior effect size with 95% credible intervals (CrI); 2) the probability of any directional difference; 3) the probability of a substantial difference defined a priori; and 4) the percentage of the posterior distribution falling outside a predefined region of practical equivalence (ROPE).</w:t>
+      </w:r>
+    </w:p>
+    <w:p>
+      <w:pPr>
+        <w:pStyle w:val="BodyText"/>
+      </w:pPr>
+      <w:r>
+        <w:t xml:space="preserve">Effect sizes are reported as marginal odds ratios (OR) for binary and ordinal models, marginal incidence rate ratios (IRR) for the count component of the negative binomial models, and average marginal expected mean differences on the original 0–100 scale for the EQ-VAS (derived via G-computation). We defined a substantial difference as an odds ratio (OR) &gt; 1.2 (or a mean difference of 5 points for the Euro VAS). In the context of invasive procedures such as hemicraniectomy or hematoma evacuation, we posited that a 20% relative shift in treatment odds represents a minimum threshold that would meaningfully impact clinical and shared decision-making. The full rationale for these thresholds and the ROPE bounds for ORs and IRRs are detailed in the Supplementary Appendix.</w:t>
       </w:r>
     </w:p>
     <w:bookmarkEnd w:id="14"/>
@@ -364,7 +364,7 @@
         <w:pStyle w:val="FirstParagraph"/>
       </w:pPr>
       <w:r>
-        <w:t xml:space="preserve">Baseline covariates used in model adjustment had minimal missingness. Missingness for 90-day outcomes was more substantial but was balanced across laterality groups and key covariates. Detailed missingness rates by laterality group, assessments supporting the Missing at Random (MAR) assumption, and imputation diagnostics are reported in the Supplementary Appendix.</w:t>
+        <w:t xml:space="preserve">Baseline covariates used in model adjustment (e.g., age, GCS, ICH volume) had minimal missingness (&lt; 1%). Missingness for 90-day functional outcomes was more substantial but was balanced across laterality groups. Detailed missingness rates, assessments supporting the Missing at Random (MAR) assumption, and imputation diagnostics are reported in the Supplementary Appendix.</w:t>
       </w:r>
     </w:p>
     <w:p>
@@ -372,34 +372,7 @@
         <w:pStyle w:val="BodyText"/>
       </w:pPr>
       <w:r>
-        <w:t xml:space="preserve">Our primary analysis used multiple imputation by chained equations (MICE) to address missing outcome data, generating 20 imputed datasets with the</w:t>
-      </w:r>
-      <w:r>
-        <w:t xml:space="preserve"> </w:t>
-      </w:r>
-      <w:r>
-        <w:rPr>
-          <w:rStyle w:val="VerbatimChar"/>
-        </w:rPr>
-        <w:t xml:space="preserve">mice</w:t>
-      </w:r>
-      <w:r>
-        <w:t xml:space="preserve"> </w:t>
-      </w:r>
-      <w:r>
-        <w:t xml:space="preserve">package.</w:t>
-      </w:r>
-      <w:r>
-        <w:rPr>
-          <w:vertAlign w:val="superscript"/>
-        </w:rPr>
-        <w:t xml:space="preserve">22</w:t>
-      </w:r>
-      <w:r>
-        <w:t xml:space="preserve"> </w:t>
-      </w:r>
-      <w:r>
-        <w:t xml:space="preserve">Imputation models included all analysis covariates and outcomes to preserve inter-variable relationships under the MAR assumption. Predictive mean matching was used for continuous and ordinal variables, logistic regression for binary variables, and polytomous regression for nominal categorical variables. Each Bayesian model was fitted separately to each imputed dataset, and posterior draws were pooled across imputations to produce the reported estimates and CrI.</w:t>
+        <w:t xml:space="preserve">Our primary analysis for 90-day functional outcomes used multiple imputation by chained equations (MICE) to address missing data, generating 20 imputed datasets using the mice package. Imputation models included all analysis covariates and all primary and secondary outcomes. Including all functional outcomes (e.g., mRS and EuroQOL domains) in the imputation equations allowed them to serve as highly informative auxiliary variables for one another, optimizing the imputation of missing outcome data. Predictive mean matching was used for continuous and ordinal variables, logistic regression for binary variables, and polytomous regression for nominal variables. Each Bayesian model was fitted separately to each imputed dataset, and posterior draws were pooled across imputations to produce the reported estimates and CrI.</w:t>
       </w:r>
     </w:p>
     <w:p>
@@ -407,7 +380,7 @@
         <w:pStyle w:val="BodyText"/>
       </w:pPr>
       <w:r>
-        <w:t xml:space="preserve">In addition to the missing data analysis, we analyzed our models using the four sets of prior distributions described above, which allowed us to examine the influence of prior choices on the posterior distributions. To explore potential effect modification, we also fitted models that included formal interaction terms between hemispheric laterality and ICH location and between laterality and study source. Subgroup-specific aORs and interaction Ratio of Odds Ratios (ROR) with 95% CrI were computed from these models to evaluate whether the laterality effect differed across subgroups. Further details on the methods and results of these sensitivity and subgroup analyses are presented in the Supplementary Appendix.</w:t>
+        <w:t xml:space="preserve">In addition to the missing data analysis, we analyzed our models using the four sets of prior distributions described above. To evaluate potential effect modification on acute care decisions, we fitted models containing formal interaction terms between hemispheric laterality and ICH location, and laterality and study source. Because missingness in baseline covariates and acute surgical outcomes was negligible, these exploratory subgroup interaction models—as well as a prespecified sensitivity analysis for all outcomes—were fitted to complete-case data (excluding patients missing the specific outcome being modeled) for computational efficiency. Subgroup-specific aORs and interaction Ratio of Odds Ratios (ROR) with 95% CrI were computed to evaluate heterogeneity.</w:t>
       </w:r>
     </w:p>
     <w:bookmarkEnd w:id="15"/>
@@ -494,7 +467,7 @@
         <w:pStyle w:val="BodyText"/>
       </w:pPr>
       <w:r>
-        <w:t xml:space="preserve">Figure 1 displays the covariate-adjusted marginal predicted probabilities of neurosurgical intervention and the prior sensitivity analysis. Panel A shows the posterior distributions of covariate-adjusted absolute predicted probabilities of neurosurgical intervention for left and right hemispheric ICH under the neutral prior (left hemisphere: 4.86%, 95% CrI 3.98–5.84%; right hemisphere: 8.04%, 95% CrI 6.93–9.23%). Panel B shows the posterior distributions of the absolute probability difference (Right − Left) across all four prior specifications. Under the neutral prior, the median probability difference was 3.18 percentage points (95% CrI 1.75–4.62), with P(Right &gt; Left) exceeding 99.9%. Corresponding estimates were 2.21 percentage points (95% CrI 0.97–3.45) under the left-hemisphere prior, 2.84 percentage points (95% CrI 1.60–4.09) under the right-hemisphere prior, and 3.38 percentage points (95% CrI 1.90–4.89) under the flat prior, with P(Right &gt; Left) exceeding 99.9% under all specifications.</w:t>
+        <w:t xml:space="preserve">Figure 1 displays the covariate-adjusted marginal predicted probabilities of neurosurgical intervention and the prior sensitivity analysis. Panel A shows the posterior distributions of covariate-adjusted absolute predicted probabilities of neurosurgical intervention for left and right hemispheric ICH under the neutral prior (left hemisphere: 4.86%, 95% CrI 3.98–5.84%; right hemisphere: 8.04%, 95% CrI 6.93–9.23%). Panel B shows the posterior distributions of the absolute probability difference (Right − Left) across all four prior specifications. Under the neutral prior, the median probability difference was 3.18 percentage points (95% CrI 1.75–4.62), with P(Right &gt; Left) exceeding 99.9%. Corresponding estimates were 2.21 percentage points (95% CrI 0.97–3.45) under the left-hemisphere prior, 2.84 percentage points (95% CrI 1.60–4.09) under the right-hemisphere prior, and 3.38 percentage points (95% CrI 1.90–4.89) under the diffuse prior, with P(Right &gt; Left) exceeding 99.9% under all specifications.</w:t>
       </w:r>
     </w:p>
     <w:p>
@@ -502,7 +475,7 @@
         <w:pStyle w:val="BodyText"/>
       </w:pPr>
       <w:r>
-        <w:t xml:space="preserve">In a sensitivity analysis restricted to the ATACH-2 cohort, inclusion of a random intercept for hospital site modestly attenuated the point estimate and shifted the credible interval toward the null but did not materially alter the direction or strength of the association. Details are available in the Supplementary Appendix.</w:t>
+        <w:t xml:space="preserve">In a sensitivity analysis restricted to the ATACH-2 cohort, a random intercept for the enrolling hospital was included to account for site-level clustering. The base model yielded an adjusted odds ratio of 2.23 (95% CrI: 1.31–3.76). With the inclusion of the site-level random effect, the adjusted odds ratio was 1.86 (95% CrI: 1.10–3.16). For this hierarchical model, the posterior probability of any directional effect (aOR &gt; 1) was 99%, the posterior probability of an aOR &gt; 1.2 was 95%, and 1% of the posterior distribution fell within the region of practical equivalence. Details are available in the Supplementary Appendix.</w:t>
       </w:r>
     </w:p>
     <w:bookmarkEnd w:id="21"/>
@@ -618,7 +591,7 @@
         <w:rPr>
           <w:vertAlign w:val="superscript"/>
         </w:rPr>
-        <w:t xml:space="preserve">23–25</w:t>
+        <w:t xml:space="preserve">22–24</w:t>
       </w:r>
       <w:r>
         <w:t xml:space="preserve"> </w:t>
@@ -658,7 +631,7 @@
         <w:rPr>
           <w:vertAlign w:val="superscript"/>
         </w:rPr>
-        <w:t xml:space="preserve">26,27</w:t>
+        <w:t xml:space="preserve">25,26</w:t>
       </w:r>
       <w:r>
         <w:t xml:space="preserve"> </w:t>
@@ -670,7 +643,7 @@
         <w:rPr>
           <w:vertAlign w:val="superscript"/>
         </w:rPr>
-        <w:t xml:space="preserve">28</w:t>
+        <w:t xml:space="preserve">27</w:t>
       </w:r>
     </w:p>
     <w:p>
@@ -713,8 +686,81 @@
         <w:br w:type="page"/>
       </w:r>
     </w:p>
+    <w:p>
+      <w:pPr>
+        <w:pStyle w:val="BodyText"/>
+      </w:pPr>
+      <w:r>
+        <w:t xml:space="preserve">##Acknowledgments</w:t>
+      </w:r>
+    </w:p>
+    <w:p>
+      <w:pPr>
+        <w:pStyle w:val="BodyText"/>
+      </w:pPr>
+      <w:r>
+        <w:rPr>
+          <w:b/>
+          <w:bCs/>
+        </w:rPr>
+        <w:t xml:space="preserve">Funding/support</w:t>
+      </w:r>
+      <w:r>
+        <w:t xml:space="preserve">: The ATACH-2 clinical trial and ERICH prospective observational study were funded by the National Institute of Neurological Disorders and Stroke (NINDS).</w:t>
+      </w:r>
+    </w:p>
+    <w:p>
+      <w:pPr>
+        <w:pStyle w:val="BodyText"/>
+      </w:pPr>
+      <w:r>
+        <w:rPr>
+          <w:b/>
+          <w:bCs/>
+        </w:rPr>
+        <w:t xml:space="preserve">Role of the Funder/Sponsor</w:t>
+      </w:r>
+      <w:r>
+        <w:t xml:space="preserve">: The study was supported in part by grant 5U01NS062091, NINDS and grant 5U01NS069763, NINDS. The sponsor had no role in the design and conduct of the current study.</w:t>
+      </w:r>
+    </w:p>
+    <w:p>
+      <w:pPr>
+        <w:pStyle w:val="BodyText"/>
+      </w:pPr>
+      <w:r>
+        <w:rPr>
+          <w:b/>
+          <w:bCs/>
+        </w:rPr>
+        <w:t xml:space="preserve">Conflict of Interest Disclosures</w:t>
+      </w:r>
+      <w:r>
+        <w:t xml:space="preserve">: Dr. Magun discloses being a shareholder in Inovio Pharmaceuticals and StageZero Life Sciences.</w:t>
+      </w:r>
+    </w:p>
+    <w:p>
+      <w:pPr>
+        <w:pStyle w:val="BodyText"/>
+      </w:pPr>
+      <w:r>
+        <w:rPr>
+          <w:b/>
+          <w:bCs/>
+        </w:rPr>
+        <w:t xml:space="preserve">Additional Contributions</w:t>
+      </w:r>
+      <w:r>
+        <w:t xml:space="preserve">: We thank all investigators for their efforts in conducting the ATACH-2 trial and ERICH study and thank all study participants for enrolling.</w:t>
+      </w:r>
+    </w:p>
+    <w:p>
+      <w:r>
+        <w:br w:type="page"/>
+      </w:r>
+    </w:p>
     <w:bookmarkEnd w:id="26"/>
-    <w:bookmarkStart w:id="82" w:name="references"/>
+    <w:bookmarkStart w:id="80" w:name="references"/>
     <w:p>
       <w:pPr>
         <w:pStyle w:val="Heading2"/>
@@ -723,7 +769,7 @@
         <w:t xml:space="preserve">References</w:t>
       </w:r>
     </w:p>
-    <w:bookmarkStart w:id="81" w:name="refs"/>
+    <w:bookmarkStart w:id="79" w:name="refs"/>
     <w:bookmarkStart w:id="28" w:name="ref-hemphillICHScoreSimple2001"/>
     <w:p>
       <w:pPr>
@@ -2395,7 +2441,7 @@
       </w:r>
     </w:p>
     <w:bookmarkEnd w:id="66"/>
-    <w:bookmarkStart w:id="68" w:name="ref-buurenMiceMultivariateImputation2011"/>
+    <w:bookmarkStart w:id="68" w:name="X7a4c185c12dbffdfd1dae8f81a04f8589333b44"/>
     <w:p>
       <w:pPr>
         <w:pStyle w:val="Bibliography"/>
@@ -2410,137 +2456,12 @@
         <w:t xml:space="preserve">	</w:t>
       </w:r>
       <w:r>
-        <w:t xml:space="preserve">Buuren SV, Groothuis-Oudshoorn K.</w:t>
+        <w:t xml:space="preserve">Neugebauer H, Creutzfeldt CJ, Hemphill JC, Heuschmann PU, Jüttler E.</w:t>
       </w:r>
       <w:r>
         <w:t xml:space="preserve"> </w:t>
       </w:r>
       <w:hyperlink r:id="rId67">
-        <w:r>
-          <w:rPr>
-            <w:rStyle w:val="Hyperlink"/>
-            <w:b/>
-            <w:bCs/>
-          </w:rPr>
-          <w:t xml:space="preserve">Mice</w:t>
-        </w:r>
-        <w:r>
-          <w:rPr>
-            <w:rStyle w:val="Hyperlink"/>
-          </w:rPr>
-          <w:t xml:space="preserve"> </w:t>
-        </w:r>
-        <w:r>
-          <w:rPr>
-            <w:rStyle w:val="Hyperlink"/>
-          </w:rPr>
-          <w:t xml:space="preserve">:</w:t>
-        </w:r>
-        <w:r>
-          <w:rPr>
-            <w:rStyle w:val="Hyperlink"/>
-          </w:rPr>
-          <w:t xml:space="preserve"> </w:t>
-        </w:r>
-        <w:r>
-          <w:rPr>
-            <w:rStyle w:val="Hyperlink"/>
-          </w:rPr>
-          <w:t xml:space="preserve">Multivariate Imputation</w:t>
-        </w:r>
-        <w:r>
-          <w:rPr>
-            <w:rStyle w:val="Hyperlink"/>
-          </w:rPr>
-          <w:t xml:space="preserve"> </w:t>
-        </w:r>
-        <w:r>
-          <w:rPr>
-            <w:rStyle w:val="Hyperlink"/>
-          </w:rPr>
-          <w:t xml:space="preserve">by</w:t>
-        </w:r>
-        <w:r>
-          <w:rPr>
-            <w:rStyle w:val="Hyperlink"/>
-          </w:rPr>
-          <w:t xml:space="preserve"> </w:t>
-        </w:r>
-        <w:r>
-          <w:rPr>
-            <w:rStyle w:val="Hyperlink"/>
-          </w:rPr>
-          <w:t xml:space="preserve">Chained Equations</w:t>
-        </w:r>
-        <w:r>
-          <w:rPr>
-            <w:rStyle w:val="Hyperlink"/>
-          </w:rPr>
-          <w:t xml:space="preserve"> </w:t>
-        </w:r>
-        <w:r>
-          <w:rPr>
-            <w:rStyle w:val="Hyperlink"/>
-          </w:rPr>
-          <w:t xml:space="preserve">in</w:t>
-        </w:r>
-        <w:r>
-          <w:rPr>
-            <w:rStyle w:val="Hyperlink"/>
-          </w:rPr>
-          <w:t xml:space="preserve"> </w:t>
-        </w:r>
-        <w:r>
-          <w:rPr>
-            <w:rStyle w:val="Hyperlink"/>
-            <w:i/>
-            <w:iCs/>
-          </w:rPr>
-          <w:t xml:space="preserve">R</w:t>
-        </w:r>
-      </w:hyperlink>
-      <w:r>
-        <w:t xml:space="preserve">.</w:t>
-      </w:r>
-      <w:r>
-        <w:t xml:space="preserve"> </w:t>
-      </w:r>
-      <w:r>
-        <w:rPr>
-          <w:i/>
-          <w:iCs/>
-        </w:rPr>
-        <w:t xml:space="preserve">Journal of Statistical Software</w:t>
-      </w:r>
-      <w:r>
-        <w:t xml:space="preserve">. 2011;45.</w:t>
-      </w:r>
-      <w:r>
-        <w:t xml:space="preserve"> </w:t>
-      </w:r>
-    </w:p>
-    <w:bookmarkEnd w:id="68"/>
-    <w:bookmarkStart w:id="70" w:name="X7a4c185c12dbffdfd1dae8f81a04f8589333b44"/>
-    <w:p>
-      <w:pPr>
-        <w:pStyle w:val="Bibliography"/>
-      </w:pPr>
-      <w:r>
-        <w:t xml:space="preserve">23.</w:t>
-      </w:r>
-      <w:r>
-        <w:t xml:space="preserve"> </w:t>
-      </w:r>
-      <w:r>
-        <w:t xml:space="preserve">	</w:t>
-      </w:r>
-      <w:r>
-        <w:t xml:space="preserve">Neugebauer H, Creutzfeldt CJ, Hemphill JC, Heuschmann PU, Jüttler E.</w:t>
-      </w:r>
-      <w:r>
-        <w:t xml:space="preserve"> </w:t>
-      </w:r>
-      <w:hyperlink r:id="rId69">
         <w:r>
           <w:rPr>
             <w:rStyle w:val="Hyperlink"/>
@@ -2658,14 +2579,14 @@
         <w:t xml:space="preserve"> </w:t>
       </w:r>
     </w:p>
-    <w:bookmarkEnd w:id="70"/>
-    <w:bookmarkStart w:id="72" w:name="X891c4e92ab559843651bf648920cce7507bc2b7"/>
+    <w:bookmarkEnd w:id="68"/>
+    <w:bookmarkStart w:id="70" w:name="X891c4e92ab559843651bf648920cce7507bc2b7"/>
     <w:p>
       <w:pPr>
         <w:pStyle w:val="Bibliography"/>
       </w:pPr>
       <w:r>
-        <w:t xml:space="preserve">24.</w:t>
+        <w:t xml:space="preserve">23.</w:t>
       </w:r>
       <w:r>
         <w:t xml:space="preserve"> </w:t>
@@ -2679,7 +2600,7 @@
       <w:r>
         <w:t xml:space="preserve"> </w:t>
       </w:r>
-      <w:hyperlink r:id="rId71">
+      <w:hyperlink r:id="rId69">
         <w:r>
           <w:rPr>
             <w:rStyle w:val="Hyperlink"/>
@@ -2791,14 +2712,14 @@
         <w:t xml:space="preserve"> </w:t>
       </w:r>
     </w:p>
-    <w:bookmarkEnd w:id="72"/>
-    <w:bookmarkStart w:id="74" w:name="X43fe660b2331ec7445277f5239a44c6686e4cba"/>
+    <w:bookmarkEnd w:id="70"/>
+    <w:bookmarkStart w:id="72" w:name="X43fe660b2331ec7445277f5239a44c6686e4cba"/>
     <w:p>
       <w:pPr>
         <w:pStyle w:val="Bibliography"/>
       </w:pPr>
       <w:r>
-        <w:t xml:space="preserve">25.</w:t>
+        <w:t xml:space="preserve">24.</w:t>
       </w:r>
       <w:r>
         <w:t xml:space="preserve"> </w:t>
@@ -2812,7 +2733,7 @@
       <w:r>
         <w:t xml:space="preserve"> </w:t>
       </w:r>
-      <w:hyperlink r:id="rId73">
+      <w:hyperlink r:id="rId71">
         <w:r>
           <w:rPr>
             <w:rStyle w:val="Hyperlink"/>
@@ -2900,14 +2821,14 @@
         <w:t xml:space="preserve"> </w:t>
       </w:r>
     </w:p>
-    <w:bookmarkEnd w:id="74"/>
-    <w:bookmarkStart w:id="76" w:name="Xedc2e0f0a31863d3317a2038cd4180ef4585a94"/>
+    <w:bookmarkEnd w:id="72"/>
+    <w:bookmarkStart w:id="74" w:name="Xedc2e0f0a31863d3317a2038cd4180ef4585a94"/>
     <w:p>
       <w:pPr>
         <w:pStyle w:val="Bibliography"/>
       </w:pPr>
       <w:r>
-        <w:t xml:space="preserve">26.</w:t>
+        <w:t xml:space="preserve">25.</w:t>
       </w:r>
       <w:r>
         <w:t xml:space="preserve"> </w:t>
@@ -2921,7 +2842,7 @@
       <w:r>
         <w:t xml:space="preserve"> </w:t>
       </w:r>
-      <w:hyperlink r:id="rId75">
+      <w:hyperlink r:id="rId73">
         <w:r>
           <w:rPr>
             <w:rStyle w:val="Hyperlink"/>
@@ -2949,14 +2870,14 @@
         <w:t xml:space="preserve"> </w:t>
       </w:r>
     </w:p>
-    <w:bookmarkEnd w:id="76"/>
-    <w:bookmarkStart w:id="78" w:name="ref-almekhlafiStrokeLateralityDid2019"/>
+    <w:bookmarkEnd w:id="74"/>
+    <w:bookmarkStart w:id="76" w:name="ref-almekhlafiStrokeLateralityDid2019"/>
     <w:p>
       <w:pPr>
         <w:pStyle w:val="Bibliography"/>
       </w:pPr>
       <w:r>
-        <w:t xml:space="preserve">27.</w:t>
+        <w:t xml:space="preserve">26.</w:t>
       </w:r>
       <w:r>
         <w:t xml:space="preserve"> </w:t>
@@ -2970,7 +2891,7 @@
       <w:r>
         <w:t xml:space="preserve"> </w:t>
       </w:r>
-      <w:hyperlink r:id="rId77">
+      <w:hyperlink r:id="rId75">
         <w:r>
           <w:rPr>
             <w:rStyle w:val="Hyperlink"/>
@@ -3082,14 +3003,14 @@
         <w:t xml:space="preserve"> </w:t>
       </w:r>
     </w:p>
-    <w:bookmarkEnd w:id="78"/>
-    <w:bookmarkStart w:id="80" w:name="X3c0ca5277cb27ba7098a1b20322a338d87eb9a8"/>
+    <w:bookmarkEnd w:id="76"/>
+    <w:bookmarkStart w:id="78" w:name="X3c0ca5277cb27ba7098a1b20322a338d87eb9a8"/>
     <w:p>
       <w:pPr>
         <w:pStyle w:val="Bibliography"/>
       </w:pPr>
       <w:r>
-        <w:t xml:space="preserve">28.</w:t>
+        <w:t xml:space="preserve">27.</w:t>
       </w:r>
       <w:r>
         <w:t xml:space="preserve"> </w:t>
@@ -3103,7 +3024,7 @@
       <w:r>
         <w:t xml:space="preserve"> </w:t>
       </w:r>
-      <w:hyperlink r:id="rId79">
+      <w:hyperlink r:id="rId77">
         <w:r>
           <w:rPr>
             <w:rStyle w:val="Hyperlink"/>
@@ -3266,15 +3187,15 @@
         <w:t xml:space="preserve"> </w:t>
       </w:r>
     </w:p>
+    <w:bookmarkEnd w:id="78"/>
+    <w:bookmarkEnd w:id="79"/>
+    <w:p>
+      <w:r>
+        <w:br w:type="page"/>
+      </w:r>
+    </w:p>
     <w:bookmarkEnd w:id="80"/>
-    <w:bookmarkEnd w:id="81"/>
-    <w:p>
-      <w:r>
-        <w:br w:type="page"/>
-      </w:r>
-    </w:p>
-    <w:bookmarkEnd w:id="82"/>
-    <w:bookmarkStart w:id="86" w:name="tables"/>
+    <w:bookmarkStart w:id="84" w:name="tables"/>
     <w:p>
       <w:pPr>
         <w:pStyle w:val="Heading2"/>
@@ -3296,7 +3217,7 @@
       <w:tr>
         <w:tc>
           <w:tcPr/>
-          <w:bookmarkStart w:id="83" w:name="tbl-1"/>
+          <w:bookmarkStart w:id="81" w:name="tbl-1"/>
           <w:p>
             <w:pPr>
               <w:jc w:val="center"/>
@@ -7423,7 +7344,7 @@
               </w:tc>
             </w:tr>
           </w:tbl>
-          <w:bookmarkEnd w:id="83"/>
+          <w:bookmarkEnd w:id="81"/>
         </w:tc>
       </w:tr>
     </w:tbl>
@@ -7445,7 +7366,7 @@
       <w:tr>
         <w:tc>
           <w:tcPr/>
-          <w:bookmarkStart w:id="84" w:name="tbl-2"/>
+          <w:bookmarkStart w:id="82" w:name="tbl-2"/>
           <w:p>
             <w:pPr>
               <w:jc w:val="center"/>
@@ -8883,7 +8804,7 @@
               </w:tc>
             </w:tr>
           </w:tbl>
-          <w:bookmarkEnd w:id="84"/>
+          <w:bookmarkEnd w:id="82"/>
         </w:tc>
       </w:tr>
     </w:tbl>
@@ -8905,7 +8826,7 @@
       <w:tr>
         <w:tc>
           <w:tcPr/>
-          <w:bookmarkStart w:id="85" w:name="tbl-3"/>
+          <w:bookmarkStart w:id="83" w:name="tbl-3"/>
           <w:p>
             <w:pPr>
               <w:jc w:val="center"/>
@@ -9955,7 +9876,7 @@
               </w:tc>
             </w:tr>
           </w:tbl>
-          <w:bookmarkEnd w:id="85"/>
+          <w:bookmarkEnd w:id="83"/>
         </w:tc>
       </w:tr>
     </w:tbl>
@@ -9964,8 +9885,8 @@
         <w:br w:type="page"/>
       </w:r>
     </w:p>
-    <w:bookmarkEnd w:id="86"/>
-    <w:bookmarkStart w:id="95" w:name="figures"/>
+    <w:bookmarkEnd w:id="84"/>
+    <w:bookmarkStart w:id="93" w:name="figures"/>
     <w:p>
       <w:pPr>
         <w:pStyle w:val="Heading2"/>
@@ -9987,7 +9908,7 @@
       <w:tr>
         <w:tc>
           <w:tcPr/>
-          <w:bookmarkStart w:id="90" w:name="fig-1"/>
+          <w:bookmarkStart w:id="88" w:name="fig-1"/>
           <w:p>
             <w:pPr>
               <w:pStyle w:val="Compact"/>
@@ -9998,18 +9919,18 @@
                 <wp:inline>
                   <wp:extent cx="5943600" cy="5943600"/>
                   <wp:effectExtent b="0" l="0" r="0" t="0"/>
-                  <wp:docPr descr="" title="" id="88" name="Picture"/>
+                  <wp:docPr descr="" title="" id="86" name="Picture"/>
                   <a:graphic>
                     <a:graphicData uri="http://schemas.openxmlformats.org/drawingml/2006/picture">
                       <pic:pic>
                         <pic:nvPicPr>
-                          <pic:cNvPr descr="../figures/figure_sensitivity_neurosurgery_evac.pdf" id="89" name="Picture"/>
+                          <pic:cNvPr descr="../figures/figure_sensitivity_neurosurgery_evac.pdf" id="87" name="Picture"/>
                           <pic:cNvPicPr>
                             <a:picLocks noChangeArrowheads="1" noChangeAspect="1"/>
                           </pic:cNvPicPr>
                         </pic:nvPicPr>
                         <pic:blipFill>
-                          <a:blip r:embed="rId87"/>
+                          <a:blip r:embed="rId85"/>
                           <a:stretch>
                             <a:fillRect/>
                           </a:stretch>
@@ -10049,7 +9970,7 @@
               <w:t xml:space="preserve">Figure 1: Prior Sensitivity Analysis for Neurosurgical Intervention</w:t>
             </w:r>
           </w:p>
-          <w:bookmarkEnd w:id="90"/>
+          <w:bookmarkEnd w:id="88"/>
         </w:tc>
       </w:tr>
     </w:tbl>
@@ -10074,7 +9995,7 @@
       <w:tr>
         <w:tc>
           <w:tcPr/>
-          <w:bookmarkStart w:id="94" w:name="fig-2"/>
+          <w:bookmarkStart w:id="92" w:name="fig-2"/>
           <w:p>
             <w:pPr>
               <w:pStyle w:val="Compact"/>
@@ -10085,18 +10006,18 @@
                 <wp:inline>
                   <wp:extent cx="5943600" cy="3820885"/>
                   <wp:effectExtent b="0" l="0" r="0" t="0"/>
-                  <wp:docPr descr="" title="" id="92" name="Picture"/>
+                  <wp:docPr descr="" title="" id="90" name="Picture"/>
                   <a:graphic>
                     <a:graphicData uri="http://schemas.openxmlformats.org/drawingml/2006/picture">
                       <pic:pic>
                         <pic:nvPicPr>
-                          <pic:cNvPr descr="../figures/mrs/figure_mrs_main_neutral_adjusted.pdf" id="93" name="Picture"/>
+                          <pic:cNvPr descr="../figures/mrs/figure_mrs_main_neutral_adjusted.pdf" id="91" name="Picture"/>
                           <pic:cNvPicPr>
                             <a:picLocks noChangeArrowheads="1" noChangeAspect="1"/>
                           </pic:cNvPicPr>
                         </pic:nvPicPr>
                         <pic:blipFill>
-                          <a:blip r:embed="rId91"/>
+                          <a:blip r:embed="rId89"/>
                           <a:stretch>
                             <a:fillRect/>
                           </a:stretch>
@@ -10136,11 +10057,11 @@
               <w:t xml:space="preserve">Figure 2: modified Rankin Score at 90 days Stratified by ICH Laterality</w:t>
             </w:r>
           </w:p>
-          <w:bookmarkEnd w:id="94"/>
+          <w:bookmarkEnd w:id="92"/>
         </w:tc>
       </w:tr>
     </w:tbl>
-    <w:bookmarkEnd w:id="95"/>
+    <w:bookmarkEnd w:id="93"/>
     <w:sectPr>
       <w:footnotePr>
         <w:numFmt w:val="decimal"/>

</xml_diff>

<commit_message>
chore: restructure manuscript bibliography files and add supplementary document metadata
</commit_message>
<xml_diff>
--- a/manuscripts/manuscript.docx
+++ b/manuscripts/manuscript.docx
@@ -10,13 +10,13 @@
         <w:t xml:space="preserve">Association of Hemispheric Laterality with Neurosurgical Intervention in Intracerebral Hemorrhage: A Post-Hoc Bayesian Analysis of ATACH-2 and ERICH</w:t>
       </w:r>
     </w:p>
-    <w:bookmarkStart w:id="9" w:name="introduction"/>
+    <w:bookmarkStart w:id="9" w:name="abstract"/>
     <w:p>
       <w:pPr>
         <w:pStyle w:val="Heading2"/>
       </w:pPr>
       <w:r>
-        <w:t xml:space="preserve">Introduction</w:t>
+        <w:t xml:space="preserve">Abstract</w:t>
       </w:r>
     </w:p>
     <w:p>
@@ -24,31 +24,14 @@
         <w:pStyle w:val="FirstParagraph"/>
       </w:pPr>
       <w:r>
-        <w:t xml:space="preserve">Intracerebral hemorrhage (ICH) remains a challenging disease, marked by its sudden onset, morbidity, and mortality.</w:t>
-      </w:r>
-      <w:r>
         <w:rPr>
-          <w:vertAlign w:val="superscript"/>
+          <w:b/>
+          <w:bCs/>
         </w:rPr>
-        <w:t xml:space="preserve">1,2</w:t>
-      </w:r>
-      <w:r>
-        <w:t xml:space="preserve"> </w:t>
-      </w:r>
-      <w:r>
-        <w:t xml:space="preserve">While management of ischemic stroke has advanced considerably over the last decade, the acute management of ICH remains limited to blood pressure control, coagulopathy reversal, and perhaps surgical evacuation of hemorrhage.</w:t>
-      </w:r>
-      <w:r>
-        <w:rPr>
-          <w:vertAlign w:val="superscript"/>
-        </w:rPr>
-        <w:t xml:space="preserve">3,4</w:t>
-      </w:r>
-      <w:r>
-        <w:t xml:space="preserve"> </w:t>
-      </w:r>
-      <w:r>
-        <w:t xml:space="preserve">These efforts have focused on reducing mortality and preventing additional morbidity due to secondary injury.</w:t>
+        <w:t xml:space="preserve">Background</w:t>
+      </w:r>
+      <w:r>
+        <w:t xml:space="preserve">: Hemispheric laterality influences clinical management in stroke. Given the increasing enthusiasm for surgical management of intracerebral hemorrhage (ICH), we evaluated the association of hemispheric lateralization with the likelihood of receiving neurosurgical intervention and subsequent 90-day functional outcomes.</w:t>
       </w:r>
     </w:p>
     <w:p>
@@ -56,7 +39,14 @@
         <w:pStyle w:val="BodyText"/>
       </w:pPr>
       <w:r>
-        <w:t xml:space="preserve">Clinical presentations for patients with stroke are varied based on the hemisphere affected, where hemispheric dominance dictates cognitive processing, attention, language, and emotional responses. Consequently, when confronted with ICH, the specific hemisphere affected can profoundly influence not only the clinical presentation but also management decisions and prognostic outcomes.</w:t>
+        <w:rPr>
+          <w:b/>
+          <w:bCs/>
+        </w:rPr>
+        <w:t xml:space="preserve">Methods</w:t>
+      </w:r>
+      <w:r>
+        <w:t xml:space="preserve">: This post-hoc analysis included 3477 patients with supratentorial ICH from the ATACH-2 and ERICH studies. The primary outcome was neurosurgical intervention (hematoma evacuation, decompressive craniectomy, or other craniotomy). Secondary outcomes included external ventricular drain (EVD) placement, 90-day modified Rankin Scale (mRS), and EuroQOL domains. Hierarchical Bayesian regression models were adjusted for age, admission Glasgow Coma Scale, ICH location, ICH volume, and intraventricular hemorrhage.</w:t>
       </w:r>
     </w:p>
     <w:p>
@@ -64,25 +54,14 @@
         <w:pStyle w:val="BodyText"/>
       </w:pPr>
       <w:r>
-        <w:t xml:space="preserve">Previous research involving patients with ischemic stroke provide evidence that those with right hemispheric injury present later to the hospital and may not be treated as frequently with thrombolytic therapy.</w:t>
-      </w:r>
-      <w:r>
         <w:rPr>
-          <w:vertAlign w:val="superscript"/>
+          <w:b/>
+          <w:bCs/>
         </w:rPr>
-        <w:t xml:space="preserve">5–8</w:t>
-      </w:r>
-      <w:r>
-        <w:t xml:space="preserve"> </w:t>
-      </w:r>
-      <w:r>
-        <w:t xml:space="preserve">Some practitioners hesitate to offer decompressive craniectomy in patients with left dominant-hemispheric ischemic infarcts despite literature demonstrating that long-term functional outcomes and health-related quality of life (HRQoL) are equivalent if not better for patients with left hemispheric injuries.</w:t>
-      </w:r>
-      <w:r>
-        <w:rPr>
-          <w:vertAlign w:val="superscript"/>
-        </w:rPr>
-        <w:t xml:space="preserve">9–12</w:t>
+        <w:t xml:space="preserve">Results</w:t>
+      </w:r>
+      <w:r>
+        <w:t xml:space="preserve">: Of 3477 patients, right hemispheric ICH was associated with a higher likelihood of receiving neurosurgical intervention (aOR 1.65, 95% CrI 1.28–2.14) and EVD placement (aOR 1.22, 95% CrI 1.04–1.44) compared to left hemispheric ICH. This association was directionally consistent across ICH locations, study cohorts, and prior specifications. Despite the lower rates of aggressive surgical management, patients with left hemispheric ICH demonstrated similar 90-day functional outcomes, exhibiting equivalent mRS scores and potentially better outcomes in specific health-related quality of life domains.</w:t>
       </w:r>
     </w:p>
     <w:p>
@@ -90,35 +69,44 @@
         <w:pStyle w:val="BodyText"/>
       </w:pPr>
       <w:r>
-        <w:t xml:space="preserve">Amidst an increasing enthusiasm for surgical management of ICH</w:t>
-      </w:r>
-      <w:r>
         <w:rPr>
-          <w:vertAlign w:val="superscript"/>
+          <w:b/>
+          <w:bCs/>
         </w:rPr>
-        <w:t xml:space="preserve">3,4,13</w:t>
-      </w:r>
-      <w:r>
-        <w:t xml:space="preserve">, it is important to understand whether hemispheric lateralization is associated with differences in surgical decision making, as has been observed for ischemic stroke. We aimed to evaluate the association of hemispheric lateralization of ICH with the likelihood of receiving neurosurgical intervention as well as with functional outcomes.</w:t>
+        <w:t xml:space="preserve">Conclusions</w:t>
+      </w:r>
+      <w:r>
+        <w:t xml:space="preserve">: Right hemispheric ICH is associated with a higher likelihood of neurosurgical intervention compared to left hemispheric ICH, though 90-day functional outcomes remain similar between groups. While these findings highlight a potential laterality-driven disparity in treatment paradigms, residual confounding from unmeasured anatomical severity and family preferences cannot be excluded. Prospective studies are needed to delineate the explicit clinical and prognostic drivers of surgical decision-making to optimize treatment allocation in ICH.</w:t>
+      </w:r>
+    </w:p>
+    <w:p>
+      <w:pPr>
+        <w:pStyle w:val="BodyText"/>
+      </w:pPr>
+      <w:r>
+        <w:rPr>
+          <w:b/>
+          <w:bCs/>
+        </w:rPr>
+        <w:t xml:space="preserve">Trial Registration</w:t>
+      </w:r>
+      <w:r>
+        <w:t xml:space="preserve">: Clinicaltrials.gov Identifier: ATACH-2, NCT01176565; ERICH, NCT01202864</w:t>
+      </w:r>
+    </w:p>
+    <w:p>
+      <w:r>
+        <w:br w:type="page"/>
       </w:r>
     </w:p>
     <w:bookmarkEnd w:id="9"/>
-    <w:bookmarkStart w:id="19" w:name="methods"/>
+    <w:bookmarkStart w:id="10" w:name="introduction"/>
     <w:p>
       <w:pPr>
         <w:pStyle w:val="Heading2"/>
       </w:pPr>
       <w:r>
-        <w:t xml:space="preserve">Methods</w:t>
-      </w:r>
-    </w:p>
-    <w:bookmarkStart w:id="10" w:name="study-design-and-participants"/>
-    <w:p>
-      <w:pPr>
-        <w:pStyle w:val="Heading3"/>
-      </w:pPr>
-      <w:r>
-        <w:t xml:space="preserve">Study Design and Participants</w:t>
+        <w:t xml:space="preserve">Introduction</w:t>
       </w:r>
     </w:p>
     <w:p>
@@ -126,16 +114,31 @@
         <w:pStyle w:val="FirstParagraph"/>
       </w:pPr>
       <w:r>
-        <w:t xml:space="preserve">We conducted a post-hoc analysis using data from two prospective studies: the Antihypertensive Treatment of Acute Cerebral Hemorrhage II (ATACH-2) trial and the Ethnic/Racial Variations of Intracerebral Hemorrhage (ERICH) study. ATACH-2 was a large, multicenter, international, open-label, blinded-endpoint randomized controlled trial that enrolled 1000 patients with ICH and randomized them to either intensive blood pressure control (110-139 mm Hg) or standard blood pressure control (140-179 mm Hg). ERICH was a large, multicenter, prospective observational study conducted patients in the United States on patients admitted with ICH, with particular emphasis on recruitment of a racially and ethnically diverse cohort. The protocols and results of both studies have been previously published elsewhere</w:t>
+        <w:t xml:space="preserve">Intracerebral hemorrhage (ICH) remains a challenging disease, marked by its sudden onset, morbidity, and mortality.</w:t>
       </w:r>
       <w:r>
         <w:rPr>
           <w:vertAlign w:val="superscript"/>
         </w:rPr>
-        <w:t xml:space="preserve">14,15</w:t>
-      </w:r>
-      <w:r>
-        <w:t xml:space="preserve">.</w:t>
+        <w:t xml:space="preserve">1,2</w:t>
+      </w:r>
+      <w:r>
+        <w:t xml:space="preserve"> </w:t>
+      </w:r>
+      <w:r>
+        <w:t xml:space="preserve">While management of ischemic stroke has advanced considerably over the last decade, the acute management of ICH remains limited to blood pressure control, coagulopathy reversal, and perhaps surgical evacuation of hemorrhage.</w:t>
+      </w:r>
+      <w:r>
+        <w:rPr>
+          <w:vertAlign w:val="superscript"/>
+        </w:rPr>
+        <w:t xml:space="preserve">3,4</w:t>
+      </w:r>
+      <w:r>
+        <w:t xml:space="preserve"> </w:t>
+      </w:r>
+      <w:r>
+        <w:t xml:space="preserve">These efforts have focused on reducing mortality and preventing additional morbidity due to secondary injury.</w:t>
       </w:r>
     </w:p>
     <w:p>
@@ -143,7 +146,7 @@
         <w:pStyle w:val="BodyText"/>
       </w:pPr>
       <w:r>
-        <w:t xml:space="preserve">We included all patients enrolled in these two studies with supratentorial location of ICH. We excluded patients with cerebellar or brainstem ICH as well as any patient with primary intraventricular hemorrhage (IVH).</w:t>
+        <w:t xml:space="preserve">Clinical presentations for patients with stroke are varied based on the hemisphere affected, where hemispheric dominance dictates cognitive processing, attention, language, and emotional responses. Consequently, when confronted with ICH, the specific hemisphere affected can profoundly influence not only the clinical presentation but also management decisions and prognostic outcomes.</w:t>
       </w:r>
     </w:p>
     <w:p>
@@ -151,17 +154,61 @@
         <w:pStyle w:val="BodyText"/>
       </w:pPr>
       <w:r>
-        <w:t xml:space="preserve">The study was approved by the institutional review board of the Wake Forest School of Medicine (IRB00098198).</w:t>
+        <w:t xml:space="preserve">Previous research involving patients with ischemic stroke provide evidence that those with right hemispheric injury present later to the hospital and may not be treated as frequently with thrombolytic therapy.</w:t>
+      </w:r>
+      <w:r>
+        <w:rPr>
+          <w:vertAlign w:val="superscript"/>
+        </w:rPr>
+        <w:t xml:space="preserve">5–8</w:t>
+      </w:r>
+      <w:r>
+        <w:t xml:space="preserve"> </w:t>
+      </w:r>
+      <w:r>
+        <w:t xml:space="preserve">Some practitioners hesitate to offer decompressive craniectomy in patients with left dominant-hemispheric ischemic infarcts despite literature demonstrating that long-term functional outcomes and health-related quality of life (HRQoL) are equivalent if not better for patients with left hemispheric injuries.</w:t>
+      </w:r>
+      <w:r>
+        <w:rPr>
+          <w:vertAlign w:val="superscript"/>
+        </w:rPr>
+        <w:t xml:space="preserve">9–12</w:t>
+      </w:r>
+    </w:p>
+    <w:p>
+      <w:pPr>
+        <w:pStyle w:val="BodyText"/>
+      </w:pPr>
+      <w:r>
+        <w:t xml:space="preserve">Amidst an increasing enthusiasm for surgical management of ICH</w:t>
+      </w:r>
+      <w:r>
+        <w:rPr>
+          <w:vertAlign w:val="superscript"/>
+        </w:rPr>
+        <w:t xml:space="preserve">3,4,13</w:t>
+      </w:r>
+      <w:r>
+        <w:t xml:space="preserve">, it is important to understand whether hemispheric lateralization is associated with differences in surgical decision making, as has been observed for ischemic stroke. We aimed to evaluate the association of hemispheric lateralization of ICH with the likelihood of receiving neurosurgical intervention as well as with functional outcomes.</w:t>
       </w:r>
     </w:p>
     <w:bookmarkEnd w:id="10"/>
-    <w:bookmarkStart w:id="11" w:name="exposures-and-outcomes"/>
+    <w:bookmarkStart w:id="20" w:name="methods"/>
+    <w:p>
+      <w:pPr>
+        <w:pStyle w:val="Heading2"/>
+      </w:pPr>
+      <w:r>
+        <w:t xml:space="preserve">Methods</w:t>
+      </w:r>
+    </w:p>
+    <w:bookmarkStart w:id="11" w:name="study-design-and-participants"/>
     <w:p>
       <w:pPr>
         <w:pStyle w:val="Heading3"/>
       </w:pPr>
       <w:r>
-        <w:t xml:space="preserve">Exposures and Outcomes</w:t>
+        <w:t xml:space="preserve">Study Design and Participants</w:t>
       </w:r>
     </w:p>
     <w:p>
@@ -169,7 +216,16 @@
         <w:pStyle w:val="FirstParagraph"/>
       </w:pPr>
       <w:r>
-        <w:t xml:space="preserve">Our exposure was hemispheric laterality (left versus right). Our primary outcome was neurosurgical intervention as a binary variable defined as receiving a hematoma evacuation, decompressive craniectomy, or other craniotomy.</w:t>
+        <w:t xml:space="preserve">We conducted a post-hoc analysis using data from two prospective studies: the Antihypertensive Treatment of Acute Cerebral Hemorrhage II (ATACH-2) trial and the Ethnic/Racial Variations of Intracerebral Hemorrhage (ERICH) study. ATACH-2 was a large, multicenter, international, open-label, blinded-endpoint randomized controlled trial that enrolled 1000 patients with ICH and randomized them to either intensive blood pressure control (110-139 mm Hg) or standard blood pressure control (140-179 mm Hg). ERICH was a large, multicenter, prospective observational study conducted patients in the United States on patients admitted with ICH, with particular emphasis on recruitment of a racially and ethnically diverse cohort. The protocols and results of both studies have been previously published elsewhere</w:t>
+      </w:r>
+      <w:r>
+        <w:rPr>
+          <w:vertAlign w:val="superscript"/>
+        </w:rPr>
+        <w:t xml:space="preserve">14,15</w:t>
+      </w:r>
+      <w:r>
+        <w:t xml:space="preserve">.</w:t>
       </w:r>
     </w:p>
     <w:p>
@@ -177,7 +233,7 @@
         <w:pStyle w:val="BodyText"/>
       </w:pPr>
       <w:r>
-        <w:t xml:space="preserve">To explore differences in other aspects of aggressive care, we defined several secondary outcomes: receipt of external ventricular drain (EVD), receipt of tracheostomy, days of mechanical ventilation, receipt of do-not-resuscitate (DNR) order at any point in the hospitalization, withdrawal of life-sustaining therapy (WLST) at any point in the hospitalization, and early WLST (defined as &lt; 72 from symptom onset).</w:t>
+        <w:t xml:space="preserve">We included all patients enrolled in these two studies with supratentorial location of ICH. We excluded patients with cerebellar or brainstem ICH as well as any patient with primary intraventricular hemorrhage (IVH).</w:t>
       </w:r>
     </w:p>
     <w:p>
@@ -185,17 +241,17 @@
         <w:pStyle w:val="BodyText"/>
       </w:pPr>
       <w:r>
-        <w:t xml:space="preserve">Our primary functional outcome was modified Rankin score (mRS) at 90 days analyzed via ordinal regression. We also examined quality of life as assessed by the European Quality of Life-5 dimensions (EQ-5D) questionnaire.</w:t>
+        <w:t xml:space="preserve">The study was approved by the institutional review board of the Wake Forest School of Medicine (IRB00098198).</w:t>
       </w:r>
     </w:p>
     <w:bookmarkEnd w:id="11"/>
-    <w:bookmarkStart w:id="16" w:name="statistical-analysis"/>
+    <w:bookmarkStart w:id="12" w:name="exposures-and-outcomes"/>
     <w:p>
       <w:pPr>
         <w:pStyle w:val="Heading3"/>
       </w:pPr>
       <w:r>
-        <w:t xml:space="preserve">Statistical Analysis</w:t>
+        <w:t xml:space="preserve">Exposures and Outcomes</w:t>
       </w:r>
     </w:p>
     <w:p>
@@ -203,7 +259,7 @@
         <w:pStyle w:val="FirstParagraph"/>
       </w:pPr>
       <w:r>
-        <w:t xml:space="preserve">Associations between hemispheric laterality and clinical outcomes were evaluated using hierarchical Bayesian regression models, adjusting for the covariates listed below with a random intercept applied to the enrolling study cohort.</w:t>
+        <w:t xml:space="preserve">Our exposure was hemispheric laterality (left versus right). Our primary outcome was neurosurgical intervention as a binary variable defined as receiving a hematoma evacuation, decompressive craniectomy, or other craniotomy.</w:t>
       </w:r>
     </w:p>
     <w:p>
@@ -211,25 +267,7 @@
         <w:pStyle w:val="BodyText"/>
       </w:pPr>
       <w:r>
-        <w:t xml:space="preserve">We employed Bayesian statistical methods for this analysis due to several advantages over traditional frequentist approaches. Bayesian methods allow for the incorporation of prior knowledge or beliefs into the analysis, which can be particularly useful in observational studies where prior information about relationships between variables may exist. This is achieved through the use of prior distributions, which are combined with the observed data to produce posterior distributions representing updated beliefs about the parameters of interest. Furthermore, Bayesian methods provide a natural framework for quantifying uncertainty through credible intervals (CrI), which offer a more intuitive interpretation than frequentist confidence intervals. Finally, Bayesian modeling facilitates the estimation of posterior probabilities, allowing for direct probabilistic statements about hypotheses, such as the probability that an effect size (e.g., odds ratio [OR] or incidence rate ratio [IRR]) is greater than 1, which is often of greater clinical relevance than a p-value.</w:t>
-      </w:r>
-      <w:r>
-        <w:rPr>
-          <w:vertAlign w:val="superscript"/>
-        </w:rPr>
-        <w:t xml:space="preserve">16,17</w:t>
-      </w:r>
-      <w:r>
-        <w:t xml:space="preserve"> </w:t>
-      </w:r>
-      <w:r>
-        <w:t xml:space="preserve">This report adheres to the Bayesian Analysis Reporting Guidelines.</w:t>
-      </w:r>
-      <w:r>
-        <w:rPr>
-          <w:vertAlign w:val="superscript"/>
-        </w:rPr>
-        <w:t xml:space="preserve">18</w:t>
+        <w:t xml:space="preserve">To explore differences in other aspects of aggressive care, we defined several secondary outcomes: receipt of external ventricular drain (EVD), receipt of tracheostomy, days of mechanical ventilation, receipt of do-not-resuscitate (DNR) order at any point in the hospitalization, withdrawal of life-sustaining therapy (WLST) at any point in the hospitalization, and early WLST (defined as &lt; 72 from symptom onset).</w:t>
       </w:r>
     </w:p>
     <w:p>
@@ -237,7 +275,25 @@
         <w:pStyle w:val="BodyText"/>
       </w:pPr>
       <w:r>
-        <w:t xml:space="preserve">Binary, ordinal, and count-based outcomes were modeled using hierarchical Bayesian logistic, ordinal logistic, and zero-inflated negative binomial regressions, respectively. The European Quality of Life Visual Analog Scale (EQ-VAS) was scaled to a proportion and analyzed via hierarchical Bayesian zero-one inflated beta (ZOIB) regression. Because our adjusted models included an interaction term between hemispheric laterality and ICH location, the raw main-effect coefficients for laterality are conditional on the reference location. To calculate the overall average effect of laterality across the entire cohort, we applied marginal standardization (G-computation) to all models. This allowed us to estimate average marginal effects while averaging over the empirical distribution of all covariates and the random intercept.</w:t>
+        <w:t xml:space="preserve">Our primary functional outcome was modified Rankin score (mRS) at 90 days analyzed via ordinal regression. We also examined quality of life as assessed by the European Quality of Life-5 dimensions (EQ-5D) questionnaire.</w:t>
+      </w:r>
+    </w:p>
+    <w:bookmarkEnd w:id="12"/>
+    <w:bookmarkStart w:id="17" w:name="statistical-analysis"/>
+    <w:p>
+      <w:pPr>
+        <w:pStyle w:val="Heading3"/>
+      </w:pPr>
+      <w:r>
+        <w:t xml:space="preserve">Statistical Analysis</w:t>
+      </w:r>
+    </w:p>
+    <w:p>
+      <w:pPr>
+        <w:pStyle w:val="FirstParagraph"/>
+      </w:pPr>
+      <w:r>
+        <w:t xml:space="preserve">Associations between hemispheric laterality and clinical outcomes were evaluated using hierarchical Bayesian regression models, adjusting for the covariates listed below with a random intercept applied to the enrolling study cohort.</w:t>
       </w:r>
     </w:p>
     <w:p>
@@ -245,7 +301,25 @@
         <w:pStyle w:val="BodyText"/>
       </w:pPr>
       <w:r>
-        <w:t xml:space="preserve">To account for potential clustering of clinical decision-making by hospital, we ideally would have included a random intercept for the study site in all models. However, site-level identifiers were not available for the ERICH cohort. To assess the potential impact of omitting site-level clustering, we performed a sensitivity analysis restricted to the ATACH-2 cohort, where site identifiers were available. We fitted the primary model for neurosurgical intervention with and without a random intercept for hospital site and compared the posterior estimates for the association with laterality.</w:t>
+        <w:t xml:space="preserve">We employed Bayesian statistical methods for this analysis due to several advantages over traditional frequentist approaches. Bayesian methods allow for the incorporation of prior knowledge or beliefs into the analysis, which can be particularly useful in observational studies where prior information about relationships between variables may exist. This is achieved through the use of prior distributions, which are combined with the observed data to produce posterior distributions representing updated beliefs about the parameters of interest. Furthermore, Bayesian methods provide a natural framework for quantifying uncertainty through credible intervals (CrI), which offer a more intuitive interpretation than frequentist confidence intervals. Finally, Bayesian modeling facilitates the estimation of posterior probabilities, allowing for direct probabilistic statements about hypotheses, such as the probability that an effect size (e.g., odds ratio [OR] or incidence rate ratio [IRR]) is greater than 1, which is often of greater clinical relevance than a p-value.</w:t>
+      </w:r>
+      <w:r>
+        <w:rPr>
+          <w:vertAlign w:val="superscript"/>
+        </w:rPr>
+        <w:t xml:space="preserve">16,17</w:t>
+      </w:r>
+      <w:r>
+        <w:t xml:space="preserve"> </w:t>
+      </w:r>
+      <w:r>
+        <w:t xml:space="preserve">This report adheres to the Bayesian Analysis Reporting Guidelines.</w:t>
+      </w:r>
+      <w:r>
+        <w:rPr>
+          <w:vertAlign w:val="superscript"/>
+        </w:rPr>
+        <w:t xml:space="preserve">18</w:t>
       </w:r>
     </w:p>
     <w:p>
@@ -253,10 +327,26 @@
         <w:pStyle w:val="BodyText"/>
       </w:pPr>
       <w:r>
+        <w:t xml:space="preserve">Binary, ordinal, and count-based outcomes were modeled using hierarchical Bayesian logistic, ordinal logistic, and zero-inflated negative binomial regressions, respectively. The European Quality of Life Visual Analog Scale (EQ-VAS) was scaled to a proportion and analyzed via hierarchical Bayesian zero-one inflated beta (ZOIB) regression. Because our adjusted models included an interaction term between hemispheric laterality and ICH location, the raw main-effect coefficients for laterality are conditional on the reference location. To calculate the overall average effect of laterality across the entire cohort, we applied marginal standardization (G-computation) to all models. This allowed us to estimate average marginal effects while averaging over the empirical distribution of all covariates and the random intercept.</w:t>
+      </w:r>
+    </w:p>
+    <w:p>
+      <w:pPr>
+        <w:pStyle w:val="BodyText"/>
+      </w:pPr>
+      <w:r>
+        <w:t xml:space="preserve">To account for potential clustering of clinical decision-making by hospital, we ideally would have included a random intercept for the study site in all models. However, site-level identifiers were not available for the ERICH cohort. To assess the potential impact of omitting site-level clustering, we performed a sensitivity analysis restricted to the ATACH-2 cohort, where site identifiers were available. We fitted the primary model for neurosurgical intervention with and without a random intercept for hospital site and compared the posterior estimates for the association with laterality.</w:t>
+      </w:r>
+    </w:p>
+    <w:p>
+      <w:pPr>
+        <w:pStyle w:val="BodyText"/>
+      </w:pPr>
+      <w:r>
         <w:t xml:space="preserve">All analyses were performed in R version 4.4.2 (R Foundation for Statistical Computing, Vienna, Austria). All packages used for the analysis are listed in the Supplementary Appendix.</w:t>
       </w:r>
     </w:p>
-    <w:bookmarkStart w:id="12" w:name="covariate-selection"/>
+    <w:bookmarkStart w:id="13" w:name="covariate-selection"/>
     <w:p>
       <w:pPr>
         <w:pStyle w:val="Heading4"/>
@@ -305,8 +395,8 @@
         <w:t xml:space="preserve">The DAGs and further details of the covariate selection rationale are presented in the Supplementary Appendix.</w:t>
       </w:r>
     </w:p>
-    <w:bookmarkEnd w:id="12"/>
-    <w:bookmarkStart w:id="13" w:name="prior-distribution-specification"/>
+    <w:bookmarkEnd w:id="13"/>
+    <w:bookmarkStart w:id="14" w:name="prior-distribution-specification"/>
     <w:p>
       <w:pPr>
         <w:pStyle w:val="Heading4"/>
@@ -320,11 +410,19 @@
         <w:pStyle w:val="FirstParagraph"/>
       </w:pPr>
       <w:r>
-        <w:t xml:space="preserve">We applied four sets of prior distributions for all models to assess the robustness of our findings. Because our models utilized different link functions based on the outcome distribution (e.g., logit for binary/ordinal outcomes, log for count outcomes), the priors correspond to log-odds ratios (OR), log-incidence rate ratios (IRR), or log-mean differences depending on the respective model. The first set was a neutral prior, centered on a log-odds ratio of 0, which corresponds to an odds ratio of 1 and assumes no difference in the outcome of interest between left and right hemispheric patients. The second and third sets were left hemisphere and right hemisphere priors, respectively, which were weakly informative priors that assumed a higher probability of the outcome occurring in the specified hemisphere. The final set was a diffuse prior, which assumes that all possible values for the model parameters are equally likely. This non-informative prior allows the data to dominate the posterior distribution and most closely approximates the assumptions of a frequentist analysis. More details on the rationale of prior specification and the specific parameters used for each prior distribution are included in the Supplementary Appendix.</w:t>
+        <w:t xml:space="preserve">To assess the robustness of our findings, we applied four sets of prior distributions for the primary exposure across all models. Because the models utilize different link functions depending on the outcome distribution (e.g., logit for binary/ordinal outcomes, log for count outcomes), these priors correspond to log-odds ratios (OR), log-incidence rate ratios (IRR), or log-mean differences.</w:t>
       </w:r>
     </w:p>
-    <w:bookmarkEnd w:id="13"/>
-    <w:bookmarkStart w:id="14" w:name="Xa47fa65c2b7f49382486b74e1c4ed3022604078"/>
+    <w:p>
+      <w:pPr>
+        <w:pStyle w:val="BodyText"/>
+      </w:pPr>
+      <w:r>
+        <w:t xml:space="preserve">The four prior sets were: (1) a neutral, weakly informative prior centered on a null effect (Normal(0, 0.5)); (2) an informative left-hemisphere prior favoring outcomes in left-hemispheric patients (Normal(-0.22, 0.175)); (3) an informative right-hemisphere prior favoring outcomes in right-hemispheric patients (Normal(0.18, 0.175)); and (4) a vague, diffuse prior (Normal(0, 5)) that provides minimal information to the posterior, approximating the assumptions of a frequentist analysis. Further rationale and empirical evaluations of these priors are detailed in the Supplementary Appendix.</w:t>
+      </w:r>
+    </w:p>
+    <w:bookmarkEnd w:id="14"/>
+    <w:bookmarkStart w:id="15" w:name="Xa47fa65c2b7f49382486b74e1c4ed3022604078"/>
     <w:p>
       <w:pPr>
         <w:pStyle w:val="Heading4"/>
@@ -349,8 +447,8 @@
         <w:t xml:space="preserve">Effect sizes are reported as marginal odds ratios (OR) for binary and ordinal models, marginal incidence rate ratios (IRR) for the count component of the negative binomial models, and average marginal expected mean differences on the original 0–100 scale for the EQ-VAS (derived via G-computation). We defined a substantial difference as an odds ratio (OR) &gt; 1.2 (or a mean difference of 5 points for the Euro VAS). In the context of invasive procedures such as hemicraniectomy or hematoma evacuation, we posited that a 20% relative shift in treatment odds represents a minimum threshold that would meaningfully impact clinical and shared decision-making. The full rationale for these thresholds and the ROPE bounds for ORs and IRRs are detailed in the Supplementary Appendix.</w:t>
       </w:r>
     </w:p>
-    <w:bookmarkEnd w:id="14"/>
-    <w:bookmarkStart w:id="15" w:name="Xb6b655a891224ddee9981b292c43eac49eeddc4"/>
+    <w:bookmarkEnd w:id="15"/>
+    <w:bookmarkStart w:id="16" w:name="Xb6b655a891224ddee9981b292c43eac49eeddc4"/>
     <w:p>
       <w:pPr>
         <w:pStyle w:val="Heading4"/>
@@ -383,9 +481,9 @@
         <w:t xml:space="preserve">In addition to the missing data analysis, we analyzed our models using the four sets of prior distributions described above. To evaluate potential effect modification on acute care decisions, we fitted models containing formal interaction terms between hemispheric laterality and ICH location, and laterality and study source. Because missingness in baseline covariates and acute surgical outcomes was negligible, these exploratory subgroup interaction models—as well as a prespecified sensitivity analysis for all outcomes—were fitted to complete-case data (excluding patients missing the specific outcome being modeled) for computational efficiency. Subgroup-specific aORs and interaction Ratio of Odds Ratios (ROR) with 95% CrI were computed to evaluate heterogeneity.</w:t>
       </w:r>
     </w:p>
-    <w:bookmarkEnd w:id="15"/>
     <w:bookmarkEnd w:id="16"/>
-    <w:bookmarkStart w:id="18" w:name="data-availability-statement"/>
+    <w:bookmarkEnd w:id="17"/>
+    <w:bookmarkStart w:id="19" w:name="data-availability-statement"/>
     <w:p>
       <w:pPr>
         <w:pStyle w:val="Heading3"/>
@@ -404,7 +502,7 @@
       <w:r>
         <w:t xml:space="preserve"> </w:t>
       </w:r>
-      <w:hyperlink r:id="rId17">
+      <w:hyperlink r:id="rId18">
         <w:r>
           <w:rPr>
             <w:rStyle w:val="Hyperlink"/>
@@ -416,9 +514,9 @@
         <w:t xml:space="preserve">.</w:t>
       </w:r>
     </w:p>
-    <w:bookmarkEnd w:id="18"/>
     <w:bookmarkEnd w:id="19"/>
-    <w:bookmarkStart w:id="24" w:name="results"/>
+    <w:bookmarkEnd w:id="20"/>
+    <w:bookmarkStart w:id="25" w:name="results"/>
     <w:p>
       <w:pPr>
         <w:pStyle w:val="Heading2"/>
@@ -427,7 +525,7 @@
         <w:t xml:space="preserve">Results</w:t>
       </w:r>
     </w:p>
-    <w:bookmarkStart w:id="20" w:name="baseline-characteristics"/>
+    <w:bookmarkStart w:id="21" w:name="baseline-characteristics"/>
     <w:p>
       <w:pPr>
         <w:pStyle w:val="Heading3"/>
@@ -444,8 +542,8 @@
         <w:t xml:space="preserve">A total of 3477 patients were included in the analysis, of which 1720 (49%) had left hemispheric ICH (Table 1). They had higher National Institutes of Health Stroke Scale (NIHSS) scores, lower GCS scores, and lower rates of hypertension as compared to those with right hemispheric ICH. There were 2487 (72%) patients in the cohort from ERICH and 990 (28%) from ATACH-2.</w:t>
       </w:r>
     </w:p>
-    <w:bookmarkEnd w:id="20"/>
-    <w:bookmarkStart w:id="21" w:name="X1916834cd07f085dde90be7ab518c46c5d60659"/>
+    <w:bookmarkEnd w:id="21"/>
+    <w:bookmarkStart w:id="22" w:name="X1916834cd07f085dde90be7ab518c46c5d60659"/>
     <w:p>
       <w:pPr>
         <w:pStyle w:val="Heading3"/>
@@ -467,7 +565,7 @@
         <w:pStyle w:val="BodyText"/>
       </w:pPr>
       <w:r>
-        <w:t xml:space="preserve">Figure 1 displays the covariate-adjusted marginal predicted probabilities of neurosurgical intervention and the prior sensitivity analysis. Panel A shows the posterior distributions of covariate-adjusted absolute predicted probabilities of neurosurgical intervention for left and right hemispheric ICH under the neutral prior (left hemisphere: 4.86%, 95% CrI 3.98–5.84%; right hemisphere: 8.04%, 95% CrI 6.93–9.23%). Panel B shows the posterior distributions of the absolute probability difference (Right − Left) across all four prior specifications. Under the neutral prior, the median probability difference was 3.18 percentage points (95% CrI 1.75–4.62), with P(Right &gt; Left) exceeding 99.9%. Corresponding estimates were 2.21 percentage points (95% CrI 0.97–3.45) under the left-hemisphere prior, 2.84 percentage points (95% CrI 1.60–4.09) under the right-hemisphere prior, and 3.38 percentage points (95% CrI 1.90–4.89) under the diffuse prior, with P(Right &gt; Left) exceeding 99.9% under all specifications.</w:t>
+        <w:t xml:space="preserve">In exploratory subgroup analyses, the association between right hemispheric ICH and neurosurgical intervention remained directionally consistent across all evaluated ICH locations and source studies. Formal interaction analyses yielded wide credible intervals for the Ratio of Odds Ratios (ROR), providing insufficient evidence to conclude that the laterality effect differed meaningfully across these subgroups (Supplemental Table 38).</w:t>
       </w:r>
     </w:p>
     <w:p>
@@ -475,11 +573,19 @@
         <w:pStyle w:val="BodyText"/>
       </w:pPr>
       <w:r>
-        <w:t xml:space="preserve">In a sensitivity analysis restricted to the ATACH-2 cohort, a random intercept for the enrolling hospital was included to account for site-level clustering. The base model yielded an adjusted odds ratio of 2.23 (95% CrI: 1.31–3.76). With the inclusion of the site-level random effect, the adjusted odds ratio was 1.86 (95% CrI: 1.10–3.16). For this hierarchical model, the posterior probability of any directional effect (aOR &gt; 1) was 99%, the posterior probability of an aOR &gt; 1.2 was 95%, and 1% of the posterior distribution fell within the region of practical equivalence. Details are available in the Supplementary Appendix.</w:t>
+        <w:t xml:space="preserve">Figure 1 displays the covariate-adjusted marginal predicted probabilities of neurosurgical intervention and the prior sensitivity analysis. Panel A shows the posterior distributions of covariate-adjusted absolute predicted probabilities of neurosurgical intervention for left and right hemispheric ICH under the neutral prior (left hemisphere: 4.86%, 95% CrI 3.98–5.84%; right hemisphere: 8.04%, 95% CrI 6.93–9.23%). Panel B shows the posterior distributions of the absolute probability difference (Right − Left) across all four prior specifications. Under the neutral prior, the median probability difference was 3.18 percentage points (95% CrI 1.75–4.62), with P(Right &gt; Left) exceeding 99.9%. Corresponding estimates were 2.21 percentage points (95% CrI 0.97–3.45) under the left-hemisphere prior, 2.84 percentage points (95% CrI 1.60–4.09) under the right-hemisphere prior, and 3.38 percentage points (95% CrI 1.90–4.89) under the diffuse prior, with P(Right &gt; Left) exceeding 99.9% under all specifications. Further details are available in Supplemental Tables 39-41.</w:t>
       </w:r>
     </w:p>
-    <w:bookmarkEnd w:id="21"/>
-    <w:bookmarkStart w:id="22" w:name="X35a142ea301be59e62227349f8c14b571c0f47d"/>
+    <w:p>
+      <w:pPr>
+        <w:pStyle w:val="BodyText"/>
+      </w:pPr>
+      <w:r>
+        <w:t xml:space="preserve">In a sensitivity analysis restricted to the ATACH-2 cohort, a random intercept for the enrolling hospital was included to account for site-level clustering. The base model yielded an adjusted odds ratio of 2.23 (95% CrI: 1.31–3.76). With the inclusion of the site-level random effect, the adjusted odds ratio was 1.86 (95% CrI: 1.10–3.16). For this hierarchical model, the posterior probability of any directional effect (aOR &gt; 1) was 99%, the posterior probability of an aOR &gt; 1.2 was 95%, and 1% of the posterior distribution fell within the region of practical equivalence (Supplementary Table 46)</w:t>
+      </w:r>
+    </w:p>
+    <w:bookmarkEnd w:id="22"/>
+    <w:bookmarkStart w:id="23" w:name="X35a142ea301be59e62227349f8c14b571c0f47d"/>
     <w:p>
       <w:pPr>
         <w:pStyle w:val="Heading3"/>
@@ -518,8 +624,8 @@
         <w:t xml:space="preserve">Rates of tracheostomy were similar between groups (19 (1.1%) left vs. 19 (1.1%) right; aOR 1.13 (0.66 - 1.91)), with a posterior probability that the aOR exceeded 1 of 67.2% and 13.1% of the posterior distribution within the ROPE. Rates of WLST (152 (8.8%) left vs. 143 (8.1%) right; aOR 0.95 (0.76 - 1.17)), early WLST (45 (2.6%) left vs. 39 (2.2%) right; aOR 0.93 (0.63 - 1.35)), and DNR orders (195 (11.3%) left vs. 202 (11.5%) right; aOR 1.01 (0.85 - 1.21)) were also similar across hemispheres, with P(aOR &gt; 1) of 30.2%, 34.5%, and 55.2%, respectively.</w:t>
       </w:r>
     </w:p>
-    <w:bookmarkEnd w:id="22"/>
-    <w:bookmarkStart w:id="23" w:name="X497d2c87b36dfef7f34a746e297a0b417356437"/>
+    <w:bookmarkEnd w:id="23"/>
+    <w:bookmarkStart w:id="24" w:name="X497d2c87b36dfef7f34a746e297a0b417356437"/>
     <w:p>
       <w:pPr>
         <w:pStyle w:val="Heading3"/>
@@ -541,12 +647,20 @@
         <w:pStyle w:val="BodyText"/>
       </w:pPr>
       <w:r>
-        <w:t xml:space="preserve">For Mobility and Self-Care, the posterior probability that the aOR exceeded 1 was &gt; 99.9% for both domains (aOR 1.03, 95% CrI 1.01–1.05 for Mobility; aOR 1.03 (1.02 - 1.05) for Self-Care), with a posterior probability of a substantial difference (aOR &gt; 1.2) of &lt; 0.1% for both, and 98.3% and 96.4% of the posterior distributions within the ROPE, respectively. For Pain/Discomfort, the aOR was 1.06 (1.01 - 1.11) with P(aOR &gt; 1) of 99.1% and 38.3% of the posterior distribution within the ROPE. For Anxiety/Depression, the aOR was 1.04 (0.99 - 1.09) with P(aOR &gt; 1) of 95.3% and 64% of the posterior distribution within the ROPE. For Usual Activities, the aOR was 0.99 (0.99 - 1.00) with P(aOR &gt; 1) of 3.1% and &gt; 99.9% of the posterior distribution within the ROPE. For the Euro VAS, the estimated mean difference was -1.7 points (95% CrI -3.6–0.2), with a posterior probability of 96.1% that right hemispheric ICH was associated with a lower score, 62.3% of the posterior distribution within the ROPE, and a posterior probability of a substantial difference (mean difference &lt; −5 points) of &lt; 0.1%. Results from sensitivity analyses using alternative priors are presented in the Supplementary Appendix and are consistent with these results.</w:t>
+        <w:t xml:space="preserve">For Mobility and Self-Care, the posterior probability that the aOR exceeded 1 was &gt; 99.9% for both domains (aOR 1.03, 95% CrI 1.01–1.05 for Mobility; aOR 1.03 (1.02 - 1.05) for Self-Care), with a posterior probability of a substantial difference (aOR &gt; 1.2) of &lt; 0.1% for both, and 98.3% and 96.4% of the posterior distributions within the ROPE, respectively. For Pain/Discomfort, the aOR was 1.06 (1.01 - 1.11) with P(aOR &gt; 1) of 99.1% and 38.3% of the posterior distribution within the ROPE. For Anxiety/Depression, the aOR was 1.04 (0.99 - 1.09) with P(aOR &gt; 1) of 95.3% and 64% of the posterior distribution within the ROPE. For Usual Activities, the aOR was 0.99 (0.99 - 1.00) with P(aOR &gt; 1) of 3.1% and &gt; 99.9% of the posterior distribution within the ROPE. For the Euro VAS, the estimated mean difference was -1.7 points (95% CrI -3.6–0.2), with a posterior probability of 96.1% that right hemispheric ICH was associated with a lower score, 62.3% of the posterior distribution within the ROPE, and a posterior probability of a substantial difference (mean difference &lt; −5 points) of &lt; 0.1%.</w:t>
       </w:r>
     </w:p>
-    <w:bookmarkEnd w:id="23"/>
+    <w:p>
+      <w:pPr>
+        <w:pStyle w:val="BodyText"/>
+      </w:pPr>
+      <w:r>
+        <w:t xml:space="preserve">Results from sensitivity analyses using alternative priors and complete case analysis are presented in Supplementary Tables 42-45 and are consistent with these results.</w:t>
+      </w:r>
+    </w:p>
     <w:bookmarkEnd w:id="24"/>
-    <w:bookmarkStart w:id="25" w:name="discussion"/>
+    <w:bookmarkEnd w:id="25"/>
+    <w:bookmarkStart w:id="26" w:name="discussion"/>
     <w:p>
       <w:pPr>
         <w:pStyle w:val="Heading2"/>
@@ -560,7 +674,7 @@
         <w:pStyle w:val="FirstParagraph"/>
       </w:pPr>
       <w:r>
-        <w:t xml:space="preserve">In this pooled analysis of 3477 patients with ICH, we observed an association between right hemispheric ICH and a higher likelihood of receiving neurosurgical intervention compared to left hemispheric ICH. Specifically, patients with right hemispheric ICH had 1.65 times the adjusted odds of receiving a neurosurgical intervention and 1.22 times the adjusted odds of receiving an EVD. This finding was robust to prior specification: all four prior distributions yielded nearly identical posteriors with P(Right &gt; Left) exceeding 99.9%, and only marginal shifts in the posterior median (Figure 1). In exploratory subgroup analyses with formal interaction terms, the laterality association was directionally consistent across ICH locations and between the two source studies; however, the interaction Ratio of Odds Ratios (ROR) credible intervals were wide and included 1, precluding definitive conclusions about subgroup heterogeneity (Supplementary Appendix). Despite a lower observed rate of surgical intervention, patients with left hemispheric ICH had similar 90-day functional outcomes to those with right hemispheric ICH, a finding consistent across definitions including the mRS and HRQoL domains. Of note, our functional outcome models estimated the total association of hemispheric laterality with outcome — inclusive of downstream differences in surgical management — rather than the direct association conditional on treatment received, thereby reflecting the overall prognostic profile of laterality as encountered in clinical practice.</w:t>
+        <w:t xml:space="preserve">In this pooled analysis of r sample_size patients with ICH, we observed an association between right hemispheric ICH and a higher likelihood of receiving neurosurgical intervention compared to left hemispheric ICH. Specifically, patients with right hemispheric ICH had 1.65 times the adjusted odds of receiving a neurosurgical intervention and 1.22 times the adjusted odds of receiving an EVD. This association was directionally consistent across ICH locations, study cohorts, and prior specifications, though incorporating a hospital-level random intercept to account for site-level clustering modestly attenuated the effect. Despite less aggressive surgical management, patients with left hemispheric ICH demonstrated similar 90-day functional outcomes and potentially better quality of life measures. This equivalence aligns with previous literature in both ICH and ischemic stroke, where a clear association between hemispheric laterality and functional outcomes has often been difficult to establish.</w:t>
       </w:r>
     </w:p>
     <w:p>
@@ -568,16 +682,7 @@
         <w:pStyle w:val="BodyText"/>
       </w:pPr>
       <w:r>
-        <w:t xml:space="preserve">This finding is noteworthy in light of recent evidence suggesting that surgical interventions, such as hematoma evacuation and decompressive craniectomy, may improve outcomes in some ICH patients</w:t>
-      </w:r>
-      <w:r>
-        <w:rPr>
-          <w:vertAlign w:val="superscript"/>
-        </w:rPr>
-        <w:t xml:space="preserve">3,13</w:t>
-      </w:r>
-      <w:r>
-        <w:t xml:space="preserve">. In both the ATACH-2 and ERICH studies, neurosurgical candidacy was not defined by strict trial protocols but was left to the discretion of the treating clinicians based on local institutional practices. Decisions regarding hematoma evacuation or decompressive craniectomy were inherently influenced by temporal trends and site-specific protocols, which varied considerably over the study periods. While we adjusted for key baseline covariates and included a study-level random effect, these institutional and temporal practice variations likely shaped the overall landscape of surgical care observed in our cohort.</w:t>
+        <w:t xml:space="preserve">The exact mechanisms driving these associations remain unclear, and the observational nature of the data precludes causal inferences. In both the ATACH-2 and ERICH studies, neurosurgical candidacy was not governed by strict trial protocols but was left entirely to clinician discretion. Furthermore, ATACH-2 excluded patients who required immediate, life-saving hematoma evacuation upon presentation. Therefore, the observed disparity in our cohort likely reflects a complex interplay of clinical triage, unmeasured anatomical severity, and shared decision-making rather than isolated treatment bias.</w:t>
       </w:r>
     </w:p>
     <w:p>
@@ -585,7 +690,7 @@
         <w:pStyle w:val="BodyText"/>
       </w:pPr>
       <w:r>
-        <w:t xml:space="preserve">The observed association between laterality and neurosurgical intervention may reflect several mechanisms, which our observational design cannot fully disentangle. One possibility is a treatment selection bias in which clinicians, patients, or families preferentially avoid surgical intervention for dominant-hemispheric injuries due to concerns about post-operative language deficits. Indeed, several studies have found that clinicians, patients, and families place particular importance on language function and are less optimistic about dominant-hemispheric injuries.</w:t>
+        <w:t xml:space="preserve">One plausible explanation for this disparity involves language-related prognostic framing. Left-hemispheric ICH is frequently associated with aphasia, a deficit that clinicians, patients, and families historically weigh heavily when anticipating long-term quality of life.</w:t>
       </w:r>
       <w:r>
         <w:rPr>
@@ -597,7 +702,7 @@
         <w:t xml:space="preserve"> </w:t>
       </w:r>
       <w:r>
-        <w:t xml:space="preserve">Prognostic framing that emphasizes aphasia may also affect surrogate decision-making and goals-of-care discussions, which in turn may influence willingness to pursue surgical intervention.</w:t>
+        <w:t xml:space="preserve">Prognostic framing that emphasizes the risk of severe aphasia may heavily influence surrogate decision-makers during early goals-of-care discussions, potentially driving lower intervention rates. This dynamic is consistent with the well-characterized self-fulfilling prophecy in neurocritical care. Conversely, severe neglect—which commonly complicates right-hemispheric lesions and profoundly impairs mobility and self-care—may be less frequently emphasized as a barrier to surgical candidacy, despite its distinct impact on caregiver burden and long-term disability.</w:t>
       </w:r>
     </w:p>
     <w:p>
@@ -605,7 +710,7 @@
         <w:pStyle w:val="BodyText"/>
       </w:pPr>
       <w:r>
-        <w:t xml:space="preserve">However, alternative explanations should also be considered. Residual confounding from unmeasured clinical factors — such as proximity to eloquent cortex, degree of mass effect, extent of hydrocephalus, midline shift, or more granular anatomical features beyond our lobar-versus-deep classification — may independently influence both perceived surgical candidacy and laterality-associated outcomes. Similarly, family preferences, cultural attitudes toward disability, and language-related prognostic framing could influence treatment decisions in ways that are associated with hemispheric laterality but are not captured in our dataset. Our models adjusted for key measured confounders including ICH volume, location, GCS, and IVH, but the observational and post-hoc nature of this analysis means that residual confounding cannot be excluded. Accordingly, the association we observed should not be interpreted as definitive evidence of treatment inequity, but rather as a signal warranting prospective investigation. If confirmed, this disparity could have meaningful clinical implications — patients with dominant-hemispheric ICH may report equivalent quality of life outcomes compared to those with non-dominant hemispheric injury, and prevailing assumptions about poor prognosis in this group may not be warranted. Furthermore, the observation that functional outcomes were similar between groups despite less aggressive care for left hemispheric ICH is notable. This equivalence could be partly due to the differential impact of specific neurocognitive deficits on standardized rating scales; for example, severe neglect associated with right hemispheric lesions can profoundly impair mobility and self-care domains, whereas aphasia from left hemispheric lesions may influence mRS and caregiver perceptions of disability in different ways.</w:t>
+        <w:t xml:space="preserve">This study has several important limitations. First, we lacked granular data on critical confounders such as specific mass effect trajectories, degree of midline shift, hydrocephalus, and explicit family preferences. These unmeasured clinical nuances are primary drivers of surgical decision-making and could independently influence both perceived candidacy and outcomes. Second, we relied on hemispheric laterality as an imperfect proxy for true language dominance; because handedness data were unavailable, the expected 5–10% of patients with atypical dominance likely introduced non-differential misclassification, biasing our estimates toward the null. Third, absolute surgical event rates in this cohort were relatively low. Consequently, it is unclear if these associations are transportable to contemporary, unselected ICH populations or to patients with moderate-to-severe ICH who possess immediate indications for emergent surgery. Finally, attitudes toward disability and the frameworks used for shared decision-making carry significant cultural nuance, and our findings—derived primarily from cohorts in the United States—may not generalize across diverse global and socioeconomic settings.</w:t>
       </w:r>
     </w:p>
     <w:p>
@@ -613,37 +718,64 @@
         <w:pStyle w:val="BodyText"/>
       </w:pPr>
       <w:r>
-        <w:t xml:space="preserve">Evidence is limited regarding the association of hemispheric lateralization and functional outcomes in patients with ICH. Our findings corroborate those from a pooled analysis of the INTERACT1 and INTERACT2 trials, which showed a higher risk of mortality in patients with right hemispheric ICH.</w:t>
+        <w:t xml:space="preserve">With recent randomized trials demonstrating the benefit of hematoma evacuation and decompressive craniectomy in appropriately selected ICH patients</w:t>
       </w:r>
       <w:r>
         <w:rPr>
           <w:vertAlign w:val="superscript"/>
         </w:rPr>
-        <w:t xml:space="preserve">12</w:t>
-      </w:r>
-      <w:r>
-        <w:t xml:space="preserve"> </w:t>
-      </w:r>
-      <w:r>
-        <w:t xml:space="preserve">Most other studies examining the association of hemispheric laterality and functional outcomes have focused on patients with acute ischemic stroke with mixed results. The two largest studies were pooled analyses from prospective ischemic stroke trials and neither found a clear association between hemispheric laterality and outcomes. </w:t>
-      </w:r>
+        <w:t xml:space="preserve">3,4</w:t>
+      </w:r>
+      <w:r>
+        <w:t xml:space="preserve">, understanding the specific drivers of discretionary surgical decisions is increasingly critical. Future research should prospectively investigate the precise clinical criteria used to determine surgical candidacy, while also exploring the details of prognostic framing and shared decision-making across varying cultural contexts to ensure equitable and evidence-based neurosurgical care.</w:t>
+      </w:r>
+    </w:p>
+    <w:bookmarkEnd w:id="26"/>
+    <w:bookmarkStart w:id="27" w:name="conclusions"/>
+    <w:p>
+      <w:pPr>
+        <w:pStyle w:val="Heading2"/>
+      </w:pPr>
+      <w:r>
+        <w:t xml:space="preserve">Conclusions</w:t>
+      </w:r>
+    </w:p>
+    <w:p>
+      <w:pPr>
+        <w:pStyle w:val="FirstParagraph"/>
+      </w:pPr>
+      <w:r>
+        <w:t xml:space="preserve">In this post-hoc observational analysis, right hemispheric ICH was associated with a higher likelihood of neurosurgical intervention compared to left hemispheric ICH. However, 90-day functional outcomes were similar across hemispheres. While these findings highlight a potential laterality-driven disparity in treatment paradigms, residual confounding from unmeasured anatomical severity and family preferences cannot be excluded. Future prospective studies are needed to delineate the explicit clinical and prognostic drivers of surgical decision-making to optimize treatment allocation in ICH.</w:t>
+      </w:r>
+    </w:p>
+    <w:p>
+      <w:r>
+        <w:br w:type="page"/>
+      </w:r>
+    </w:p>
+    <w:bookmarkEnd w:id="27"/>
+    <w:bookmarkStart w:id="28" w:name="acknowledgments"/>
+    <w:p>
+      <w:pPr>
+        <w:pStyle w:val="Heading2"/>
+      </w:pPr>
+      <w:r>
+        <w:t xml:space="preserve">Acknowledgments</w:t>
+      </w:r>
+    </w:p>
+    <w:p>
+      <w:pPr>
+        <w:pStyle w:val="FirstParagraph"/>
+      </w:pPr>
       <w:r>
         <w:rPr>
-          <w:vertAlign w:val="superscript"/>
+          <w:b/>
+          <w:bCs/>
         </w:rPr>
-        <w:t xml:space="preserve">25,26</w:t>
-      </w:r>
-      <w:r>
-        <w:t xml:space="preserve"> </w:t>
-      </w:r>
-      <w:r>
-        <w:t xml:space="preserve">This may be particularly challenging to study in ischemic stroke due to how the NIHSS is used to guide treatment decisions and is also biased toward higher scores in patients with left hemispheric injury.</w:t>
-      </w:r>
-      <w:r>
-        <w:rPr>
-          <w:vertAlign w:val="superscript"/>
-        </w:rPr>
-        <w:t xml:space="preserve">27</w:t>
+        <w:t xml:space="preserve">Funding/support</w:t>
+      </w:r>
+      <w:r>
+        <w:t xml:space="preserve">: The ATACH-2 clinical trial and ERICH prospective observational study were funded by the National Institute of Neurological Disorders and Stroke (NINDS).</w:t>
       </w:r>
     </w:p>
     <w:p>
@@ -651,39 +783,14 @@
         <w:pStyle w:val="BodyText"/>
       </w:pPr>
       <w:r>
-        <w:t xml:space="preserve">Our study has some limitations. As a post-hoc observational analysis, our findings demonstrate associations and cannot establish causality. We used left versus right hemispheric laterality as a proxy for hemispheric dominance; however, approximately 5–10% of the general population — and a higher proportion of left-handed individuals — have atypical (right or bilateral) language dominance, and handedness data were not available in either cohort. As a result, some degree of misclassification of dominant versus non-dominant hemispheric injury is expected, which would bias effect estimates toward the null. Residual confounding from unmeasured clinical variables — including more granular measures of hematoma anatomy, eloquent cortex involvement, mass effect, and hydrocephalus — may account for some or all of the observed differences. Our primary models included a random intercept for study (ATACH-2 versus ERICH) but could not account for site-level clustering across all centers because site identifiers were unavailable for the ERICH cohort; a sensitivity analysis restricted to ATACH-2 incorporating a site-level random intercept yielded qualitatively similar results, but residual confounding from unmeasured center-level practice variation in the full cohort cannot be excluded. The absolute number of patients undergoing surgery was relatively low, making it unclear how these findings might translate to settings with higher intervention rates. We derived our cohort from two prospective studies where practice patterns may have been affected by the Hawthorne effect. Our cohort is also limited to mostly patients living in the United States, and there is likely to be a range of different socioeconomic and cultural frameworks that factor into decisions on treatment, prognosis, and quality of life throughout the world. Additionally, we could not assess unmeasured factors such as family preferences, language-related prognostic framing by clinicians, or the specific content of goals-of-care discussions, all of which may influence treatment decisions in laterality-dependent ways. With the recent publication of several large RCTs demonstrating the benefit of hematoma evacuation and decompressive craniectomy in ICH</w:t>
-      </w:r>
-      <w:r>
         <w:rPr>
-          <w:vertAlign w:val="superscript"/>
+          <w:b/>
+          <w:bCs/>
         </w:rPr>
-        <w:t xml:space="preserve">3,13</w:t>
-      </w:r>
-      <w:r>
-        <w:t xml:space="preserve">, it will be imperative to confirm our findings with additional cohorts. Future research should focus on prospectively evaluating the association between hemispheric laterality and treatment decisions, and on surveying clinicians, patients, and families with a variety of cultural and socioeconomic backgrounds to better understand the factors that drive observed differences in intervention rates.</w:t>
-      </w:r>
-    </w:p>
-    <w:bookmarkEnd w:id="25"/>
-    <w:bookmarkStart w:id="26" w:name="conclusions"/>
-    <w:p>
-      <w:pPr>
-        <w:pStyle w:val="Heading2"/>
-      </w:pPr>
-      <w:r>
-        <w:t xml:space="preserve">Conclusions</w:t>
-      </w:r>
-    </w:p>
-    <w:p>
-      <w:pPr>
-        <w:pStyle w:val="FirstParagraph"/>
-      </w:pPr>
-      <w:r>
-        <w:t xml:space="preserve">In this post-hoc observational analysis, left hemispheric ICH was associated with a lower likelihood of neurosurgical intervention and external ventricular drain placement compared to right hemispheric ICH. Despite this difference in aggressive care, left hemispheric ICH was not associated with worse functional outcomes at 90 days, with patients exhibiting similar mRS and HRQoL profiles. While these associations are consistent with possible laterality-related differences in treatment decisions, residual confounding from unmeasured clinical and social factors cannot be excluded. These findings highlight the need for prospective studies to clarify whether hemispheric laterality independently influences treatment allocation and to ensure equitable access to surgical intervention in ICH.</w:t>
-      </w:r>
-    </w:p>
-    <w:p>
-      <w:r>
-        <w:br w:type="page"/>
+        <w:t xml:space="preserve">Role of the Funder/Sponsor</w:t>
+      </w:r>
+      <w:r>
+        <w:t xml:space="preserve">: The study was supported in part by grant 5U01NS062091, NINDS and grant 5U01NS069763, NINDS. The sponsor had no role in the design and conduct of the current study.</w:t>
       </w:r>
     </w:p>
     <w:p>
@@ -691,7 +798,14 @@
         <w:pStyle w:val="BodyText"/>
       </w:pPr>
       <w:r>
-        <w:t xml:space="preserve">##Acknowledgments</w:t>
+        <w:rPr>
+          <w:b/>
+          <w:bCs/>
+        </w:rPr>
+        <w:t xml:space="preserve">Conflict of Interest Disclosures</w:t>
+      </w:r>
+      <w:r>
+        <w:t xml:space="preserve">: Dr. Magun discloses being a shareholder in Inovio Pharmaceuticals and StageZero Life Sciences.</w:t>
       </w:r>
     </w:p>
     <w:p>
@@ -703,64 +817,19 @@
           <w:b/>
           <w:bCs/>
         </w:rPr>
-        <w:t xml:space="preserve">Funding/support</w:t>
-      </w:r>
-      <w:r>
-        <w:t xml:space="preserve">: The ATACH-2 clinical trial and ERICH prospective observational study were funded by the National Institute of Neurological Disorders and Stroke (NINDS).</w:t>
+        <w:t xml:space="preserve">Additional Contributions</w:t>
+      </w:r>
+      <w:r>
+        <w:t xml:space="preserve">: We thank all investigators for their efforts in conducting the ATACH-2 trial and ERICH study and thank all study participants for enrolling.</w:t>
       </w:r>
     </w:p>
     <w:p>
-      <w:pPr>
-        <w:pStyle w:val="BodyText"/>
-      </w:pPr>
-      <w:r>
-        <w:rPr>
-          <w:b/>
-          <w:bCs/>
-        </w:rPr>
-        <w:t xml:space="preserve">Role of the Funder/Sponsor</w:t>
-      </w:r>
-      <w:r>
-        <w:t xml:space="preserve">: The study was supported in part by grant 5U01NS062091, NINDS and grant 5U01NS069763, NINDS. The sponsor had no role in the design and conduct of the current study.</w:t>
+      <w:r>
+        <w:br w:type="page"/>
       </w:r>
     </w:p>
-    <w:p>
-      <w:pPr>
-        <w:pStyle w:val="BodyText"/>
-      </w:pPr>
-      <w:r>
-        <w:rPr>
-          <w:b/>
-          <w:bCs/>
-        </w:rPr>
-        <w:t xml:space="preserve">Conflict of Interest Disclosures</w:t>
-      </w:r>
-      <w:r>
-        <w:t xml:space="preserve">: Dr. Magun discloses being a shareholder in Inovio Pharmaceuticals and StageZero Life Sciences.</w:t>
-      </w:r>
-    </w:p>
-    <w:p>
-      <w:pPr>
-        <w:pStyle w:val="BodyText"/>
-      </w:pPr>
-      <w:r>
-        <w:rPr>
-          <w:b/>
-          <w:bCs/>
-        </w:rPr>
-        <w:t xml:space="preserve">Additional Contributions</w:t>
-      </w:r>
-      <w:r>
-        <w:t xml:space="preserve">: We thank all investigators for their efforts in conducting the ATACH-2 trial and ERICH study and thank all study participants for enrolling.</w:t>
-      </w:r>
-    </w:p>
-    <w:p>
-      <w:r>
-        <w:br w:type="page"/>
-      </w:r>
-    </w:p>
-    <w:bookmarkEnd w:id="26"/>
-    <w:bookmarkStart w:id="80" w:name="references"/>
+    <w:bookmarkEnd w:id="28"/>
+    <w:bookmarkStart w:id="76" w:name="references"/>
     <w:p>
       <w:pPr>
         <w:pStyle w:val="Heading2"/>
@@ -769,8 +838,8 @@
         <w:t xml:space="preserve">References</w:t>
       </w:r>
     </w:p>
-    <w:bookmarkStart w:id="79" w:name="refs"/>
-    <w:bookmarkStart w:id="28" w:name="ref-hemphillICHScoreSimple2001"/>
+    <w:bookmarkStart w:id="75" w:name="refs"/>
+    <w:bookmarkStart w:id="30" w:name="ref-hemphillICHScoreSimple2001"/>
     <w:p>
       <w:pPr>
         <w:pStyle w:val="Bibliography"/>
@@ -790,7 +859,7 @@
       <w:r>
         <w:t xml:space="preserve"> </w:t>
       </w:r>
-      <w:hyperlink r:id="rId27">
+      <w:hyperlink r:id="rId29">
         <w:r>
           <w:rPr>
             <w:rStyle w:val="Hyperlink"/>
@@ -890,8 +959,8 @@
         <w:t xml:space="preserve"> </w:t>
       </w:r>
     </w:p>
-    <w:bookmarkEnd w:id="28"/>
-    <w:bookmarkStart w:id="30" w:name="Xb1ab0250ddbe95fd4f2ad9af76384f9c74d3ea6"/>
+    <w:bookmarkEnd w:id="30"/>
+    <w:bookmarkStart w:id="32" w:name="Xb1ab0250ddbe95fd4f2ad9af76384f9c74d3ea6"/>
     <w:p>
       <w:pPr>
         <w:pStyle w:val="Bibliography"/>
@@ -911,7 +980,7 @@
       <w:r>
         <w:t xml:space="preserve"> </w:t>
       </w:r>
-      <w:hyperlink r:id="rId29">
+      <w:hyperlink r:id="rId31">
         <w:r>
           <w:rPr>
             <w:rStyle w:val="Hyperlink"/>
@@ -951,8 +1020,8 @@
         <w:t xml:space="preserve"> </w:t>
       </w:r>
     </w:p>
-    <w:bookmarkEnd w:id="30"/>
-    <w:bookmarkStart w:id="32" w:name="ref-pradillaTrialEarlyMinimally2024"/>
+    <w:bookmarkEnd w:id="32"/>
+    <w:bookmarkStart w:id="34" w:name="ref-pradillaTrialEarlyMinimally2024"/>
     <w:p>
       <w:pPr>
         <w:pStyle w:val="Bibliography"/>
@@ -972,7 +1041,7 @@
       <w:r>
         <w:t xml:space="preserve"> </w:t>
       </w:r>
-      <w:hyperlink r:id="rId31">
+      <w:hyperlink r:id="rId33">
         <w:r>
           <w:rPr>
             <w:rStyle w:val="Hyperlink"/>
@@ -1036,8 +1105,8 @@
         <w:t xml:space="preserve"> </w:t>
       </w:r>
     </w:p>
-    <w:bookmarkEnd w:id="32"/>
-    <w:bookmarkStart w:id="34" w:name="ref-bakoMinimallyInvasiveSurgery2023"/>
+    <w:bookmarkEnd w:id="34"/>
+    <w:bookmarkStart w:id="36" w:name="ref-bakoMinimallyInvasiveSurgery2023"/>
     <w:p>
       <w:pPr>
         <w:pStyle w:val="Bibliography"/>
@@ -1057,7 +1126,7 @@
       <w:r>
         <w:t xml:space="preserve"> </w:t>
       </w:r>
-      <w:hyperlink r:id="rId33">
+      <w:hyperlink r:id="rId35">
         <w:r>
           <w:rPr>
             <w:rStyle w:val="Hyperlink"/>
@@ -1121,8 +1190,8 @@
         <w:t xml:space="preserve"> </w:t>
       </w:r>
     </w:p>
-    <w:bookmarkEnd w:id="34"/>
-    <w:bookmarkStart w:id="36" w:name="ref-dileggeImpactLesionSide2005"/>
+    <w:bookmarkEnd w:id="36"/>
+    <w:bookmarkStart w:id="38" w:name="ref-dileggeImpactLesionSide2005"/>
     <w:p>
       <w:pPr>
         <w:pStyle w:val="Bibliography"/>
@@ -1142,7 +1211,7 @@
       <w:r>
         <w:t xml:space="preserve"> </w:t>
       </w:r>
-      <w:hyperlink r:id="rId35">
+      <w:hyperlink r:id="rId37">
         <w:r>
           <w:rPr>
             <w:rStyle w:val="Hyperlink"/>
@@ -1170,8 +1239,8 @@
         <w:t xml:space="preserve"> </w:t>
       </w:r>
     </w:p>
-    <w:bookmarkEnd w:id="36"/>
-    <w:bookmarkStart w:id="38" w:name="ref-foerchDifferenceRecognitionRight2005"/>
+    <w:bookmarkEnd w:id="38"/>
+    <w:bookmarkStart w:id="40" w:name="ref-foerchDifferenceRecognitionRight2005"/>
     <w:p>
       <w:pPr>
         <w:pStyle w:val="Bibliography"/>
@@ -1191,7 +1260,7 @@
       <w:r>
         <w:t xml:space="preserve"> </w:t>
       </w:r>
-      <w:hyperlink r:id="rId37">
+      <w:hyperlink r:id="rId39">
         <w:r>
           <w:rPr>
             <w:rStyle w:val="Hyperlink"/>
@@ -1219,8 +1288,8 @@
         <w:t xml:space="preserve"> </w:t>
       </w:r>
     </w:p>
-    <w:bookmarkEnd w:id="38"/>
-    <w:bookmarkStart w:id="40" w:name="ref-portegiesLeftsidedStrokesAre2015"/>
+    <w:bookmarkEnd w:id="40"/>
+    <w:bookmarkStart w:id="42" w:name="ref-portegiesLeftsidedStrokesAre2015"/>
     <w:p>
       <w:pPr>
         <w:pStyle w:val="Bibliography"/>
@@ -1240,7 +1309,7 @@
       <w:r>
         <w:t xml:space="preserve"> </w:t>
       </w:r>
-      <w:hyperlink r:id="rId39">
+      <w:hyperlink r:id="rId41">
         <w:r>
           <w:rPr>
             <w:rStyle w:val="Hyperlink"/>
@@ -1292,8 +1361,8 @@
         <w:t xml:space="preserve"> </w:t>
       </w:r>
     </w:p>
-    <w:bookmarkEnd w:id="40"/>
-    <w:bookmarkStart w:id="42" w:name="ref-liStrokeLateralizationLarge2021"/>
+    <w:bookmarkEnd w:id="42"/>
+    <w:bookmarkStart w:id="44" w:name="ref-liStrokeLateralizationLarge2021"/>
     <w:p>
       <w:pPr>
         <w:pStyle w:val="Bibliography"/>
@@ -1313,7 +1382,7 @@
       <w:r>
         <w:t xml:space="preserve"> </w:t>
       </w:r>
-      <w:hyperlink r:id="rId41">
+      <w:hyperlink r:id="rId43">
         <w:r>
           <w:rPr>
             <w:rStyle w:val="Hyperlink"/>
@@ -1431,8 +1500,8 @@
         <w:t xml:space="preserve"> </w:t>
       </w:r>
     </w:p>
-    <w:bookmarkEnd w:id="42"/>
-    <w:bookmarkStart w:id="44" w:name="X838bc231b1872fcffc9183d1e0517a825b33557"/>
+    <w:bookmarkEnd w:id="44"/>
+    <w:bookmarkStart w:id="46" w:name="X838bc231b1872fcffc9183d1e0517a825b33557"/>
     <w:p>
       <w:pPr>
         <w:pStyle w:val="Bibliography"/>
@@ -1452,7 +1521,7 @@
       <w:r>
         <w:t xml:space="preserve"> </w:t>
       </w:r>
-      <w:hyperlink r:id="rId43">
+      <w:hyperlink r:id="rId45">
         <w:r>
           <w:rPr>
             <w:rStyle w:val="Hyperlink"/>
@@ -1480,8 +1549,8 @@
         <w:t xml:space="preserve"> </w:t>
       </w:r>
     </w:p>
-    <w:bookmarkEnd w:id="44"/>
-    <w:bookmarkStart w:id="46" w:name="ref-leggeNeglectingDifference2006"/>
+    <w:bookmarkEnd w:id="46"/>
+    <w:bookmarkStart w:id="48" w:name="ref-leggeNeglectingDifference2006"/>
     <w:p>
       <w:pPr>
         <w:pStyle w:val="Bibliography"/>
@@ -1501,7 +1570,7 @@
       <w:r>
         <w:t xml:space="preserve"> </w:t>
       </w:r>
-      <w:hyperlink r:id="rId45">
+      <w:hyperlink r:id="rId47">
         <w:r>
           <w:rPr>
             <w:rStyle w:val="Hyperlink"/>
@@ -1541,8 +1610,8 @@
         <w:t xml:space="preserve"> </w:t>
       </w:r>
     </w:p>
-    <w:bookmarkEnd w:id="46"/>
-    <w:bookmarkStart w:id="48" w:name="X3c0b23a0f7bdee15362bbd61a2add3aa865ea88"/>
+    <w:bookmarkEnd w:id="48"/>
+    <w:bookmarkStart w:id="50" w:name="X3c0b23a0f7bdee15362bbd61a2add3aa865ea88"/>
     <w:p>
       <w:pPr>
         <w:pStyle w:val="Bibliography"/>
@@ -1562,7 +1631,7 @@
       <w:r>
         <w:t xml:space="preserve"> </w:t>
       </w:r>
-      <w:hyperlink r:id="rId47">
+      <w:hyperlink r:id="rId49">
         <w:r>
           <w:rPr>
             <w:rStyle w:val="Hyperlink"/>
@@ -1650,8 +1719,8 @@
         <w:t xml:space="preserve"> </w:t>
       </w:r>
     </w:p>
-    <w:bookmarkEnd w:id="48"/>
-    <w:bookmarkStart w:id="50" w:name="ref-satoHigherMortalityPatients2015"/>
+    <w:bookmarkEnd w:id="50"/>
+    <w:bookmarkStart w:id="52" w:name="ref-satoHigherMortalityPatients2015"/>
     <w:p>
       <w:pPr>
         <w:pStyle w:val="Bibliography"/>
@@ -1671,7 +1740,7 @@
       <w:r>
         <w:t xml:space="preserve"> </w:t>
       </w:r>
-      <w:hyperlink r:id="rId49">
+      <w:hyperlink r:id="rId51">
         <w:r>
           <w:rPr>
             <w:rStyle w:val="Hyperlink"/>
@@ -1723,8 +1792,8 @@
         <w:t xml:space="preserve"> </w:t>
       </w:r>
     </w:p>
-    <w:bookmarkEnd w:id="50"/>
-    <w:bookmarkStart w:id="52" w:name="ref-beckDecompressiveCraniectomyBest2024"/>
+    <w:bookmarkEnd w:id="52"/>
+    <w:bookmarkStart w:id="54" w:name="ref-beckDecompressiveCraniectomyBest2024"/>
     <w:p>
       <w:pPr>
         <w:pStyle w:val="Bibliography"/>
@@ -1744,7 +1813,7 @@
       <w:r>
         <w:t xml:space="preserve"> </w:t>
       </w:r>
-      <w:hyperlink r:id="rId51">
+      <w:hyperlink r:id="rId53">
         <w:r>
           <w:rPr>
             <w:rStyle w:val="Hyperlink"/>
@@ -1772,8 +1841,8 @@
         <w:t xml:space="preserve"> </w:t>
       </w:r>
     </w:p>
-    <w:bookmarkEnd w:id="52"/>
-    <w:bookmarkStart w:id="54" w:name="Xe5698a0135fcc3ba325d1733a6b0d2457d0d2c6"/>
+    <w:bookmarkEnd w:id="54"/>
+    <w:bookmarkStart w:id="56" w:name="Xe5698a0135fcc3ba325d1733a6b0d2457d0d2c6"/>
     <w:p>
       <w:pPr>
         <w:pStyle w:val="Bibliography"/>
@@ -1793,7 +1862,7 @@
       <w:r>
         <w:t xml:space="preserve"> </w:t>
       </w:r>
-      <w:hyperlink r:id="rId53">
+      <w:hyperlink r:id="rId55">
         <w:r>
           <w:rPr>
             <w:rStyle w:val="Hyperlink"/>
@@ -1881,8 +1950,8 @@
         <w:t xml:space="preserve"> </w:t>
       </w:r>
     </w:p>
-    <w:bookmarkEnd w:id="54"/>
-    <w:bookmarkStart w:id="56" w:name="ref-wooEthnicRacialVariations2013"/>
+    <w:bookmarkEnd w:id="56"/>
+    <w:bookmarkStart w:id="58" w:name="ref-wooEthnicRacialVariations2013"/>
     <w:p>
       <w:pPr>
         <w:pStyle w:val="Bibliography"/>
@@ -1902,7 +1971,7 @@
       <w:r>
         <w:t xml:space="preserve"> </w:t>
       </w:r>
-      <w:hyperlink r:id="rId55">
+      <w:hyperlink r:id="rId57">
         <w:r>
           <w:rPr>
             <w:rStyle w:val="Hyperlink"/>
@@ -2014,8 +2083,8 @@
         <w:t xml:space="preserve"> </w:t>
       </w:r>
     </w:p>
-    <w:bookmarkEnd w:id="56"/>
-    <w:bookmarkStart w:id="57" w:name="ref-dogucuBayesRulesIntroduction"/>
+    <w:bookmarkEnd w:id="58"/>
+    <w:bookmarkStart w:id="59" w:name="ref-dogucuBayesRulesIntroduction"/>
     <w:p>
       <w:pPr>
         <w:pStyle w:val="Bibliography"/>
@@ -2066,8 +2135,8 @@
         <w:t xml:space="preserve"> </w:t>
       </w:r>
     </w:p>
-    <w:bookmarkEnd w:id="57"/>
-    <w:bookmarkStart w:id="58" w:name="X7e5fcb01483c46ceec3804400aa01747d15580c"/>
+    <w:bookmarkEnd w:id="59"/>
+    <w:bookmarkStart w:id="60" w:name="X7e5fcb01483c46ceec3804400aa01747d15580c"/>
     <w:p>
       <w:pPr>
         <w:pStyle w:val="Bibliography"/>
@@ -2142,8 +2211,8 @@
         <w:t xml:space="preserve"> </w:t>
       </w:r>
     </w:p>
-    <w:bookmarkEnd w:id="58"/>
-    <w:bookmarkStart w:id="60" w:name="Xfbc06ab4e8a143dd15dec8dfd06cc82cc01ab3c"/>
+    <w:bookmarkEnd w:id="60"/>
+    <w:bookmarkStart w:id="62" w:name="Xfbc06ab4e8a143dd15dec8dfd06cc82cc01ab3c"/>
     <w:p>
       <w:pPr>
         <w:pStyle w:val="Bibliography"/>
@@ -2163,7 +2232,7 @@
       <w:r>
         <w:t xml:space="preserve"> </w:t>
       </w:r>
-      <w:hyperlink r:id="rId59">
+      <w:hyperlink r:id="rId61">
         <w:r>
           <w:rPr>
             <w:rStyle w:val="Hyperlink"/>
@@ -2203,8 +2272,8 @@
         <w:t xml:space="preserve"> </w:t>
       </w:r>
     </w:p>
-    <w:bookmarkEnd w:id="60"/>
-    <w:bookmarkStart w:id="62" w:name="Xadd1365c52322e3ad3aed151084109b8ced3dcd"/>
+    <w:bookmarkEnd w:id="62"/>
+    <w:bookmarkStart w:id="64" w:name="Xadd1365c52322e3ad3aed151084109b8ced3dcd"/>
     <w:p>
       <w:pPr>
         <w:pStyle w:val="Bibliography"/>
@@ -2224,7 +2293,7 @@
       <w:r>
         <w:t xml:space="preserve"> </w:t>
       </w:r>
-      <w:hyperlink r:id="rId61">
+      <w:hyperlink r:id="rId63">
         <w:r>
           <w:rPr>
             <w:rStyle w:val="Hyperlink"/>
@@ -2330,8 +2399,8 @@
         <w:t xml:space="preserve"> </w:t>
       </w:r>
     </w:p>
-    <w:bookmarkEnd w:id="62"/>
-    <w:bookmarkStart w:id="64" w:name="ref-tennantUseDirectedAcyclic2021"/>
+    <w:bookmarkEnd w:id="64"/>
+    <w:bookmarkStart w:id="66" w:name="ref-tennantUseDirectedAcyclic2021"/>
     <w:p>
       <w:pPr>
         <w:pStyle w:val="Bibliography"/>
@@ -2351,7 +2420,7 @@
       <w:r>
         <w:t xml:space="preserve"> </w:t>
       </w:r>
-      <w:hyperlink r:id="rId63">
+      <w:hyperlink r:id="rId65">
         <w:r>
           <w:rPr>
             <w:rStyle w:val="Hyperlink"/>
@@ -2391,8 +2460,8 @@
         <w:t xml:space="preserve"> </w:t>
       </w:r>
     </w:p>
-    <w:bookmarkEnd w:id="64"/>
-    <w:bookmarkStart w:id="66" w:name="ref-hernanSpecifyingTargetTrial2016"/>
+    <w:bookmarkEnd w:id="66"/>
+    <w:bookmarkStart w:id="68" w:name="ref-hernanSpecifyingTargetTrial2016"/>
     <w:p>
       <w:pPr>
         <w:pStyle w:val="Bibliography"/>
@@ -2412,7 +2481,7 @@
       <w:r>
         <w:t xml:space="preserve"> </w:t>
       </w:r>
-      <w:hyperlink r:id="rId65">
+      <w:hyperlink r:id="rId67">
         <w:r>
           <w:rPr>
             <w:rStyle w:val="Hyperlink"/>
@@ -2440,8 +2509,8 @@
         <w:t xml:space="preserve"> </w:t>
       </w:r>
     </w:p>
-    <w:bookmarkEnd w:id="66"/>
-    <w:bookmarkStart w:id="68" w:name="X7a4c185c12dbffdfd1dae8f81a04f8589333b44"/>
+    <w:bookmarkEnd w:id="68"/>
+    <w:bookmarkStart w:id="70" w:name="X7a4c185c12dbffdfd1dae8f81a04f8589333b44"/>
     <w:p>
       <w:pPr>
         <w:pStyle w:val="Bibliography"/>
@@ -2461,7 +2530,7 @@
       <w:r>
         <w:t xml:space="preserve"> </w:t>
       </w:r>
-      <w:hyperlink r:id="rId67">
+      <w:hyperlink r:id="rId69">
         <w:r>
           <w:rPr>
             <w:rStyle w:val="Hyperlink"/>
@@ -2579,8 +2648,8 @@
         <w:t xml:space="preserve"> </w:t>
       </w:r>
     </w:p>
-    <w:bookmarkEnd w:id="68"/>
-    <w:bookmarkStart w:id="70" w:name="X891c4e92ab559843651bf648920cce7507bc2b7"/>
+    <w:bookmarkEnd w:id="70"/>
+    <w:bookmarkStart w:id="72" w:name="X891c4e92ab559843651bf648920cce7507bc2b7"/>
     <w:p>
       <w:pPr>
         <w:pStyle w:val="Bibliography"/>
@@ -2600,7 +2669,7 @@
       <w:r>
         <w:t xml:space="preserve"> </w:t>
       </w:r>
-      <w:hyperlink r:id="rId69">
+      <w:hyperlink r:id="rId71">
         <w:r>
           <w:rPr>
             <w:rStyle w:val="Hyperlink"/>
@@ -2712,8 +2781,8 @@
         <w:t xml:space="preserve"> </w:t>
       </w:r>
     </w:p>
-    <w:bookmarkEnd w:id="70"/>
-    <w:bookmarkStart w:id="72" w:name="X43fe660b2331ec7445277f5239a44c6686e4cba"/>
+    <w:bookmarkEnd w:id="72"/>
+    <w:bookmarkStart w:id="74" w:name="X43fe660b2331ec7445277f5239a44c6686e4cba"/>
     <w:p>
       <w:pPr>
         <w:pStyle w:val="Bibliography"/>
@@ -2733,7 +2802,7 @@
       <w:r>
         <w:t xml:space="preserve"> </w:t>
       </w:r>
-      <w:hyperlink r:id="rId71">
+      <w:hyperlink r:id="rId73">
         <w:r>
           <w:rPr>
             <w:rStyle w:val="Hyperlink"/>
@@ -2821,381 +2890,15 @@
         <w:t xml:space="preserve"> </w:t>
       </w:r>
     </w:p>
-    <w:bookmarkEnd w:id="72"/>
-    <w:bookmarkStart w:id="74" w:name="Xedc2e0f0a31863d3317a2038cd4180ef4585a94"/>
+    <w:bookmarkEnd w:id="74"/>
+    <w:bookmarkEnd w:id="75"/>
     <w:p>
-      <w:pPr>
-        <w:pStyle w:val="Bibliography"/>
-      </w:pPr>
-      <w:r>
-        <w:t xml:space="preserve">25.</w:t>
-      </w:r>
-      <w:r>
-        <w:t xml:space="preserve"> </w:t>
-      </w:r>
-      <w:r>
-        <w:t xml:space="preserve">	</w:t>
-      </w:r>
-      <w:r>
-        <w:t xml:space="preserve">Fink JN, Frampton CM, Lyden P, Lees KR, Virtual International Stroke Trials Archive Investigators.</w:t>
-      </w:r>
-      <w:r>
-        <w:t xml:space="preserve"> </w:t>
-      </w:r>
-      <w:hyperlink r:id="rId73">
-        <w:r>
-          <w:rPr>
-            <w:rStyle w:val="Hyperlink"/>
-          </w:rPr>
-          <w:t xml:space="preserve">Does hemispheric lateralization influence functional and cardiovascular outcomes after stroke?: An analysis of placebo-treated patients from prospective acute stroke trials</w:t>
-        </w:r>
-      </w:hyperlink>
-      <w:r>
-        <w:t xml:space="preserve">.</w:t>
-      </w:r>
-      <w:r>
-        <w:t xml:space="preserve"> </w:t>
-      </w:r>
-      <w:r>
-        <w:rPr>
-          <w:i/>
-          <w:iCs/>
-        </w:rPr>
-        <w:t xml:space="preserve">Stroke</w:t>
-      </w:r>
-      <w:r>
-        <w:t xml:space="preserve">. 2008;39:3335–3340.</w:t>
-      </w:r>
-      <w:r>
-        <w:t xml:space="preserve"> </w:t>
-      </w:r>
-    </w:p>
-    <w:bookmarkEnd w:id="74"/>
-    <w:bookmarkStart w:id="76" w:name="ref-almekhlafiStrokeLateralityDid2019"/>
-    <w:p>
-      <w:pPr>
-        <w:pStyle w:val="Bibliography"/>
-      </w:pPr>
-      <w:r>
-        <w:t xml:space="preserve">26.</w:t>
-      </w:r>
-      <w:r>
-        <w:t xml:space="preserve"> </w:t>
-      </w:r>
-      <w:r>
-        <w:t xml:space="preserve">	</w:t>
-      </w:r>
-      <w:r>
-        <w:t xml:space="preserve">Almekhlafi MA, Hill MD, Roos YM, Campbell BCV, Muir KW, Demchuk AM, Bracard S, Gomis M, Guillemin F, Jovin TG, et al.</w:t>
-      </w:r>
-      <w:r>
-        <w:t xml:space="preserve"> </w:t>
-      </w:r>
-      <w:hyperlink r:id="rId75">
-        <w:r>
-          <w:rPr>
-            <w:rStyle w:val="Hyperlink"/>
-          </w:rPr>
-          <w:t xml:space="preserve">Stroke</w:t>
-        </w:r>
-        <w:r>
-          <w:rPr>
-            <w:rStyle w:val="Hyperlink"/>
-          </w:rPr>
-          <w:t xml:space="preserve"> </w:t>
-        </w:r>
-        <w:r>
-          <w:rPr>
-            <w:rStyle w:val="Hyperlink"/>
-          </w:rPr>
-          <w:t xml:space="preserve">Laterality Did Not Modify Outcomes</w:t>
-        </w:r>
-        <w:r>
-          <w:rPr>
-            <w:rStyle w:val="Hyperlink"/>
-          </w:rPr>
-          <w:t xml:space="preserve"> </w:t>
-        </w:r>
-        <w:r>
-          <w:rPr>
-            <w:rStyle w:val="Hyperlink"/>
-          </w:rPr>
-          <w:t xml:space="preserve">in the</w:t>
-        </w:r>
-        <w:r>
-          <w:rPr>
-            <w:rStyle w:val="Hyperlink"/>
-          </w:rPr>
-          <w:t xml:space="preserve"> </w:t>
-        </w:r>
-        <w:r>
-          <w:rPr>
-            <w:rStyle w:val="Hyperlink"/>
-          </w:rPr>
-          <w:t xml:space="preserve">HERMES Meta-Analysis</w:t>
-        </w:r>
-        <w:r>
-          <w:rPr>
-            <w:rStyle w:val="Hyperlink"/>
-          </w:rPr>
-          <w:t xml:space="preserve"> </w:t>
-        </w:r>
-        <w:r>
-          <w:rPr>
-            <w:rStyle w:val="Hyperlink"/>
-          </w:rPr>
-          <w:t xml:space="preserve">of</w:t>
-        </w:r>
-        <w:r>
-          <w:rPr>
-            <w:rStyle w:val="Hyperlink"/>
-          </w:rPr>
-          <w:t xml:space="preserve"> </w:t>
-        </w:r>
-        <w:r>
-          <w:rPr>
-            <w:rStyle w:val="Hyperlink"/>
-          </w:rPr>
-          <w:t xml:space="preserve">Individual Patient Data</w:t>
-        </w:r>
-        <w:r>
-          <w:rPr>
-            <w:rStyle w:val="Hyperlink"/>
-          </w:rPr>
-          <w:t xml:space="preserve"> </w:t>
-        </w:r>
-        <w:r>
-          <w:rPr>
-            <w:rStyle w:val="Hyperlink"/>
-          </w:rPr>
-          <w:t xml:space="preserve">of 7</w:t>
-        </w:r>
-        <w:r>
-          <w:rPr>
-            <w:rStyle w:val="Hyperlink"/>
-          </w:rPr>
-          <w:t xml:space="preserve"> </w:t>
-        </w:r>
-        <w:r>
-          <w:rPr>
-            <w:rStyle w:val="Hyperlink"/>
-          </w:rPr>
-          <w:t xml:space="preserve">Trials</w:t>
-        </w:r>
-      </w:hyperlink>
-      <w:r>
-        <w:t xml:space="preserve">.</w:t>
-      </w:r>
-      <w:r>
-        <w:t xml:space="preserve"> </w:t>
-      </w:r>
-      <w:r>
-        <w:rPr>
-          <w:i/>
-          <w:iCs/>
-        </w:rPr>
-        <w:t xml:space="preserve">Stroke</w:t>
-      </w:r>
-      <w:r>
-        <w:t xml:space="preserve">. 2019;50:2118–2124.</w:t>
-      </w:r>
-      <w:r>
-        <w:t xml:space="preserve"> </w:t>
+      <w:r>
+        <w:br w:type="page"/>
       </w:r>
     </w:p>
     <w:bookmarkEnd w:id="76"/>
-    <w:bookmarkStart w:id="78" w:name="X3c0ca5277cb27ba7098a1b20322a338d87eb9a8"/>
-    <w:p>
-      <w:pPr>
-        <w:pStyle w:val="Bibliography"/>
-      </w:pPr>
-      <w:r>
-        <w:t xml:space="preserve">27.</w:t>
-      </w:r>
-      <w:r>
-        <w:t xml:space="preserve"> </w:t>
-      </w:r>
-      <w:r>
-        <w:t xml:space="preserve">	</w:t>
-      </w:r>
-      <w:r>
-        <w:t xml:space="preserve">Fink JN, Selim MH, Kumar S, Silver B, Linfante I, Caplan LR, Schlaug G.</w:t>
-      </w:r>
-      <w:r>
-        <w:t xml:space="preserve"> </w:t>
-      </w:r>
-      <w:hyperlink r:id="rId77">
-        <w:r>
-          <w:rPr>
-            <w:rStyle w:val="Hyperlink"/>
-          </w:rPr>
-          <w:t xml:space="preserve">Is the</w:t>
-        </w:r>
-        <w:r>
-          <w:rPr>
-            <w:rStyle w:val="Hyperlink"/>
-          </w:rPr>
-          <w:t xml:space="preserve"> </w:t>
-        </w:r>
-        <w:r>
-          <w:rPr>
-            <w:rStyle w:val="Hyperlink"/>
-          </w:rPr>
-          <w:t xml:space="preserve">Association</w:t>
-        </w:r>
-        <w:r>
-          <w:rPr>
-            <w:rStyle w:val="Hyperlink"/>
-          </w:rPr>
-          <w:t xml:space="preserve"> </w:t>
-        </w:r>
-        <w:r>
-          <w:rPr>
-            <w:rStyle w:val="Hyperlink"/>
-          </w:rPr>
-          <w:t xml:space="preserve">of</w:t>
-        </w:r>
-        <w:r>
-          <w:rPr>
-            <w:rStyle w:val="Hyperlink"/>
-          </w:rPr>
-          <w:t xml:space="preserve"> </w:t>
-        </w:r>
-        <w:r>
-          <w:rPr>
-            <w:rStyle w:val="Hyperlink"/>
-          </w:rPr>
-          <w:t xml:space="preserve">National Institutes</w:t>
-        </w:r>
-        <w:r>
-          <w:rPr>
-            <w:rStyle w:val="Hyperlink"/>
-          </w:rPr>
-          <w:t xml:space="preserve"> </w:t>
-        </w:r>
-        <w:r>
-          <w:rPr>
-            <w:rStyle w:val="Hyperlink"/>
-          </w:rPr>
-          <w:t xml:space="preserve">of</w:t>
-        </w:r>
-        <w:r>
-          <w:rPr>
-            <w:rStyle w:val="Hyperlink"/>
-          </w:rPr>
-          <w:t xml:space="preserve"> </w:t>
-        </w:r>
-        <w:r>
-          <w:rPr>
-            <w:rStyle w:val="Hyperlink"/>
-          </w:rPr>
-          <w:t xml:space="preserve">Health Stroke Scale Scores</w:t>
-        </w:r>
-        <w:r>
-          <w:rPr>
-            <w:rStyle w:val="Hyperlink"/>
-          </w:rPr>
-          <w:t xml:space="preserve"> </w:t>
-        </w:r>
-        <w:r>
-          <w:rPr>
-            <w:rStyle w:val="Hyperlink"/>
-          </w:rPr>
-          <w:t xml:space="preserve">and</w:t>
-        </w:r>
-        <w:r>
-          <w:rPr>
-            <w:rStyle w:val="Hyperlink"/>
-          </w:rPr>
-          <w:t xml:space="preserve"> </w:t>
-        </w:r>
-        <w:r>
-          <w:rPr>
-            <w:rStyle w:val="Hyperlink"/>
-          </w:rPr>
-          <w:t xml:space="preserve">Acute Magnetic Resonance Imaging Stroke Volume Equal</w:t>
-        </w:r>
-        <w:r>
-          <w:rPr>
-            <w:rStyle w:val="Hyperlink"/>
-          </w:rPr>
-          <w:t xml:space="preserve"> </w:t>
-        </w:r>
-        <w:r>
-          <w:rPr>
-            <w:rStyle w:val="Hyperlink"/>
-          </w:rPr>
-          <w:t xml:space="preserve">for</w:t>
-        </w:r>
-        <w:r>
-          <w:rPr>
-            <w:rStyle w:val="Hyperlink"/>
-          </w:rPr>
-          <w:t xml:space="preserve"> </w:t>
-        </w:r>
-        <w:r>
-          <w:rPr>
-            <w:rStyle w:val="Hyperlink"/>
-          </w:rPr>
-          <w:t xml:space="preserve">Patients With Right-</w:t>
-        </w:r>
-        <w:r>
-          <w:rPr>
-            <w:rStyle w:val="Hyperlink"/>
-          </w:rPr>
-          <w:t xml:space="preserve"> </w:t>
-        </w:r>
-        <w:r>
-          <w:rPr>
-            <w:rStyle w:val="Hyperlink"/>
-          </w:rPr>
-          <w:t xml:space="preserve">and</w:t>
-        </w:r>
-        <w:r>
-          <w:rPr>
-            <w:rStyle w:val="Hyperlink"/>
-          </w:rPr>
-          <w:t xml:space="preserve"> </w:t>
-        </w:r>
-        <w:r>
-          <w:rPr>
-            <w:rStyle w:val="Hyperlink"/>
-          </w:rPr>
-          <w:t xml:space="preserve">Left-Hemisphere Ischemic Stroke</w:t>
-        </w:r>
-        <w:r>
-          <w:rPr>
-            <w:rStyle w:val="Hyperlink"/>
-          </w:rPr>
-          <w:t xml:space="preserve">?</w:t>
-        </w:r>
-      </w:hyperlink>
-      <w:r>
-        <w:t xml:space="preserve"> </w:t>
-      </w:r>
-      <w:r>
-        <w:rPr>
-          <w:i/>
-          <w:iCs/>
-        </w:rPr>
-        <w:t xml:space="preserve">Stroke</w:t>
-      </w:r>
-      <w:r>
-        <w:t xml:space="preserve">. 2002;33:954–958.</w:t>
-      </w:r>
-      <w:r>
-        <w:t xml:space="preserve"> </w:t>
-      </w:r>
-    </w:p>
-    <w:bookmarkEnd w:id="78"/>
-    <w:bookmarkEnd w:id="79"/>
-    <w:p>
-      <w:r>
-        <w:br w:type="page"/>
-      </w:r>
-    </w:p>
-    <w:bookmarkEnd w:id="80"/>
-    <w:bookmarkStart w:id="84" w:name="tables"/>
+    <w:bookmarkStart w:id="80" w:name="tables"/>
     <w:p>
       <w:pPr>
         <w:pStyle w:val="Heading2"/>
@@ -3217,7 +2920,7 @@
       <w:tr>
         <w:tc>
           <w:tcPr/>
-          <w:bookmarkStart w:id="81" w:name="tbl-1"/>
+          <w:bookmarkStart w:id="77" w:name="tbl-1"/>
           <w:p>
             <w:pPr>
               <w:jc w:val="center"/>
@@ -7344,7 +7047,7 @@
               </w:tc>
             </w:tr>
           </w:tbl>
-          <w:bookmarkEnd w:id="81"/>
+          <w:bookmarkEnd w:id="77"/>
         </w:tc>
       </w:tr>
     </w:tbl>
@@ -7366,7 +7069,7 @@
       <w:tr>
         <w:tc>
           <w:tcPr/>
-          <w:bookmarkStart w:id="82" w:name="tbl-2"/>
+          <w:bookmarkStart w:id="78" w:name="tbl-2"/>
           <w:p>
             <w:pPr>
               <w:jc w:val="center"/>
@@ -8798,13 +8501,13 @@
                       <w:rFonts w:ascii="Calibri" w:hAnsi="Calibri"/>
                       <w:sz w:val="20"/>
                     </w:rPr>
-                    <w:t xml:space="default">Values represent Average Marginal Effects (Odds Ratios for binary outcomes, Incidence Rate Ratios for counts). Models are adjusted for age, admission GCS, ICH location (interaction), ICH volume, IVH, and study. Days of mechanical ventilation represent median (IQR) days among patients receiving mechanical ventilation; excludes patients with zero ventilator days (data from ATACH-2 only). ROPE indicates region of practical equivalence (0.95 to 1.05); aOR, adjusted odds ratio; IRR, incidence rate ratio; CI, credible interval; GCS, Glasgow Coma Scale; ICH, intracerebral hemorrhage; IQR, interquartile range; and IVH, intraventricular hemorrhage.</w:t>
+                    <w:t xml:space="default">Values represent Average Marginal Effects (Odds Ratios for binary outcomes, Incidence Rate Ratios for counts). Models are adjusted for age, admission GCS, ICH location (interaction), ICH volume, IVH, and study. Days of mechanical ventilation represent median (IQR) days (data from ATACH-2 only). ROPE indicates region of practical equivalence (0.95 to 1.05); aOR, adjusted odds ratio; IRR, incidence rate ratio; CI, credible interval; GCS, Glasgow Coma Scale; ICH, intracerebral hemorrhage; IQR, interquartile range; and IVH, intraventricular hemorrhage.</w:t>
                   </w:r>
                 </w:p>
               </w:tc>
             </w:tr>
           </w:tbl>
-          <w:bookmarkEnd w:id="82"/>
+          <w:bookmarkEnd w:id="78"/>
         </w:tc>
       </w:tr>
     </w:tbl>
@@ -8826,7 +8529,7 @@
       <w:tr>
         <w:tc>
           <w:tcPr/>
-          <w:bookmarkStart w:id="83" w:name="tbl-3"/>
+          <w:bookmarkStart w:id="79" w:name="tbl-3"/>
           <w:p>
             <w:pPr>
               <w:jc w:val="center"/>
@@ -9876,7 +9579,7 @@
               </w:tc>
             </w:tr>
           </w:tbl>
-          <w:bookmarkEnd w:id="83"/>
+          <w:bookmarkEnd w:id="79"/>
         </w:tc>
       </w:tr>
     </w:tbl>
@@ -9885,8 +9588,8 @@
         <w:br w:type="page"/>
       </w:r>
     </w:p>
-    <w:bookmarkEnd w:id="84"/>
-    <w:bookmarkStart w:id="93" w:name="figures"/>
+    <w:bookmarkEnd w:id="80"/>
+    <w:bookmarkStart w:id="89" w:name="figures"/>
     <w:p>
       <w:pPr>
         <w:pStyle w:val="Heading2"/>
@@ -9908,7 +9611,7 @@
       <w:tr>
         <w:tc>
           <w:tcPr/>
-          <w:bookmarkStart w:id="88" w:name="fig-1"/>
+          <w:bookmarkStart w:id="84" w:name="fig-1"/>
           <w:p>
             <w:pPr>
               <w:pStyle w:val="Compact"/>
@@ -9919,18 +9622,18 @@
                 <wp:inline>
                   <wp:extent cx="5943600" cy="5943600"/>
                   <wp:effectExtent b="0" l="0" r="0" t="0"/>
-                  <wp:docPr descr="" title="" id="86" name="Picture"/>
+                  <wp:docPr descr="" title="" id="82" name="Picture"/>
                   <a:graphic>
                     <a:graphicData uri="http://schemas.openxmlformats.org/drawingml/2006/picture">
                       <pic:pic>
                         <pic:nvPicPr>
-                          <pic:cNvPr descr="../figures/figure_sensitivity_neurosurgery_evac.pdf" id="87" name="Picture"/>
+                          <pic:cNvPr descr="../figures/figure_sensitivity_neurosurgery_evac.pdf" id="83" name="Picture"/>
                           <pic:cNvPicPr>
                             <a:picLocks noChangeArrowheads="1" noChangeAspect="1"/>
                           </pic:cNvPicPr>
                         </pic:nvPicPr>
                         <pic:blipFill>
-                          <a:blip r:embed="rId85"/>
+                          <a:blip r:embed="rId81"/>
                           <a:stretch>
                             <a:fillRect/>
                           </a:stretch>
@@ -9970,7 +9673,7 @@
               <w:t xml:space="preserve">Figure 1: Prior Sensitivity Analysis for Neurosurgical Intervention</w:t>
             </w:r>
           </w:p>
-          <w:bookmarkEnd w:id="88"/>
+          <w:bookmarkEnd w:id="84"/>
         </w:tc>
       </w:tr>
     </w:tbl>
@@ -9995,7 +9698,7 @@
       <w:tr>
         <w:tc>
           <w:tcPr/>
-          <w:bookmarkStart w:id="92" w:name="fig-2"/>
+          <w:bookmarkStart w:id="88" w:name="fig-2"/>
           <w:p>
             <w:pPr>
               <w:pStyle w:val="Compact"/>
@@ -10006,18 +9709,18 @@
                 <wp:inline>
                   <wp:extent cx="5943600" cy="3820885"/>
                   <wp:effectExtent b="0" l="0" r="0" t="0"/>
-                  <wp:docPr descr="" title="" id="90" name="Picture"/>
+                  <wp:docPr descr="" title="" id="86" name="Picture"/>
                   <a:graphic>
                     <a:graphicData uri="http://schemas.openxmlformats.org/drawingml/2006/picture">
                       <pic:pic>
                         <pic:nvPicPr>
-                          <pic:cNvPr descr="../figures/mrs/figure_mrs_main_neutral_adjusted.pdf" id="91" name="Picture"/>
+                          <pic:cNvPr descr="../figures/mrs/figure_mrs_main_neutral_adjusted.pdf" id="87" name="Picture"/>
                           <pic:cNvPicPr>
                             <a:picLocks noChangeArrowheads="1" noChangeAspect="1"/>
                           </pic:cNvPicPr>
                         </pic:nvPicPr>
                         <pic:blipFill>
-                          <a:blip r:embed="rId89"/>
+                          <a:blip r:embed="rId85"/>
                           <a:stretch>
                             <a:fillRect/>
                           </a:stretch>
@@ -10057,11 +9760,11 @@
               <w:t xml:space="preserve">Figure 2: modified Rankin Score at 90 days Stratified by ICH Laterality</w:t>
             </w:r>
           </w:p>
-          <w:bookmarkEnd w:id="92"/>
+          <w:bookmarkEnd w:id="88"/>
         </w:tc>
       </w:tr>
     </w:tbl>
-    <w:bookmarkEnd w:id="93"/>
+    <w:bookmarkEnd w:id="89"/>
     <w:sectPr>
       <w:footnotePr>
         <w:numFmt w:val="decimal"/>

</xml_diff>